<commit_message>
Minister list: one country per page (page-break-before each profile; scope block on cover; annex and caveats on own pages). Font-metric check: tallest page ~7.9in vs 9.3in usable — all fit.
Co-Authored-By: Claude Fable 5 <noreply@anthropic.com>
Claude-Session: https://claude.ai/code/session_01D7VNHN8h6qLVjZi6Tzyhub
</commit_message>
<xml_diff>
--- a/output/g20-ministers-trade-list.docx
+++ b/output/g20-ministers-trade-list.docx
@@ -67,8 +67,48 @@
     </w:p>
     <w:p>
       <w:pPr>
+        <w:spacing w:before="160"/>
+      </w:pPr>
+      <w:r>
+        <w:rPr>
+          <w:rFonts w:ascii="Open Sans" w:hAnsi="Open Sans" w:eastAsia="Open Sans"/>
+          <w:b/>
+          <w:i w:val="0"/>
+          <w:color w:val="0A314D"/>
+          <w:sz w:val="24"/>
+        </w:rPr>
+        <w:t>Scope</w:t>
+      </w:r>
+    </w:p>
+    <w:p>
+      <w:r>
+        <w:rPr>
+          <w:rFonts w:ascii="Open Sans" w:hAnsi="Open Sans" w:eastAsia="Open Sans"/>
+          <w:b w:val="0"/>
+          <w:i w:val="0"/>
+          <w:color w:val="2C2C2C"/>
+          <w:sz w:val="20"/>
+        </w:rPr>
+        <w:t>This reference profiles the 19 G20 sovereign member countries — with Poland covered in place of South Africa, a deliberate substitution — followed by an annex on the two G20 bloc members, the European Union and the African Union. Each profile occupies one page: headline economic and U.S. trade figures, then the trade and digital/technology officeholders, verified as current on 2026-07-16. Figures match the companion briefing deck; both are generated from the same dataset.</w:t>
+      </w:r>
+    </w:p>
+    <w:p>
+      <w:r>
+        <w:rPr>
+          <w:rFonts w:ascii="Open Sans" w:hAnsi="Open Sans" w:eastAsia="Open Sans"/>
+          <w:b w:val="0"/>
+          <w:i/>
+          <w:color w:val="757D87"/>
+          <w:sz w:val="17"/>
+        </w:rPr>
+        <w:t>Contents: one page per country (alphabetical), bloc annex, data caveats.</w:t>
+      </w:r>
+    </w:p>
+    <w:p>
+      <w:pPr>
+        <w:spacing w:before="0"/>
         <w:keepNext/>
-        <w:spacing w:before="280"/>
+        <w:pageBreakBefore/>
         <w:pBdr>
           <w:bottom w:val="single" w:sz="14" w:space="3" w:color="B4862D"/>
         </w:pBdr>
@@ -704,8 +744,9 @@
     </w:p>
     <w:p>
       <w:pPr>
+        <w:spacing w:before="0"/>
         <w:keepNext/>
-        <w:spacing w:before="280"/>
+        <w:pageBreakBefore/>
         <w:pBdr>
           <w:bottom w:val="single" w:sz="14" w:space="3" w:color="B4862D"/>
         </w:pBdr>
@@ -1331,8 +1372,9 @@
     </w:p>
     <w:p>
       <w:pPr>
+        <w:spacing w:before="0"/>
         <w:keepNext/>
-        <w:spacing w:before="280"/>
+        <w:pageBreakBefore/>
         <w:pBdr>
           <w:bottom w:val="single" w:sz="14" w:space="3" w:color="B4862D"/>
         </w:pBdr>
@@ -1928,8 +1970,9 @@
     </w:p>
     <w:p>
       <w:pPr>
+        <w:spacing w:before="0"/>
         <w:keepNext/>
-        <w:spacing w:before="280"/>
+        <w:pageBreakBefore/>
         <w:pBdr>
           <w:bottom w:val="single" w:sz="14" w:space="3" w:color="B4862D"/>
         </w:pBdr>
@@ -2525,8 +2568,9 @@
     </w:p>
     <w:p>
       <w:pPr>
+        <w:spacing w:before="0"/>
         <w:keepNext/>
-        <w:spacing w:before="280"/>
+        <w:pageBreakBefore/>
         <w:pBdr>
           <w:bottom w:val="single" w:sz="14" w:space="3" w:color="B4862D"/>
         </w:pBdr>
@@ -3282,8 +3326,9 @@
     </w:p>
     <w:p>
       <w:pPr>
+        <w:spacing w:before="0"/>
         <w:keepNext/>
-        <w:spacing w:before="280"/>
+        <w:pageBreakBefore/>
         <w:pBdr>
           <w:bottom w:val="single" w:sz="14" w:space="3" w:color="B4862D"/>
         </w:pBdr>
@@ -3749,8 +3794,9 @@
     </w:p>
     <w:p>
       <w:pPr>
+        <w:spacing w:before="0"/>
         <w:keepNext/>
-        <w:spacing w:before="280"/>
+        <w:pageBreakBefore/>
         <w:pBdr>
           <w:bottom w:val="single" w:sz="14" w:space="3" w:color="B4862D"/>
         </w:pBdr>
@@ -4231,8 +4277,9 @@
     </w:p>
     <w:p>
       <w:pPr>
+        <w:spacing w:before="0"/>
         <w:keepNext/>
-        <w:spacing w:before="280"/>
+        <w:pageBreakBefore/>
         <w:pBdr>
           <w:bottom w:val="single" w:sz="14" w:space="3" w:color="B4862D"/>
         </w:pBdr>
@@ -4858,8 +4905,9 @@
     </w:p>
     <w:p>
       <w:pPr>
+        <w:spacing w:before="0"/>
         <w:keepNext/>
-        <w:spacing w:before="280"/>
+        <w:pageBreakBefore/>
         <w:pBdr>
           <w:bottom w:val="single" w:sz="14" w:space="3" w:color="B4862D"/>
         </w:pBdr>
@@ -5455,8 +5503,9 @@
     </w:p>
     <w:p>
       <w:pPr>
+        <w:spacing w:before="0"/>
         <w:keepNext/>
-        <w:spacing w:before="280"/>
+        <w:pageBreakBefore/>
         <w:pBdr>
           <w:bottom w:val="single" w:sz="14" w:space="3" w:color="B4862D"/>
         </w:pBdr>
@@ -6052,8 +6101,9 @@
     </w:p>
     <w:p>
       <w:pPr>
+        <w:spacing w:before="0"/>
         <w:keepNext/>
-        <w:spacing w:before="280"/>
+        <w:pageBreakBefore/>
         <w:pBdr>
           <w:bottom w:val="single" w:sz="14" w:space="3" w:color="B4862D"/>
         </w:pBdr>
@@ -6534,8 +6584,9 @@
     </w:p>
     <w:p>
       <w:pPr>
+        <w:spacing w:before="0"/>
         <w:keepNext/>
-        <w:spacing w:before="280"/>
+        <w:pageBreakBefore/>
         <w:pBdr>
           <w:bottom w:val="single" w:sz="14" w:space="3" w:color="B4862D"/>
         </w:pBdr>
@@ -7131,8 +7182,9 @@
     </w:p>
     <w:p>
       <w:pPr>
+        <w:spacing w:before="0"/>
         <w:keepNext/>
-        <w:spacing w:before="280"/>
+        <w:pageBreakBefore/>
         <w:pBdr>
           <w:bottom w:val="single" w:sz="14" w:space="3" w:color="B4862D"/>
         </w:pBdr>
@@ -7758,8 +7810,9 @@
     </w:p>
     <w:p>
       <w:pPr>
+        <w:spacing w:before="0"/>
         <w:keepNext/>
-        <w:spacing w:before="280"/>
+        <w:pageBreakBefore/>
         <w:pBdr>
           <w:bottom w:val="single" w:sz="14" w:space="3" w:color="B4862D"/>
         </w:pBdr>
@@ -8385,8 +8438,9 @@
     </w:p>
     <w:p>
       <w:pPr>
+        <w:spacing w:before="0"/>
         <w:keepNext/>
-        <w:spacing w:before="280"/>
+        <w:pageBreakBefore/>
         <w:pBdr>
           <w:bottom w:val="single" w:sz="14" w:space="3" w:color="B4862D"/>
         </w:pBdr>
@@ -8992,8 +9046,9 @@
     </w:p>
     <w:p>
       <w:pPr>
+        <w:spacing w:before="0"/>
         <w:keepNext/>
-        <w:spacing w:before="280"/>
+        <w:pageBreakBefore/>
         <w:pBdr>
           <w:bottom w:val="single" w:sz="14" w:space="3" w:color="B4862D"/>
         </w:pBdr>
@@ -9589,8 +9644,9 @@
     </w:p>
     <w:p>
       <w:pPr>
+        <w:spacing w:before="0"/>
         <w:keepNext/>
-        <w:spacing w:before="280"/>
+        <w:pageBreakBefore/>
         <w:pBdr>
           <w:bottom w:val="single" w:sz="14" w:space="3" w:color="B4862D"/>
         </w:pBdr>
@@ -10071,8 +10127,9 @@
     </w:p>
     <w:p>
       <w:pPr>
+        <w:spacing w:before="0"/>
         <w:keepNext/>
-        <w:spacing w:before="280"/>
+        <w:pageBreakBefore/>
         <w:pBdr>
           <w:bottom w:val="single" w:sz="14" w:space="3" w:color="B4862D"/>
         </w:pBdr>
@@ -10683,8 +10740,9 @@
     </w:p>
     <w:p>
       <w:pPr>
+        <w:spacing w:before="0"/>
         <w:keepNext/>
-        <w:spacing w:before="280"/>
+        <w:pageBreakBefore/>
         <w:pBdr>
           <w:bottom w:val="single" w:sz="14" w:space="3" w:color="B4862D"/>
         </w:pBdr>
@@ -11425,7 +11483,8 @@
     </w:p>
     <w:p>
       <w:pPr>
-        <w:spacing w:before="360"/>
+        <w:spacing w:before="0"/>
+        <w:pageBreakBefore/>
         <w:pBdr>
           <w:bottom w:val="single" w:sz="8" w:space="2" w:color="0A314D"/>
         </w:pBdr>
@@ -11457,7 +11516,7 @@
     <w:p>
       <w:pPr>
         <w:keepNext/>
-        <w:spacing w:before="280"/>
+        <w:spacing w:before="0"/>
         <w:pBdr>
           <w:bottom w:val="single" w:sz="14" w:space="3" w:color="B4862D"/>
         </w:pBdr>
@@ -11949,8 +12008,9 @@
     </w:p>
     <w:p>
       <w:pPr>
+        <w:spacing w:before="0"/>
         <w:keepNext/>
-        <w:spacing w:before="280"/>
+        <w:pageBreakBefore/>
         <w:pBdr>
           <w:bottom w:val="single" w:sz="14" w:space="3" w:color="B4862D"/>
         </w:pBdr>
@@ -12457,7 +12517,8 @@
     </w:p>
     <w:p>
       <w:pPr>
-        <w:spacing w:before="320"/>
+        <w:spacing w:before="0"/>
+        <w:pageBreakBefore/>
         <w:pBdr>
           <w:bottom w:val="single" w:sz="14" w:space="3" w:color="B4862D"/>
         </w:pBdr>

</xml_diff>

<commit_message>
Apply first batch of 21 official portraits to deck and list
Extracted portraits + name captions from the supplied G20_Portraits
sheet; image-caption pairing cross-checked two independent ways
(document order + spatial nearest-caption) with 21/21 agreement, then
verified visually. Applied to assets/portraits/<slug>.png for: US (4),
UK (3), Turkiye (2), South Korea (3), Saudi Arabia (2 of 3), Russia
(3), Poland (3), Mexico (1 of 3). "Michael Baranowski" caption mapped
to Michal Baranowski. 38 slots remain placeholders (list in GAPS.md).

Normalizer no longer upscales small sources (most supplied images are
72-104px thumbnails; upscaling would only blur them). All deliverables
rebuilt; 684 QA checks pass.

Co-Authored-By: Claude Fable 5 <noreply@anthropic.com>
Claude-Session: https://claude.ai/code/session_01D7VNHN8h6qLVjZi6Tzyhub
</commit_message>
<xml_diff>
--- a/output/g20-ministers-trade-list.docx
+++ b/output/g20-ministers-trade-list.docx
@@ -9141,7 +9141,7 @@
             <w:r>
               <w:drawing>
                 <wp:inline xmlns:a="http://schemas.openxmlformats.org/drawingml/2006/main" xmlns:pic="http://schemas.openxmlformats.org/drawingml/2006/picture">
-                  <wp:extent cx="566928" cy="708660"/>
+                  <wp:extent cx="566928" cy="709551"/>
                   <wp:docPr id="47" name="Picture 47"/>
                   <wp:cNvGraphicFramePr>
                     <a:graphicFrameLocks noChangeAspect="1"/>
@@ -9150,7 +9150,7 @@
                     <a:graphicData uri="http://schemas.openxmlformats.org/drawingml/2006/picture">
                       <pic:pic>
                         <pic:nvPicPr>
-                          <pic:cNvPr id="0" name="_ph-mexico-pena.png"/>
+                          <pic:cNvPr id="0" name="mexico-pena.png"/>
                           <pic:cNvPicPr/>
                         </pic:nvPicPr>
                         <pic:blipFill>
@@ -9162,7 +9162,7 @@
                         <pic:spPr>
                           <a:xfrm>
                             <a:off x="0" y="0"/>
-                            <a:ext cx="566928" cy="708660"/>
+                            <a:ext cx="566928" cy="709551"/>
                           </a:xfrm>
                           <a:prstGeom prst="rect"/>
                         </pic:spPr>
@@ -9599,7 +9599,7 @@
                     <a:graphicData uri="http://schemas.openxmlformats.org/drawingml/2006/picture">
                       <pic:pic>
                         <pic:nvPicPr>
-                          <pic:cNvPr id="0" name="_ph-poland-domanski.png"/>
+                          <pic:cNvPr id="0" name="poland-domanski.png"/>
                           <pic:cNvPicPr/>
                         </pic:nvPicPr>
                         <pic:blipFill>
@@ -9730,7 +9730,7 @@
             <w:r>
               <w:drawing>
                 <wp:inline xmlns:a="http://schemas.openxmlformats.org/drawingml/2006/main" xmlns:pic="http://schemas.openxmlformats.org/drawingml/2006/picture">
-                  <wp:extent cx="566928" cy="708660"/>
+                  <wp:extent cx="566928" cy="709551"/>
                   <wp:docPr id="50" name="Picture 50"/>
                   <wp:cNvGraphicFramePr>
                     <a:graphicFrameLocks noChangeAspect="1"/>
@@ -9739,7 +9739,7 @@
                     <a:graphicData uri="http://schemas.openxmlformats.org/drawingml/2006/picture">
                       <pic:pic>
                         <pic:nvPicPr>
-                          <pic:cNvPr id="0" name="_ph-poland-baranowski.png"/>
+                          <pic:cNvPr id="0" name="poland-baranowski.png"/>
                           <pic:cNvPicPr/>
                         </pic:nvPicPr>
                         <pic:blipFill>
@@ -9751,7 +9751,7 @@
                         <pic:spPr>
                           <a:xfrm>
                             <a:off x="0" y="0"/>
-                            <a:ext cx="566928" cy="708660"/>
+                            <a:ext cx="566928" cy="709551"/>
                           </a:xfrm>
                           <a:prstGeom prst="rect"/>
                         </pic:spPr>
@@ -9902,7 +9902,7 @@
             <w:r>
               <w:drawing>
                 <wp:inline xmlns:a="http://schemas.openxmlformats.org/drawingml/2006/main" xmlns:pic="http://schemas.openxmlformats.org/drawingml/2006/picture">
-                  <wp:extent cx="566928" cy="708660"/>
+                  <wp:extent cx="566928" cy="709551"/>
                   <wp:docPr id="51" name="Picture 51"/>
                   <wp:cNvGraphicFramePr>
                     <a:graphicFrameLocks noChangeAspect="1"/>
@@ -9911,7 +9911,7 @@
                     <a:graphicData uri="http://schemas.openxmlformats.org/drawingml/2006/picture">
                       <pic:pic>
                         <pic:nvPicPr>
-                          <pic:cNvPr id="0" name="_ph-poland-gawkowski.png"/>
+                          <pic:cNvPr id="0" name="poland-gawkowski.png"/>
                           <pic:cNvPicPr/>
                         </pic:nvPicPr>
                         <pic:blipFill>
@@ -9923,7 +9923,7 @@
                         <pic:spPr>
                           <a:xfrm>
                             <a:off x="0" y="0"/>
-                            <a:ext cx="566928" cy="708660"/>
+                            <a:ext cx="566928" cy="709551"/>
                           </a:xfrm>
                           <a:prstGeom prst="rect"/>
                         </pic:spPr>
@@ -10375,7 +10375,7 @@
                     <a:graphicData uri="http://schemas.openxmlformats.org/drawingml/2006/picture">
                       <pic:pic>
                         <pic:nvPicPr>
-                          <pic:cNvPr id="0" name="_ph-russia-alikhanov.png"/>
+                          <pic:cNvPr id="0" name="russia-alikhanov.png"/>
                           <pic:cNvPicPr/>
                         </pic:nvPicPr>
                         <pic:blipFill>
@@ -10506,7 +10506,7 @@
             <w:r>
               <w:drawing>
                 <wp:inline xmlns:a="http://schemas.openxmlformats.org/drawingml/2006/main" xmlns:pic="http://schemas.openxmlformats.org/drawingml/2006/picture">
-                  <wp:extent cx="566928" cy="708660"/>
+                  <wp:extent cx="566928" cy="716120"/>
                   <wp:docPr id="54" name="Picture 54"/>
                   <wp:cNvGraphicFramePr>
                     <a:graphicFrameLocks noChangeAspect="1"/>
@@ -10515,7 +10515,7 @@
                     <a:graphicData uri="http://schemas.openxmlformats.org/drawingml/2006/picture">
                       <pic:pic>
                         <pic:nvPicPr>
-                          <pic:cNvPr id="0" name="_ph-russia-reshetnikov.png"/>
+                          <pic:cNvPr id="0" name="russia-reshetnikov.png"/>
                           <pic:cNvPicPr/>
                         </pic:nvPicPr>
                         <pic:blipFill>
@@ -10527,7 +10527,7 @@
                         <pic:spPr>
                           <a:xfrm>
                             <a:off x="0" y="0"/>
-                            <a:ext cx="566928" cy="708660"/>
+                            <a:ext cx="566928" cy="716120"/>
                           </a:xfrm>
                           <a:prstGeom prst="rect"/>
                         </pic:spPr>
@@ -10678,7 +10678,7 @@
             <w:r>
               <w:drawing>
                 <wp:inline xmlns:a="http://schemas.openxmlformats.org/drawingml/2006/main" xmlns:pic="http://schemas.openxmlformats.org/drawingml/2006/picture">
-                  <wp:extent cx="566928" cy="708660"/>
+                  <wp:extent cx="566928" cy="716120"/>
                   <wp:docPr id="55" name="Picture 55"/>
                   <wp:cNvGraphicFramePr>
                     <a:graphicFrameLocks noChangeAspect="1"/>
@@ -10687,11 +10687,11 @@
                     <a:graphicData uri="http://schemas.openxmlformats.org/drawingml/2006/picture">
                       <pic:pic>
                         <pic:nvPicPr>
-                          <pic:cNvPr id="0" name="_ph-canada-sidhu.png"/>
+                          <pic:cNvPr id="0" name="russia-shadayev.png"/>
                           <pic:cNvPicPr/>
                         </pic:nvPicPr>
                         <pic:blipFill>
-                          <a:blip r:embed="rId23"/>
+                          <a:blip r:embed="rId62"/>
                           <a:stretch>
                             <a:fillRect/>
                           </a:stretch>
@@ -10699,7 +10699,7 @@
                         <pic:spPr>
                           <a:xfrm>
                             <a:off x="0" y="0"/>
-                            <a:ext cx="566928" cy="708660"/>
+                            <a:ext cx="566928" cy="716120"/>
                           </a:xfrm>
                           <a:prstGeom prst="rect"/>
                         </pic:spPr>
@@ -10828,7 +10828,7 @@
                     <pic:cNvPicPr/>
                   </pic:nvPicPr>
                   <pic:blipFill>
-                    <a:blip r:embed="rId62"/>
+                    <a:blip r:embed="rId63"/>
                     <a:stretch>
                       <a:fillRect/>
                     </a:stretch>
@@ -11155,7 +11155,7 @@
                           <pic:cNvPicPr/>
                         </pic:nvPicPr>
                         <pic:blipFill>
-                          <a:blip r:embed="rId63"/>
+                          <a:blip r:embed="rId64"/>
                           <a:stretch>
                             <a:fillRect/>
                           </a:stretch>
@@ -11282,7 +11282,7 @@
             <w:r>
               <w:drawing>
                 <wp:inline xmlns:a="http://schemas.openxmlformats.org/drawingml/2006/main" xmlns:pic="http://schemas.openxmlformats.org/drawingml/2006/picture">
-                  <wp:extent cx="566928" cy="708660"/>
+                  <wp:extent cx="566928" cy="709551"/>
                   <wp:docPr id="58" name="Picture 58"/>
                   <wp:cNvGraphicFramePr>
                     <a:graphicFrameLocks noChangeAspect="1"/>
@@ -11291,11 +11291,11 @@
                     <a:graphicData uri="http://schemas.openxmlformats.org/drawingml/2006/picture">
                       <pic:pic>
                         <pic:nvPicPr>
-                          <pic:cNvPr id="0" name="_ph-saudi-alqasabi.png"/>
+                          <pic:cNvPr id="0" name="saudi-abduljabbar.png"/>
                           <pic:cNvPicPr/>
                         </pic:nvPicPr>
                         <pic:blipFill>
-                          <a:blip r:embed="rId63"/>
+                          <a:blip r:embed="rId65"/>
                           <a:stretch>
                             <a:fillRect/>
                           </a:stretch>
@@ -11303,7 +11303,7 @@
                         <pic:spPr>
                           <a:xfrm>
                             <a:off x="0" y="0"/>
-                            <a:ext cx="566928" cy="708660"/>
+                            <a:ext cx="566928" cy="709551"/>
                           </a:xfrm>
                           <a:prstGeom prst="rect"/>
                         </pic:spPr>
@@ -11449,7 +11449,7 @@
             <w:r>
               <w:drawing>
                 <wp:inline xmlns:a="http://schemas.openxmlformats.org/drawingml/2006/main" xmlns:pic="http://schemas.openxmlformats.org/drawingml/2006/picture">
-                  <wp:extent cx="566928" cy="708660"/>
+                  <wp:extent cx="566928" cy="716120"/>
                   <wp:docPr id="59" name="Picture 59"/>
                   <wp:cNvGraphicFramePr>
                     <a:graphicFrameLocks noChangeAspect="1"/>
@@ -11458,11 +11458,11 @@
                     <a:graphicData uri="http://schemas.openxmlformats.org/drawingml/2006/picture">
                       <pic:pic>
                         <pic:nvPicPr>
-                          <pic:cNvPr id="0" name="_ph-russia-alikhanov.png"/>
+                          <pic:cNvPr id="0" name="saudi-alswaha.png"/>
                           <pic:cNvPicPr/>
                         </pic:nvPicPr>
                         <pic:blipFill>
-                          <a:blip r:embed="rId60"/>
+                          <a:blip r:embed="rId66"/>
                           <a:stretch>
                             <a:fillRect/>
                           </a:stretch>
@@ -11470,7 +11470,7 @@
                         <pic:spPr>
                           <a:xfrm>
                             <a:off x="0" y="0"/>
-                            <a:ext cx="566928" cy="708660"/>
+                            <a:ext cx="566928" cy="716120"/>
                           </a:xfrm>
                           <a:prstGeom prst="rect"/>
                         </pic:spPr>
@@ -11584,7 +11584,7 @@
                     <pic:cNvPicPr/>
                   </pic:nvPicPr>
                   <pic:blipFill>
-                    <a:blip r:embed="rId64"/>
+                    <a:blip r:embed="rId67"/>
                     <a:stretch>
                       <a:fillRect/>
                     </a:stretch>
@@ -11898,7 +11898,7 @@
             <w:r>
               <w:drawing>
                 <wp:inline xmlns:a="http://schemas.openxmlformats.org/drawingml/2006/main" xmlns:pic="http://schemas.openxmlformats.org/drawingml/2006/picture">
-                  <wp:extent cx="566928" cy="708660"/>
+                  <wp:extent cx="566928" cy="716120"/>
                   <wp:docPr id="61" name="Picture 61"/>
                   <wp:cNvGraphicFramePr>
                     <a:graphicFrameLocks noChangeAspect="1"/>
@@ -11907,11 +11907,11 @@
                     <a:graphicData uri="http://schemas.openxmlformats.org/drawingml/2006/picture">
                       <pic:pic>
                         <pic:nvPicPr>
-                          <pic:cNvPr id="0" name="_ph-korea-kim.png"/>
+                          <pic:cNvPr id="0" name="korea-kim.png"/>
                           <pic:cNvPicPr/>
                         </pic:nvPicPr>
                         <pic:blipFill>
-                          <a:blip r:embed="rId65"/>
+                          <a:blip r:embed="rId68"/>
                           <a:stretch>
                             <a:fillRect/>
                           </a:stretch>
@@ -11919,7 +11919,7 @@
                         <pic:spPr>
                           <a:xfrm>
                             <a:off x="0" y="0"/>
-                            <a:ext cx="566928" cy="708660"/>
+                            <a:ext cx="566928" cy="716120"/>
                           </a:xfrm>
                           <a:prstGeom prst="rect"/>
                         </pic:spPr>
@@ -12038,7 +12038,7 @@
             <w:r>
               <w:drawing>
                 <wp:inline xmlns:a="http://schemas.openxmlformats.org/drawingml/2006/main" xmlns:pic="http://schemas.openxmlformats.org/drawingml/2006/picture">
-                  <wp:extent cx="566928" cy="708660"/>
+                  <wp:extent cx="566928" cy="716120"/>
                   <wp:docPr id="62" name="Picture 62"/>
                   <wp:cNvGraphicFramePr>
                     <a:graphicFrameLocks noChangeAspect="1"/>
@@ -12047,11 +12047,11 @@
                     <a:graphicData uri="http://schemas.openxmlformats.org/drawingml/2006/picture">
                       <pic:pic>
                         <pic:nvPicPr>
-                          <pic:cNvPr id="0" name="_ph-china-hejun.png"/>
+                          <pic:cNvPr id="0" name="korea-yeo.png"/>
                           <pic:cNvPicPr/>
                         </pic:nvPicPr>
                         <pic:blipFill>
-                          <a:blip r:embed="rId29"/>
+                          <a:blip r:embed="rId69"/>
                           <a:stretch>
                             <a:fillRect/>
                           </a:stretch>
@@ -12059,7 +12059,7 @@
                         <pic:spPr>
                           <a:xfrm>
                             <a:off x="0" y="0"/>
-                            <a:ext cx="566928" cy="708660"/>
+                            <a:ext cx="566928" cy="716120"/>
                           </a:xfrm>
                           <a:prstGeom prst="rect"/>
                         </pic:spPr>
@@ -12195,7 +12195,7 @@
             <w:r>
               <w:drawing>
                 <wp:inline xmlns:a="http://schemas.openxmlformats.org/drawingml/2006/main" xmlns:pic="http://schemas.openxmlformats.org/drawingml/2006/picture">
-                  <wp:extent cx="566928" cy="708660"/>
+                  <wp:extent cx="566928" cy="704830"/>
                   <wp:docPr id="63" name="Picture 63"/>
                   <wp:cNvGraphicFramePr>
                     <a:graphicFrameLocks noChangeAspect="1"/>
@@ -12204,11 +12204,11 @@
                     <a:graphicData uri="http://schemas.openxmlformats.org/drawingml/2006/picture">
                       <pic:pic>
                         <pic:nvPicPr>
-                          <pic:cNvPr id="0" name="_ph-korea-bae.png"/>
+                          <pic:cNvPr id="0" name="korea-bae.png"/>
                           <pic:cNvPicPr/>
                         </pic:nvPicPr>
                         <pic:blipFill>
-                          <a:blip r:embed="rId66"/>
+                          <a:blip r:embed="rId70"/>
                           <a:stretch>
                             <a:fillRect/>
                           </a:stretch>
@@ -12216,7 +12216,7 @@
                         <pic:spPr>
                           <a:xfrm>
                             <a:off x="0" y="0"/>
-                            <a:ext cx="566928" cy="708660"/>
+                            <a:ext cx="566928" cy="704830"/>
                           </a:xfrm>
                           <a:prstGeom prst="rect"/>
                         </pic:spPr>
@@ -12330,7 +12330,7 @@
                     <pic:cNvPicPr/>
                   </pic:nvPicPr>
                   <pic:blipFill>
-                    <a:blip r:embed="rId67"/>
+                    <a:blip r:embed="rId71"/>
                     <a:stretch>
                       <a:fillRect/>
                     </a:stretch>
@@ -12653,11 +12653,11 @@
                     <a:graphicData uri="http://schemas.openxmlformats.org/drawingml/2006/picture">
                       <pic:pic>
                         <pic:nvPicPr>
-                          <pic:cNvPr id="0" name="_ph-turkiye-bolat.png"/>
+                          <pic:cNvPr id="0" name="turkiye-bolat.png"/>
                           <pic:cNvPicPr/>
                         </pic:nvPicPr>
                         <pic:blipFill>
-                          <a:blip r:embed="rId68"/>
+                          <a:blip r:embed="rId72"/>
                           <a:stretch>
                             <a:fillRect/>
                           </a:stretch>
@@ -12801,7 +12801,7 @@
             <w:r>
               <w:drawing>
                 <wp:inline xmlns:a="http://schemas.openxmlformats.org/drawingml/2006/main" xmlns:pic="http://schemas.openxmlformats.org/drawingml/2006/picture">
-                  <wp:extent cx="566928" cy="708660"/>
+                  <wp:extent cx="566928" cy="716120"/>
                   <wp:docPr id="66" name="Picture 66"/>
                   <wp:cNvGraphicFramePr>
                     <a:graphicFrameLocks noChangeAspect="1"/>
@@ -12810,11 +12810,11 @@
                     <a:graphicData uri="http://schemas.openxmlformats.org/drawingml/2006/picture">
                       <pic:pic>
                         <pic:nvPicPr>
-                          <pic:cNvPr id="0" name="_ph-brazil-rosa.png"/>
+                          <pic:cNvPr id="0" name="turkiye-kacir.png"/>
                           <pic:cNvPicPr/>
                         </pic:nvPicPr>
                         <pic:blipFill>
-                          <a:blip r:embed="rId19"/>
+                          <a:blip r:embed="rId73"/>
                           <a:stretch>
                             <a:fillRect/>
                           </a:stretch>
@@ -12822,7 +12822,7 @@
                         <pic:spPr>
                           <a:xfrm>
                             <a:off x="0" y="0"/>
-                            <a:ext cx="566928" cy="708660"/>
+                            <a:ext cx="566928" cy="716120"/>
                           </a:xfrm>
                           <a:prstGeom prst="rect"/>
                         </pic:spPr>
@@ -12951,7 +12951,7 @@
                     <pic:cNvPicPr/>
                   </pic:nvPicPr>
                   <pic:blipFill>
-                    <a:blip r:embed="rId69"/>
+                    <a:blip r:embed="rId74"/>
                     <a:stretch>
                       <a:fillRect/>
                     </a:stretch>
@@ -13274,11 +13274,11 @@
                     <a:graphicData uri="http://schemas.openxmlformats.org/drawingml/2006/picture">
                       <pic:pic>
                         <pic:nvPicPr>
-                          <pic:cNvPr id="0" name="_ph-uk-kyle.png"/>
+                          <pic:cNvPr id="0" name="uk-kyle.png"/>
                           <pic:cNvPicPr/>
                         </pic:nvPicPr>
                         <pic:blipFill>
-                          <a:blip r:embed="rId70"/>
+                          <a:blip r:embed="rId75"/>
                           <a:stretch>
                             <a:fillRect/>
                           </a:stretch>
@@ -13414,11 +13414,11 @@
                     <a:graphicData uri="http://schemas.openxmlformats.org/drawingml/2006/picture">
                       <pic:pic>
                         <pic:nvPicPr>
-                          <pic:cNvPr id="0" name="_ph-uk-bryant.png"/>
+                          <pic:cNvPr id="0" name="uk-bryant.png"/>
                           <pic:cNvPicPr/>
                         </pic:nvPicPr>
                         <pic:blipFill>
-                          <a:blip r:embed="rId71"/>
+                          <a:blip r:embed="rId76"/>
                           <a:stretch>
                             <a:fillRect/>
                           </a:stretch>
@@ -13571,11 +13571,11 @@
                     <a:graphicData uri="http://schemas.openxmlformats.org/drawingml/2006/picture">
                       <pic:pic>
                         <pic:nvPicPr>
-                          <pic:cNvPr id="0" name="_ph-uk-kendall.png"/>
+                          <pic:cNvPr id="0" name="uk-kendall.png"/>
                           <pic:cNvPicPr/>
                         </pic:nvPicPr>
                         <pic:blipFill>
-                          <a:blip r:embed="rId72"/>
+                          <a:blip r:embed="rId77"/>
                           <a:stretch>
                             <a:fillRect/>
                           </a:stretch>
@@ -13712,7 +13712,7 @@
                     <pic:cNvPicPr/>
                   </pic:nvPicPr>
                   <pic:blipFill>
-                    <a:blip r:embed="rId73"/>
+                    <a:blip r:embed="rId78"/>
                     <a:stretch>
                       <a:fillRect/>
                     </a:stretch>
@@ -13988,7 +13988,7 @@
             <w:r>
               <w:drawing>
                 <wp:inline xmlns:a="http://schemas.openxmlformats.org/drawingml/2006/main" xmlns:pic="http://schemas.openxmlformats.org/drawingml/2006/picture">
-                  <wp:extent cx="566928" cy="708660"/>
+                  <wp:extent cx="566928" cy="716120"/>
                   <wp:docPr id="72" name="Picture 72"/>
                   <wp:cNvGraphicFramePr>
                     <a:graphicFrameLocks noChangeAspect="1"/>
@@ -13997,11 +13997,11 @@
                     <a:graphicData uri="http://schemas.openxmlformats.org/drawingml/2006/picture">
                       <pic:pic>
                         <pic:nvPicPr>
-                          <pic:cNvPr id="0" name="_ph-us-lutnick.png"/>
+                          <pic:cNvPr id="0" name="us-lutnick.png"/>
                           <pic:cNvPicPr/>
                         </pic:nvPicPr>
                         <pic:blipFill>
-                          <a:blip r:embed="rId74"/>
+                          <a:blip r:embed="rId79"/>
                           <a:stretch>
                             <a:fillRect/>
                           </a:stretch>
@@ -14009,7 +14009,7 @@
                         <pic:spPr>
                           <a:xfrm>
                             <a:off x="0" y="0"/>
-                            <a:ext cx="566928" cy="708660"/>
+                            <a:ext cx="566928" cy="716120"/>
                           </a:xfrm>
                           <a:prstGeom prst="rect"/>
                         </pic:spPr>
@@ -14128,7 +14128,7 @@
             <w:r>
               <w:drawing>
                 <wp:inline xmlns:a="http://schemas.openxmlformats.org/drawingml/2006/main" xmlns:pic="http://schemas.openxmlformats.org/drawingml/2006/picture">
-                  <wp:extent cx="566928" cy="708660"/>
+                  <wp:extent cx="566928" cy="716120"/>
                   <wp:docPr id="73" name="Picture 73"/>
                   <wp:cNvGraphicFramePr>
                     <a:graphicFrameLocks noChangeAspect="1"/>
@@ -14137,11 +14137,11 @@
                     <a:graphicData uri="http://schemas.openxmlformats.org/drawingml/2006/picture">
                       <pic:pic>
                         <pic:nvPicPr>
-                          <pic:cNvPr id="0" name="_ph-us-greer.png"/>
+                          <pic:cNvPr id="0" name="us-greer.png"/>
                           <pic:cNvPicPr/>
                         </pic:nvPicPr>
                         <pic:blipFill>
-                          <a:blip r:embed="rId75"/>
+                          <a:blip r:embed="rId80"/>
                           <a:stretch>
                             <a:fillRect/>
                           </a:stretch>
@@ -14149,7 +14149,7 @@
                         <pic:spPr>
                           <a:xfrm>
                             <a:off x="0" y="0"/>
-                            <a:ext cx="566928" cy="708660"/>
+                            <a:ext cx="566928" cy="716120"/>
                           </a:xfrm>
                           <a:prstGeom prst="rect"/>
                         </pic:spPr>
@@ -14300,7 +14300,7 @@
             <w:r>
               <w:drawing>
                 <wp:inline xmlns:a="http://schemas.openxmlformats.org/drawingml/2006/main" xmlns:pic="http://schemas.openxmlformats.org/drawingml/2006/picture">
-                  <wp:extent cx="566928" cy="708660"/>
+                  <wp:extent cx="566928" cy="704830"/>
                   <wp:docPr id="74" name="Picture 74"/>
                   <wp:cNvGraphicFramePr>
                     <a:graphicFrameLocks noChangeAspect="1"/>
@@ -14309,11 +14309,11 @@
                     <a:graphicData uri="http://schemas.openxmlformats.org/drawingml/2006/picture">
                       <pic:pic>
                         <pic:nvPicPr>
-                          <pic:cNvPr id="0" name="_ph-us-kratsios.png"/>
+                          <pic:cNvPr id="0" name="us-kratsios.png"/>
                           <pic:cNvPicPr/>
                         </pic:nvPicPr>
                         <pic:blipFill>
-                          <a:blip r:embed="rId76"/>
+                          <a:blip r:embed="rId81"/>
                           <a:stretch>
                             <a:fillRect/>
                           </a:stretch>
@@ -14321,7 +14321,7 @@
                         <pic:spPr>
                           <a:xfrm>
                             <a:off x="0" y="0"/>
-                            <a:ext cx="566928" cy="708660"/>
+                            <a:ext cx="566928" cy="704830"/>
                           </a:xfrm>
                           <a:prstGeom prst="rect"/>
                         </pic:spPr>
@@ -14440,7 +14440,7 @@
             <w:r>
               <w:drawing>
                 <wp:inline xmlns:a="http://schemas.openxmlformats.org/drawingml/2006/main" xmlns:pic="http://schemas.openxmlformats.org/drawingml/2006/picture">
-                  <wp:extent cx="566928" cy="708660"/>
+                  <wp:extent cx="566928" cy="716120"/>
                   <wp:docPr id="75" name="Picture 75"/>
                   <wp:cNvGraphicFramePr>
                     <a:graphicFrameLocks noChangeAspect="1"/>
@@ -14449,11 +14449,11 @@
                     <a:graphicData uri="http://schemas.openxmlformats.org/drawingml/2006/picture">
                       <pic:pic>
                         <pic:nvPicPr>
-                          <pic:cNvPr id="0" name="_ph-japan-akazawa.png"/>
+                          <pic:cNvPr id="0" name="us-roth.png"/>
                           <pic:cNvPicPr/>
                         </pic:nvPicPr>
                         <pic:blipFill>
-                          <a:blip r:embed="rId49"/>
+                          <a:blip r:embed="rId82"/>
                           <a:stretch>
                             <a:fillRect/>
                           </a:stretch>
@@ -14461,7 +14461,7 @@
                         <pic:spPr>
                           <a:xfrm>
                             <a:off x="0" y="0"/>
-                            <a:ext cx="566928" cy="708660"/>
+                            <a:ext cx="566928" cy="716120"/>
                           </a:xfrm>
                           <a:prstGeom prst="rect"/>
                         </pic:spPr>
@@ -14609,7 +14609,7 @@
                     <pic:cNvPicPr/>
                   </pic:nvPicPr>
                   <pic:blipFill>
-                    <a:blip r:embed="rId77"/>
+                    <a:blip r:embed="rId83"/>
                     <a:stretch>
                       <a:fillRect/>
                     </a:stretch>
@@ -14962,7 +14962,7 @@
                           <pic:cNvPicPr/>
                         </pic:nvPicPr>
                         <pic:blipFill>
-                          <a:blip r:embed="rId78"/>
+                          <a:blip r:embed="rId84"/>
                           <a:stretch>
                             <a:fillRect/>
                           </a:stretch>
@@ -15119,7 +15119,7 @@
                           <pic:cNvPicPr/>
                         </pic:nvPicPr>
                         <pic:blipFill>
-                          <a:blip r:embed="rId79"/>
+                          <a:blip r:embed="rId85"/>
                           <a:stretch>
                             <a:fillRect/>
                           </a:stretch>
@@ -15241,7 +15241,7 @@
                     <pic:cNvPicPr/>
                   </pic:nvPicPr>
                   <pic:blipFill>
-                    <a:blip r:embed="rId80"/>
+                    <a:blip r:embed="rId86"/>
                     <a:stretch>
                       <a:fillRect/>
                     </a:stretch>
@@ -15594,7 +15594,7 @@
                           <pic:cNvPicPr/>
                         </pic:nvPicPr>
                         <pic:blipFill>
-                          <a:blip r:embed="rId81"/>
+                          <a:blip r:embed="rId87"/>
                           <a:stretch>
                             <a:fillRect/>
                           </a:stretch>
@@ -15766,7 +15766,7 @@
                           <pic:cNvPicPr/>
                         </pic:nvPicPr>
                         <pic:blipFill>
-                          <a:blip r:embed="rId82"/>
+                          <a:blip r:embed="rId88"/>
                           <a:stretch>
                             <a:fillRect/>
                           </a:stretch>
@@ -15864,7 +15864,7 @@
       </w:r>
     </w:p>
     <w:sectPr>
-      <w:footerReference w:type="default" r:id="rId83"/>
+      <w:footerReference w:type="default" r:id="rId89"/>
       <w:pgSz w:w="12240" w:h="15840"/>
       <w:pgMar w:top="1008" w:right="1224" w:bottom="1152" w:left="1224" w:header="720" w:footer="720" w:gutter="0"/>
       <w:cols w:space="720"/>

</xml_diff>

<commit_message>
Apply second portrait batch: 22 new officials (43/59 total)
Extracted from the second G20_Portraits sheet (44 images; 21 were
batch-one duplicates, skipped per instruction). Pairing cross-checked
two ways with 44/44 agreement and verified visually. New portraits:
Mexico (Ebrard, Gutierrez), Japan (Matsumoto, Akazawa), Italy (Butti,
Urso, Tajani), Indonesia (Hafid, Airlangga, Santoso), India (Vaishnaw,
Agrawal, Goyal), Germany (Wildberger, Reiche), France (Le Henanff,
Forissier), China (Li Lecheng, Yin Hejun, Li Chenggang, Wang Wentao),
Canada (Solomon).

Dominic LeBlanc's image in the sheet was a 36x36 broken-image icon
(photo did not embed) - discarded; his slot stays a placeholder.

16 slots remain: Argentina (3), Australia (3), Brazil (3), Canada
(Sidhu, LeBlanc), Saudi Arabia (Al-Qasabi), EU (2), AU (2).
684 QA checks pass.

Co-Authored-By: Claude Fable 5 <noreply@anthropic.com>
Claude-Session: https://claude.ai/code/session_01D7VNHN8h6qLVjZi6Tzyhub
</commit_message>
<xml_diff>
--- a/output/g20-ministers-trade-list.docx
+++ b/output/g20-ministers-trade-list.docx
@@ -3363,7 +3363,7 @@
             <w:r>
               <w:drawing>
                 <wp:inline xmlns:a="http://schemas.openxmlformats.org/drawingml/2006/main" xmlns:pic="http://schemas.openxmlformats.org/drawingml/2006/picture">
-                  <wp:extent cx="566928" cy="708660"/>
+                  <wp:extent cx="566928" cy="707594"/>
                   <wp:docPr id="17" name="Picture 17"/>
                   <wp:cNvGraphicFramePr>
                     <a:graphicFrameLocks noChangeAspect="1"/>
@@ -3372,7 +3372,7 @@
                     <a:graphicData uri="http://schemas.openxmlformats.org/drawingml/2006/picture">
                       <pic:pic>
                         <pic:nvPicPr>
-                          <pic:cNvPr id="0" name="_ph-canada-solomon.png"/>
+                          <pic:cNvPr id="0" name="canada-solomon.png"/>
                           <pic:cNvPicPr/>
                         </pic:nvPicPr>
                         <pic:blipFill>
@@ -3384,7 +3384,7 @@
                         <pic:spPr>
                           <a:xfrm>
                             <a:off x="0" y="0"/>
-                            <a:ext cx="566928" cy="708660"/>
+                            <a:ext cx="566928" cy="707594"/>
                           </a:xfrm>
                           <a:prstGeom prst="rect"/>
                         </pic:spPr>
@@ -3812,7 +3812,7 @@
             <w:r>
               <w:drawing>
                 <wp:inline xmlns:a="http://schemas.openxmlformats.org/drawingml/2006/main" xmlns:pic="http://schemas.openxmlformats.org/drawingml/2006/picture">
-                  <wp:extent cx="566928" cy="708660"/>
+                  <wp:extent cx="566928" cy="705986"/>
                   <wp:docPr id="19" name="Picture 19"/>
                   <wp:cNvGraphicFramePr>
                     <a:graphicFrameLocks noChangeAspect="1"/>
@@ -3821,7 +3821,7 @@
                     <a:graphicData uri="http://schemas.openxmlformats.org/drawingml/2006/picture">
                       <pic:pic>
                         <pic:nvPicPr>
-                          <pic:cNvPr id="0" name="_ph-china-wangwentao.png"/>
+                          <pic:cNvPr id="0" name="china-wangwentao.png"/>
                           <pic:cNvPicPr/>
                         </pic:nvPicPr>
                         <pic:blipFill>
@@ -3833,7 +3833,7 @@
                         <pic:spPr>
                           <a:xfrm>
                             <a:off x="0" y="0"/>
-                            <a:ext cx="566928" cy="708660"/>
+                            <a:ext cx="566928" cy="705986"/>
                           </a:xfrm>
                           <a:prstGeom prst="rect"/>
                         </pic:spPr>
@@ -3952,7 +3952,7 @@
             <w:r>
               <w:drawing>
                 <wp:inline xmlns:a="http://schemas.openxmlformats.org/drawingml/2006/main" xmlns:pic="http://schemas.openxmlformats.org/drawingml/2006/picture">
-                  <wp:extent cx="566928" cy="708660"/>
+                  <wp:extent cx="566928" cy="709551"/>
                   <wp:docPr id="20" name="Picture 20"/>
                   <wp:cNvGraphicFramePr>
                     <a:graphicFrameLocks noChangeAspect="1"/>
@@ -3961,7 +3961,7 @@
                     <a:graphicData uri="http://schemas.openxmlformats.org/drawingml/2006/picture">
                       <pic:pic>
                         <pic:nvPicPr>
-                          <pic:cNvPr id="0" name="_ph-china-lichenggang.png"/>
+                          <pic:cNvPr id="0" name="china-lichenggang.png"/>
                           <pic:cNvPicPr/>
                         </pic:nvPicPr>
                         <pic:blipFill>
@@ -3973,7 +3973,7 @@
                         <pic:spPr>
                           <a:xfrm>
                             <a:off x="0" y="0"/>
-                            <a:ext cx="566928" cy="708660"/>
+                            <a:ext cx="566928" cy="709551"/>
                           </a:xfrm>
                           <a:prstGeom prst="rect"/>
                         </pic:spPr>
@@ -4124,7 +4124,7 @@
             <w:r>
               <w:drawing>
                 <wp:inline xmlns:a="http://schemas.openxmlformats.org/drawingml/2006/main" xmlns:pic="http://schemas.openxmlformats.org/drawingml/2006/picture">
-                  <wp:extent cx="566928" cy="708660"/>
+                  <wp:extent cx="566928" cy="707709"/>
                   <wp:docPr id="21" name="Picture 21"/>
                   <wp:cNvGraphicFramePr>
                     <a:graphicFrameLocks noChangeAspect="1"/>
@@ -4133,7 +4133,7 @@
                     <a:graphicData uri="http://schemas.openxmlformats.org/drawingml/2006/picture">
                       <pic:pic>
                         <pic:nvPicPr>
-                          <pic:cNvPr id="0" name="_ph-china-lilecheng.png"/>
+                          <pic:cNvPr id="0" name="china-lilecheng.png"/>
                           <pic:cNvPicPr/>
                         </pic:nvPicPr>
                         <pic:blipFill>
@@ -4145,7 +4145,7 @@
                         <pic:spPr>
                           <a:xfrm>
                             <a:off x="0" y="0"/>
-                            <a:ext cx="566928" cy="708660"/>
+                            <a:ext cx="566928" cy="707709"/>
                           </a:xfrm>
                           <a:prstGeom prst="rect"/>
                         </pic:spPr>
@@ -4264,7 +4264,7 @@
             <w:r>
               <w:drawing>
                 <wp:inline xmlns:a="http://schemas.openxmlformats.org/drawingml/2006/main" xmlns:pic="http://schemas.openxmlformats.org/drawingml/2006/picture">
-                  <wp:extent cx="566928" cy="708660"/>
+                  <wp:extent cx="566928" cy="705768"/>
                   <wp:docPr id="22" name="Picture 22"/>
                   <wp:cNvGraphicFramePr>
                     <a:graphicFrameLocks noChangeAspect="1"/>
@@ -4273,7 +4273,7 @@
                     <a:graphicData uri="http://schemas.openxmlformats.org/drawingml/2006/picture">
                       <pic:pic>
                         <pic:nvPicPr>
-                          <pic:cNvPr id="0" name="_ph-china-hejun.png"/>
+                          <pic:cNvPr id="0" name="china-hejun.png"/>
                           <pic:cNvPicPr/>
                         </pic:nvPicPr>
                         <pic:blipFill>
@@ -4285,7 +4285,7 @@
                         <pic:spPr>
                           <a:xfrm>
                             <a:off x="0" y="0"/>
-                            <a:ext cx="566928" cy="708660"/>
+                            <a:ext cx="566928" cy="705768"/>
                           </a:xfrm>
                           <a:prstGeom prst="rect"/>
                         </pic:spPr>
@@ -4728,7 +4728,7 @@
             <w:r>
               <w:drawing>
                 <wp:inline xmlns:a="http://schemas.openxmlformats.org/drawingml/2006/main" xmlns:pic="http://schemas.openxmlformats.org/drawingml/2006/picture">
-                  <wp:extent cx="566928" cy="708660"/>
+                  <wp:extent cx="566928" cy="707709"/>
                   <wp:docPr id="24" name="Picture 24"/>
                   <wp:cNvGraphicFramePr>
                     <a:graphicFrameLocks noChangeAspect="1"/>
@@ -4737,7 +4737,7 @@
                     <a:graphicData uri="http://schemas.openxmlformats.org/drawingml/2006/picture">
                       <pic:pic>
                         <pic:nvPicPr>
-                          <pic:cNvPr id="0" name="_ph-france-forissier.png"/>
+                          <pic:cNvPr id="0" name="france-forissier.png"/>
                           <pic:cNvPicPr/>
                         </pic:nvPicPr>
                         <pic:blipFill>
@@ -4749,7 +4749,7 @@
                         <pic:spPr>
                           <a:xfrm>
                             <a:off x="0" y="0"/>
-                            <a:ext cx="566928" cy="708660"/>
+                            <a:ext cx="566928" cy="707709"/>
                           </a:xfrm>
                           <a:prstGeom prst="rect"/>
                         </pic:spPr>
@@ -4885,7 +4885,7 @@
             <w:r>
               <w:drawing>
                 <wp:inline xmlns:a="http://schemas.openxmlformats.org/drawingml/2006/main" xmlns:pic="http://schemas.openxmlformats.org/drawingml/2006/picture">
-                  <wp:extent cx="566928" cy="708660"/>
+                  <wp:extent cx="566928" cy="709551"/>
                   <wp:docPr id="25" name="Picture 25"/>
                   <wp:cNvGraphicFramePr>
                     <a:graphicFrameLocks noChangeAspect="1"/>
@@ -4894,7 +4894,7 @@
                     <a:graphicData uri="http://schemas.openxmlformats.org/drawingml/2006/picture">
                       <pic:pic>
                         <pic:nvPicPr>
-                          <pic:cNvPr id="0" name="_ph-france-lehenanff.png"/>
+                          <pic:cNvPr id="0" name="france-lehenanff.png"/>
                           <pic:cNvPicPr/>
                         </pic:nvPicPr>
                         <pic:blipFill>
@@ -4906,7 +4906,7 @@
                         <pic:spPr>
                           <a:xfrm>
                             <a:off x="0" y="0"/>
-                            <a:ext cx="566928" cy="708660"/>
+                            <a:ext cx="566928" cy="709551"/>
                           </a:xfrm>
                           <a:prstGeom prst="rect"/>
                         </pic:spPr>
@@ -5334,7 +5334,7 @@
             <w:r>
               <w:drawing>
                 <wp:inline xmlns:a="http://schemas.openxmlformats.org/drawingml/2006/main" xmlns:pic="http://schemas.openxmlformats.org/drawingml/2006/picture">
-                  <wp:extent cx="566928" cy="708660"/>
+                  <wp:extent cx="566928" cy="709551"/>
                   <wp:docPr id="27" name="Picture 27"/>
                   <wp:cNvGraphicFramePr>
                     <a:graphicFrameLocks noChangeAspect="1"/>
@@ -5343,7 +5343,7 @@
                     <a:graphicData uri="http://schemas.openxmlformats.org/drawingml/2006/picture">
                       <pic:pic>
                         <pic:nvPicPr>
-                          <pic:cNvPr id="0" name="_ph-germany-reiche.png"/>
+                          <pic:cNvPr id="0" name="germany-reiche.png"/>
                           <pic:cNvPicPr/>
                         </pic:nvPicPr>
                         <pic:blipFill>
@@ -5355,7 +5355,7 @@
                         <pic:spPr>
                           <a:xfrm>
                             <a:off x="0" y="0"/>
-                            <a:ext cx="566928" cy="708660"/>
+                            <a:ext cx="566928" cy="709551"/>
                           </a:xfrm>
                           <a:prstGeom prst="rect"/>
                         </pic:spPr>
@@ -5506,7 +5506,7 @@
             <w:r>
               <w:drawing>
                 <wp:inline xmlns:a="http://schemas.openxmlformats.org/drawingml/2006/main" xmlns:pic="http://schemas.openxmlformats.org/drawingml/2006/picture">
-                  <wp:extent cx="566928" cy="708660"/>
+                  <wp:extent cx="566928" cy="709551"/>
                   <wp:docPr id="28" name="Picture 28"/>
                   <wp:cNvGraphicFramePr>
                     <a:graphicFrameLocks noChangeAspect="1"/>
@@ -5515,7 +5515,7 @@
                     <a:graphicData uri="http://schemas.openxmlformats.org/drawingml/2006/picture">
                       <pic:pic>
                         <pic:nvPicPr>
-                          <pic:cNvPr id="0" name="_ph-germany-wildberger.png"/>
+                          <pic:cNvPr id="0" name="germany-wildberger.png"/>
                           <pic:cNvPicPr/>
                         </pic:nvPicPr>
                         <pic:blipFill>
@@ -5527,7 +5527,7 @@
                         <pic:spPr>
                           <a:xfrm>
                             <a:off x="0" y="0"/>
-                            <a:ext cx="566928" cy="708660"/>
+                            <a:ext cx="566928" cy="709551"/>
                           </a:xfrm>
                           <a:prstGeom prst="rect"/>
                         </pic:spPr>
@@ -5955,7 +5955,7 @@
             <w:r>
               <w:drawing>
                 <wp:inline xmlns:a="http://schemas.openxmlformats.org/drawingml/2006/main" xmlns:pic="http://schemas.openxmlformats.org/drawingml/2006/picture">
-                  <wp:extent cx="566928" cy="708660"/>
+                  <wp:extent cx="566928" cy="711495"/>
                   <wp:docPr id="30" name="Picture 30"/>
                   <wp:cNvGraphicFramePr>
                     <a:graphicFrameLocks noChangeAspect="1"/>
@@ -5964,7 +5964,7 @@
                     <a:graphicData uri="http://schemas.openxmlformats.org/drawingml/2006/picture">
                       <pic:pic>
                         <pic:nvPicPr>
-                          <pic:cNvPr id="0" name="_ph-india-goyal.png"/>
+                          <pic:cNvPr id="0" name="india-goyal.png"/>
                           <pic:cNvPicPr/>
                         </pic:nvPicPr>
                         <pic:blipFill>
@@ -5976,7 +5976,7 @@
                         <pic:spPr>
                           <a:xfrm>
                             <a:off x="0" y="0"/>
-                            <a:ext cx="566928" cy="708660"/>
+                            <a:ext cx="566928" cy="711495"/>
                           </a:xfrm>
                           <a:prstGeom prst="rect"/>
                         </pic:spPr>
@@ -6095,7 +6095,7 @@
             <w:r>
               <w:drawing>
                 <wp:inline xmlns:a="http://schemas.openxmlformats.org/drawingml/2006/main" xmlns:pic="http://schemas.openxmlformats.org/drawingml/2006/picture">
-                  <wp:extent cx="566928" cy="708660"/>
+                  <wp:extent cx="566928" cy="709551"/>
                   <wp:docPr id="31" name="Picture 31"/>
                   <wp:cNvGraphicFramePr>
                     <a:graphicFrameLocks noChangeAspect="1"/>
@@ -6104,7 +6104,7 @@
                     <a:graphicData uri="http://schemas.openxmlformats.org/drawingml/2006/picture">
                       <pic:pic>
                         <pic:nvPicPr>
-                          <pic:cNvPr id="0" name="_ph-india-agrawal.png"/>
+                          <pic:cNvPr id="0" name="india-agrawal.png"/>
                           <pic:cNvPicPr/>
                         </pic:nvPicPr>
                         <pic:blipFill>
@@ -6116,7 +6116,7 @@
                         <pic:spPr>
                           <a:xfrm>
                             <a:off x="0" y="0"/>
-                            <a:ext cx="566928" cy="708660"/>
+                            <a:ext cx="566928" cy="709551"/>
                           </a:xfrm>
                           <a:prstGeom prst="rect"/>
                         </pic:spPr>
@@ -6276,7 +6276,7 @@
                     <a:graphicData uri="http://schemas.openxmlformats.org/drawingml/2006/picture">
                       <pic:pic>
                         <pic:nvPicPr>
-                          <pic:cNvPr id="0" name="_ph-india-vaishnaw.png"/>
+                          <pic:cNvPr id="0" name="india-vaishnaw.png"/>
                           <pic:cNvPicPr/>
                         </pic:nvPicPr>
                         <pic:blipFill>
@@ -6731,7 +6731,7 @@
             <w:r>
               <w:drawing>
                 <wp:inline xmlns:a="http://schemas.openxmlformats.org/drawingml/2006/main" xmlns:pic="http://schemas.openxmlformats.org/drawingml/2006/picture">
-                  <wp:extent cx="566928" cy="708660"/>
+                  <wp:extent cx="566928" cy="705986"/>
                   <wp:docPr id="34" name="Picture 34"/>
                   <wp:cNvGraphicFramePr>
                     <a:graphicFrameLocks noChangeAspect="1"/>
@@ -6740,7 +6740,7 @@
                     <a:graphicData uri="http://schemas.openxmlformats.org/drawingml/2006/picture">
                       <pic:pic>
                         <pic:nvPicPr>
-                          <pic:cNvPr id="0" name="_ph-indonesia-santoso.png"/>
+                          <pic:cNvPr id="0" name="indonesia-santoso.png"/>
                           <pic:cNvPicPr/>
                         </pic:nvPicPr>
                         <pic:blipFill>
@@ -6752,7 +6752,7 @@
                         <pic:spPr>
                           <a:xfrm>
                             <a:off x="0" y="0"/>
-                            <a:ext cx="566928" cy="708660"/>
+                            <a:ext cx="566928" cy="705986"/>
                           </a:xfrm>
                           <a:prstGeom prst="rect"/>
                         </pic:spPr>
@@ -6871,7 +6871,7 @@
             <w:r>
               <w:drawing>
                 <wp:inline xmlns:a="http://schemas.openxmlformats.org/drawingml/2006/main" xmlns:pic="http://schemas.openxmlformats.org/drawingml/2006/picture">
-                  <wp:extent cx="566928" cy="708660"/>
+                  <wp:extent cx="566928" cy="709551"/>
                   <wp:docPr id="35" name="Picture 35"/>
                   <wp:cNvGraphicFramePr>
                     <a:graphicFrameLocks noChangeAspect="1"/>
@@ -6880,7 +6880,7 @@
                     <a:graphicData uri="http://schemas.openxmlformats.org/drawingml/2006/picture">
                       <pic:pic>
                         <pic:nvPicPr>
-                          <pic:cNvPr id="0" name="_ph-indonesia-airlangga.png"/>
+                          <pic:cNvPr id="0" name="indonesia-airlangga.png"/>
                           <pic:cNvPicPr/>
                         </pic:nvPicPr>
                         <pic:blipFill>
@@ -6892,7 +6892,7 @@
                         <pic:spPr>
                           <a:xfrm>
                             <a:off x="0" y="0"/>
-                            <a:ext cx="566928" cy="708660"/>
+                            <a:ext cx="566928" cy="709551"/>
                           </a:xfrm>
                           <a:prstGeom prst="rect"/>
                         </pic:spPr>
@@ -7028,7 +7028,7 @@
             <w:r>
               <w:drawing>
                 <wp:inline xmlns:a="http://schemas.openxmlformats.org/drawingml/2006/main" xmlns:pic="http://schemas.openxmlformats.org/drawingml/2006/picture">
-                  <wp:extent cx="566928" cy="708660"/>
+                  <wp:extent cx="566928" cy="709551"/>
                   <wp:docPr id="36" name="Picture 36"/>
                   <wp:cNvGraphicFramePr>
                     <a:graphicFrameLocks noChangeAspect="1"/>
@@ -7037,7 +7037,7 @@
                     <a:graphicData uri="http://schemas.openxmlformats.org/drawingml/2006/picture">
                       <pic:pic>
                         <pic:nvPicPr>
-                          <pic:cNvPr id="0" name="_ph-indonesia-hafid.png"/>
+                          <pic:cNvPr id="0" name="indonesia-hafid.png"/>
                           <pic:cNvPicPr/>
                         </pic:nvPicPr>
                         <pic:blipFill>
@@ -7049,7 +7049,7 @@
                         <pic:spPr>
                           <a:xfrm>
                             <a:off x="0" y="0"/>
-                            <a:ext cx="566928" cy="708660"/>
+                            <a:ext cx="566928" cy="709551"/>
                           </a:xfrm>
                           <a:prstGeom prst="rect"/>
                         </pic:spPr>
@@ -7477,7 +7477,7 @@
             <w:r>
               <w:drawing>
                 <wp:inline xmlns:a="http://schemas.openxmlformats.org/drawingml/2006/main" xmlns:pic="http://schemas.openxmlformats.org/drawingml/2006/picture">
-                  <wp:extent cx="566928" cy="708660"/>
+                  <wp:extent cx="566928" cy="709551"/>
                   <wp:docPr id="38" name="Picture 38"/>
                   <wp:cNvGraphicFramePr>
                     <a:graphicFrameLocks noChangeAspect="1"/>
@@ -7486,7 +7486,7 @@
                     <a:graphicData uri="http://schemas.openxmlformats.org/drawingml/2006/picture">
                       <pic:pic>
                         <pic:nvPicPr>
-                          <pic:cNvPr id="0" name="_ph-italy-tajani.png"/>
+                          <pic:cNvPr id="0" name="italy-tajani.png"/>
                           <pic:cNvPicPr/>
                         </pic:nvPicPr>
                         <pic:blipFill>
@@ -7498,7 +7498,7 @@
                         <pic:spPr>
                           <a:xfrm>
                             <a:off x="0" y="0"/>
-                            <a:ext cx="566928" cy="708660"/>
+                            <a:ext cx="566928" cy="709551"/>
                           </a:xfrm>
                           <a:prstGeom prst="rect"/>
                         </pic:spPr>
@@ -7617,7 +7617,7 @@
             <w:r>
               <w:drawing>
                 <wp:inline xmlns:a="http://schemas.openxmlformats.org/drawingml/2006/main" xmlns:pic="http://schemas.openxmlformats.org/drawingml/2006/picture">
-                  <wp:extent cx="566928" cy="708660"/>
+                  <wp:extent cx="566928" cy="706819"/>
                   <wp:docPr id="39" name="Picture 39"/>
                   <wp:cNvGraphicFramePr>
                     <a:graphicFrameLocks noChangeAspect="1"/>
@@ -7626,7 +7626,7 @@
                     <a:graphicData uri="http://schemas.openxmlformats.org/drawingml/2006/picture">
                       <pic:pic>
                         <pic:nvPicPr>
-                          <pic:cNvPr id="0" name="_ph-italy-urso.png"/>
+                          <pic:cNvPr id="0" name="italy-urso.png"/>
                           <pic:cNvPicPr/>
                         </pic:nvPicPr>
                         <pic:blipFill>
@@ -7638,7 +7638,7 @@
                         <pic:spPr>
                           <a:xfrm>
                             <a:off x="0" y="0"/>
-                            <a:ext cx="566928" cy="708660"/>
+                            <a:ext cx="566928" cy="706819"/>
                           </a:xfrm>
                           <a:prstGeom prst="rect"/>
                         </pic:spPr>
@@ -7774,7 +7774,7 @@
             <w:r>
               <w:drawing>
                 <wp:inline xmlns:a="http://schemas.openxmlformats.org/drawingml/2006/main" xmlns:pic="http://schemas.openxmlformats.org/drawingml/2006/picture">
-                  <wp:extent cx="566928" cy="708660"/>
+                  <wp:extent cx="566928" cy="709551"/>
                   <wp:docPr id="40" name="Picture 40"/>
                   <wp:cNvGraphicFramePr>
                     <a:graphicFrameLocks noChangeAspect="1"/>
@@ -7783,7 +7783,7 @@
                     <a:graphicData uri="http://schemas.openxmlformats.org/drawingml/2006/picture">
                       <pic:pic>
                         <pic:nvPicPr>
-                          <pic:cNvPr id="0" name="_ph-italy-butti.png"/>
+                          <pic:cNvPr id="0" name="italy-butti.png"/>
                           <pic:cNvPicPr/>
                         </pic:nvPicPr>
                         <pic:blipFill>
@@ -7795,7 +7795,7 @@
                         <pic:spPr>
                           <a:xfrm>
                             <a:off x="0" y="0"/>
-                            <a:ext cx="566928" cy="708660"/>
+                            <a:ext cx="566928" cy="709551"/>
                           </a:xfrm>
                           <a:prstGeom prst="rect"/>
                         </pic:spPr>
@@ -8223,7 +8223,7 @@
             <w:r>
               <w:drawing>
                 <wp:inline xmlns:a="http://schemas.openxmlformats.org/drawingml/2006/main" xmlns:pic="http://schemas.openxmlformats.org/drawingml/2006/picture">
-                  <wp:extent cx="566928" cy="708660"/>
+                  <wp:extent cx="566928" cy="707709"/>
                   <wp:docPr id="42" name="Picture 42"/>
                   <wp:cNvGraphicFramePr>
                     <a:graphicFrameLocks noChangeAspect="1"/>
@@ -8232,7 +8232,7 @@
                     <a:graphicData uri="http://schemas.openxmlformats.org/drawingml/2006/picture">
                       <pic:pic>
                         <pic:nvPicPr>
-                          <pic:cNvPr id="0" name="_ph-japan-akazawa.png"/>
+                          <pic:cNvPr id="0" name="japan-akazawa.png"/>
                           <pic:cNvPicPr/>
                         </pic:nvPicPr>
                         <pic:blipFill>
@@ -8244,7 +8244,7 @@
                         <pic:spPr>
                           <a:xfrm>
                             <a:off x="0" y="0"/>
-                            <a:ext cx="566928" cy="708660"/>
+                            <a:ext cx="566928" cy="707709"/>
                           </a:xfrm>
                           <a:prstGeom prst="rect"/>
                         </pic:spPr>
@@ -8395,7 +8395,7 @@
             <w:r>
               <w:drawing>
                 <wp:inline xmlns:a="http://schemas.openxmlformats.org/drawingml/2006/main" xmlns:pic="http://schemas.openxmlformats.org/drawingml/2006/picture">
-                  <wp:extent cx="566928" cy="708660"/>
+                  <wp:extent cx="566928" cy="706545"/>
                   <wp:docPr id="43" name="Picture 43"/>
                   <wp:cNvGraphicFramePr>
                     <a:graphicFrameLocks noChangeAspect="1"/>
@@ -8404,7 +8404,7 @@
                     <a:graphicData uri="http://schemas.openxmlformats.org/drawingml/2006/picture">
                       <pic:pic>
                         <pic:nvPicPr>
-                          <pic:cNvPr id="0" name="_ph-japan-matsumoto.png"/>
+                          <pic:cNvPr id="0" name="japan-matsumoto.png"/>
                           <pic:cNvPicPr/>
                         </pic:nvPicPr>
                         <pic:blipFill>
@@ -8416,7 +8416,7 @@
                         <pic:spPr>
                           <a:xfrm>
                             <a:off x="0" y="0"/>
-                            <a:ext cx="566928" cy="708660"/>
+                            <a:ext cx="566928" cy="706545"/>
                           </a:xfrm>
                           <a:prstGeom prst="rect"/>
                         </pic:spPr>
@@ -8844,7 +8844,7 @@
             <w:r>
               <w:drawing>
                 <wp:inline xmlns:a="http://schemas.openxmlformats.org/drawingml/2006/main" xmlns:pic="http://schemas.openxmlformats.org/drawingml/2006/picture">
-                  <wp:extent cx="566928" cy="708660"/>
+                  <wp:extent cx="566928" cy="705986"/>
                   <wp:docPr id="45" name="Picture 45"/>
                   <wp:cNvGraphicFramePr>
                     <a:graphicFrameLocks noChangeAspect="1"/>
@@ -8853,7 +8853,7 @@
                     <a:graphicData uri="http://schemas.openxmlformats.org/drawingml/2006/picture">
                       <pic:pic>
                         <pic:nvPicPr>
-                          <pic:cNvPr id="0" name="_ph-mexico-ebrard.png"/>
+                          <pic:cNvPr id="0" name="mexico-ebrard.png"/>
                           <pic:cNvPicPr/>
                         </pic:nvPicPr>
                         <pic:blipFill>
@@ -8865,7 +8865,7 @@
                         <pic:spPr>
                           <a:xfrm>
                             <a:off x="0" y="0"/>
-                            <a:ext cx="566928" cy="708660"/>
+                            <a:ext cx="566928" cy="705986"/>
                           </a:xfrm>
                           <a:prstGeom prst="rect"/>
                         </pic:spPr>
@@ -8984,7 +8984,7 @@
             <w:r>
               <w:drawing>
                 <wp:inline xmlns:a="http://schemas.openxmlformats.org/drawingml/2006/main" xmlns:pic="http://schemas.openxmlformats.org/drawingml/2006/picture">
-                  <wp:extent cx="566928" cy="708660"/>
+                  <wp:extent cx="566928" cy="709551"/>
                   <wp:docPr id="46" name="Picture 46"/>
                   <wp:cNvGraphicFramePr>
                     <a:graphicFrameLocks noChangeAspect="1"/>
@@ -8993,7 +8993,7 @@
                     <a:graphicData uri="http://schemas.openxmlformats.org/drawingml/2006/picture">
                       <pic:pic>
                         <pic:nvPicPr>
-                          <pic:cNvPr id="0" name="_ph-mexico-gutierrez.png"/>
+                          <pic:cNvPr id="0" name="mexico-gutierrez.png"/>
                           <pic:cNvPicPr/>
                         </pic:nvPicPr>
                         <pic:blipFill>
@@ -9005,7 +9005,7 @@
                         <pic:spPr>
                           <a:xfrm>
                             <a:off x="0" y="0"/>
-                            <a:ext cx="566928" cy="708660"/>
+                            <a:ext cx="566928" cy="709551"/>
                           </a:xfrm>
                           <a:prstGeom prst="rect"/>
                         </pic:spPr>
@@ -9141,7 +9141,7 @@
             <w:r>
               <w:drawing>
                 <wp:inline xmlns:a="http://schemas.openxmlformats.org/drawingml/2006/main" xmlns:pic="http://schemas.openxmlformats.org/drawingml/2006/picture">
-                  <wp:extent cx="566928" cy="709551"/>
+                  <wp:extent cx="566928" cy="705986"/>
                   <wp:docPr id="47" name="Picture 47"/>
                   <wp:cNvGraphicFramePr>
                     <a:graphicFrameLocks noChangeAspect="1"/>
@@ -9162,7 +9162,7 @@
                         <pic:spPr>
                           <a:xfrm>
                             <a:off x="0" y="0"/>
-                            <a:ext cx="566928" cy="709551"/>
+                            <a:ext cx="566928" cy="705986"/>
                           </a:xfrm>
                           <a:prstGeom prst="rect"/>
                         </pic:spPr>
@@ -9730,7 +9730,7 @@
             <w:r>
               <w:drawing>
                 <wp:inline xmlns:a="http://schemas.openxmlformats.org/drawingml/2006/main" xmlns:pic="http://schemas.openxmlformats.org/drawingml/2006/picture">
-                  <wp:extent cx="566928" cy="709551"/>
+                  <wp:extent cx="566928" cy="705986"/>
                   <wp:docPr id="50" name="Picture 50"/>
                   <wp:cNvGraphicFramePr>
                     <a:graphicFrameLocks noChangeAspect="1"/>
@@ -9751,7 +9751,7 @@
                         <pic:spPr>
                           <a:xfrm>
                             <a:off x="0" y="0"/>
-                            <a:ext cx="566928" cy="709551"/>
+                            <a:ext cx="566928" cy="705986"/>
                           </a:xfrm>
                           <a:prstGeom prst="rect"/>
                         </pic:spPr>
@@ -9902,7 +9902,7 @@
             <w:r>
               <w:drawing>
                 <wp:inline xmlns:a="http://schemas.openxmlformats.org/drawingml/2006/main" xmlns:pic="http://schemas.openxmlformats.org/drawingml/2006/picture">
-                  <wp:extent cx="566928" cy="709551"/>
+                  <wp:extent cx="566928" cy="705986"/>
                   <wp:docPr id="51" name="Picture 51"/>
                   <wp:cNvGraphicFramePr>
                     <a:graphicFrameLocks noChangeAspect="1"/>
@@ -9923,7 +9923,7 @@
                         <pic:spPr>
                           <a:xfrm>
                             <a:off x="0" y="0"/>
-                            <a:ext cx="566928" cy="709551"/>
+                            <a:ext cx="566928" cy="705986"/>
                           </a:xfrm>
                           <a:prstGeom prst="rect"/>
                         </pic:spPr>
@@ -10506,7 +10506,7 @@
             <w:r>
               <w:drawing>
                 <wp:inline xmlns:a="http://schemas.openxmlformats.org/drawingml/2006/main" xmlns:pic="http://schemas.openxmlformats.org/drawingml/2006/picture">
-                  <wp:extent cx="566928" cy="716120"/>
+                  <wp:extent cx="566928" cy="708660"/>
                   <wp:docPr id="54" name="Picture 54"/>
                   <wp:cNvGraphicFramePr>
                     <a:graphicFrameLocks noChangeAspect="1"/>
@@ -10527,7 +10527,7 @@
                         <pic:spPr>
                           <a:xfrm>
                             <a:off x="0" y="0"/>
-                            <a:ext cx="566928" cy="716120"/>
+                            <a:ext cx="566928" cy="708660"/>
                           </a:xfrm>
                           <a:prstGeom prst="rect"/>
                         </pic:spPr>
@@ -10678,7 +10678,7 @@
             <w:r>
               <w:drawing>
                 <wp:inline xmlns:a="http://schemas.openxmlformats.org/drawingml/2006/main" xmlns:pic="http://schemas.openxmlformats.org/drawingml/2006/picture">
-                  <wp:extent cx="566928" cy="716120"/>
+                  <wp:extent cx="566928" cy="708660"/>
                   <wp:docPr id="55" name="Picture 55"/>
                   <wp:cNvGraphicFramePr>
                     <a:graphicFrameLocks noChangeAspect="1"/>
@@ -10699,7 +10699,7 @@
                         <pic:spPr>
                           <a:xfrm>
                             <a:off x="0" y="0"/>
-                            <a:ext cx="566928" cy="716120"/>
+                            <a:ext cx="566928" cy="708660"/>
                           </a:xfrm>
                           <a:prstGeom prst="rect"/>
                         </pic:spPr>
@@ -11282,7 +11282,7 @@
             <w:r>
               <w:drawing>
                 <wp:inline xmlns:a="http://schemas.openxmlformats.org/drawingml/2006/main" xmlns:pic="http://schemas.openxmlformats.org/drawingml/2006/picture">
-                  <wp:extent cx="566928" cy="709551"/>
+                  <wp:extent cx="566928" cy="705986"/>
                   <wp:docPr id="58" name="Picture 58"/>
                   <wp:cNvGraphicFramePr>
                     <a:graphicFrameLocks noChangeAspect="1"/>
@@ -11303,7 +11303,7 @@
                         <pic:spPr>
                           <a:xfrm>
                             <a:off x="0" y="0"/>
-                            <a:ext cx="566928" cy="709551"/>
+                            <a:ext cx="566928" cy="705986"/>
                           </a:xfrm>
                           <a:prstGeom prst="rect"/>
                         </pic:spPr>
@@ -11449,7 +11449,7 @@
             <w:r>
               <w:drawing>
                 <wp:inline xmlns:a="http://schemas.openxmlformats.org/drawingml/2006/main" xmlns:pic="http://schemas.openxmlformats.org/drawingml/2006/picture">
-                  <wp:extent cx="566928" cy="716120"/>
+                  <wp:extent cx="566928" cy="708660"/>
                   <wp:docPr id="59" name="Picture 59"/>
                   <wp:cNvGraphicFramePr>
                     <a:graphicFrameLocks noChangeAspect="1"/>
@@ -11470,7 +11470,7 @@
                         <pic:spPr>
                           <a:xfrm>
                             <a:off x="0" y="0"/>
-                            <a:ext cx="566928" cy="716120"/>
+                            <a:ext cx="566928" cy="708660"/>
                           </a:xfrm>
                           <a:prstGeom prst="rect"/>
                         </pic:spPr>
@@ -11898,7 +11898,7 @@
             <w:r>
               <w:drawing>
                 <wp:inline xmlns:a="http://schemas.openxmlformats.org/drawingml/2006/main" xmlns:pic="http://schemas.openxmlformats.org/drawingml/2006/picture">
-                  <wp:extent cx="566928" cy="716120"/>
+                  <wp:extent cx="566928" cy="708660"/>
                   <wp:docPr id="61" name="Picture 61"/>
                   <wp:cNvGraphicFramePr>
                     <a:graphicFrameLocks noChangeAspect="1"/>
@@ -11919,7 +11919,7 @@
                         <pic:spPr>
                           <a:xfrm>
                             <a:off x="0" y="0"/>
-                            <a:ext cx="566928" cy="716120"/>
+                            <a:ext cx="566928" cy="708660"/>
                           </a:xfrm>
                           <a:prstGeom prst="rect"/>
                         </pic:spPr>
@@ -12038,7 +12038,7 @@
             <w:r>
               <w:drawing>
                 <wp:inline xmlns:a="http://schemas.openxmlformats.org/drawingml/2006/main" xmlns:pic="http://schemas.openxmlformats.org/drawingml/2006/picture">
-                  <wp:extent cx="566928" cy="716120"/>
+                  <wp:extent cx="566928" cy="708660"/>
                   <wp:docPr id="62" name="Picture 62"/>
                   <wp:cNvGraphicFramePr>
                     <a:graphicFrameLocks noChangeAspect="1"/>
@@ -12059,7 +12059,7 @@
                         <pic:spPr>
                           <a:xfrm>
                             <a:off x="0" y="0"/>
-                            <a:ext cx="566928" cy="716120"/>
+                            <a:ext cx="566928" cy="708660"/>
                           </a:xfrm>
                           <a:prstGeom prst="rect"/>
                         </pic:spPr>
@@ -12195,7 +12195,7 @@
             <w:r>
               <w:drawing>
                 <wp:inline xmlns:a="http://schemas.openxmlformats.org/drawingml/2006/main" xmlns:pic="http://schemas.openxmlformats.org/drawingml/2006/picture">
-                  <wp:extent cx="566928" cy="704830"/>
+                  <wp:extent cx="566928" cy="714485"/>
                   <wp:docPr id="63" name="Picture 63"/>
                   <wp:cNvGraphicFramePr>
                     <a:graphicFrameLocks noChangeAspect="1"/>
@@ -12216,7 +12216,7 @@
                         <pic:spPr>
                           <a:xfrm>
                             <a:off x="0" y="0"/>
-                            <a:ext cx="566928" cy="704830"/>
+                            <a:ext cx="566928" cy="714485"/>
                           </a:xfrm>
                           <a:prstGeom prst="rect"/>
                         </pic:spPr>
@@ -12801,7 +12801,7 @@
             <w:r>
               <w:drawing>
                 <wp:inline xmlns:a="http://schemas.openxmlformats.org/drawingml/2006/main" xmlns:pic="http://schemas.openxmlformats.org/drawingml/2006/picture">
-                  <wp:extent cx="566928" cy="716120"/>
+                  <wp:extent cx="566928" cy="708660"/>
                   <wp:docPr id="66" name="Picture 66"/>
                   <wp:cNvGraphicFramePr>
                     <a:graphicFrameLocks noChangeAspect="1"/>
@@ -12822,7 +12822,7 @@
                         <pic:spPr>
                           <a:xfrm>
                             <a:off x="0" y="0"/>
-                            <a:ext cx="566928" cy="716120"/>
+                            <a:ext cx="566928" cy="708660"/>
                           </a:xfrm>
                           <a:prstGeom prst="rect"/>
                         </pic:spPr>
@@ -13988,7 +13988,7 @@
             <w:r>
               <w:drawing>
                 <wp:inline xmlns:a="http://schemas.openxmlformats.org/drawingml/2006/main" xmlns:pic="http://schemas.openxmlformats.org/drawingml/2006/picture">
-                  <wp:extent cx="566928" cy="716120"/>
+                  <wp:extent cx="566928" cy="708660"/>
                   <wp:docPr id="72" name="Picture 72"/>
                   <wp:cNvGraphicFramePr>
                     <a:graphicFrameLocks noChangeAspect="1"/>
@@ -14009,7 +14009,7 @@
                         <pic:spPr>
                           <a:xfrm>
                             <a:off x="0" y="0"/>
-                            <a:ext cx="566928" cy="716120"/>
+                            <a:ext cx="566928" cy="708660"/>
                           </a:xfrm>
                           <a:prstGeom prst="rect"/>
                         </pic:spPr>
@@ -14128,7 +14128,7 @@
             <w:r>
               <w:drawing>
                 <wp:inline xmlns:a="http://schemas.openxmlformats.org/drawingml/2006/main" xmlns:pic="http://schemas.openxmlformats.org/drawingml/2006/picture">
-                  <wp:extent cx="566928" cy="716120"/>
+                  <wp:extent cx="566928" cy="708660"/>
                   <wp:docPr id="73" name="Picture 73"/>
                   <wp:cNvGraphicFramePr>
                     <a:graphicFrameLocks noChangeAspect="1"/>
@@ -14149,7 +14149,7 @@
                         <pic:spPr>
                           <a:xfrm>
                             <a:off x="0" y="0"/>
-                            <a:ext cx="566928" cy="716120"/>
+                            <a:ext cx="566928" cy="708660"/>
                           </a:xfrm>
                           <a:prstGeom prst="rect"/>
                         </pic:spPr>
@@ -14300,7 +14300,7 @@
             <w:r>
               <w:drawing>
                 <wp:inline xmlns:a="http://schemas.openxmlformats.org/drawingml/2006/main" xmlns:pic="http://schemas.openxmlformats.org/drawingml/2006/picture">
-                  <wp:extent cx="566928" cy="704830"/>
+                  <wp:extent cx="566928" cy="714485"/>
                   <wp:docPr id="74" name="Picture 74"/>
                   <wp:cNvGraphicFramePr>
                     <a:graphicFrameLocks noChangeAspect="1"/>
@@ -14321,7 +14321,7 @@
                         <pic:spPr>
                           <a:xfrm>
                             <a:off x="0" y="0"/>
-                            <a:ext cx="566928" cy="704830"/>
+                            <a:ext cx="566928" cy="714485"/>
                           </a:xfrm>
                           <a:prstGeom prst="rect"/>
                         </pic:spPr>
@@ -14440,7 +14440,7 @@
             <w:r>
               <w:drawing>
                 <wp:inline xmlns:a="http://schemas.openxmlformats.org/drawingml/2006/main" xmlns:pic="http://schemas.openxmlformats.org/drawingml/2006/picture">
-                  <wp:extent cx="566928" cy="716120"/>
+                  <wp:extent cx="566928" cy="708660"/>
                   <wp:docPr id="75" name="Picture 75"/>
                   <wp:cNvGraphicFramePr>
                     <a:graphicFrameLocks noChangeAspect="1"/>
@@ -14461,7 +14461,7 @@
                         <pic:spPr>
                           <a:xfrm>
                             <a:off x="0" y="0"/>
-                            <a:ext cx="566928" cy="716120"/>
+                            <a:ext cx="566928" cy="708660"/>
                           </a:xfrm>
                           <a:prstGeom prst="rect"/>
                         </pic:spPr>

</xml_diff>

<commit_message>
Apply final portrait batch: 9 new officials (52/59 total)
From the third sheet (53 images, 53/53 pairing agreement, visually
verified): Canada complete (LeBlanc - real photo this time - and
Sidhu), Brazil complete (Santos, Siqueira Filho, Elias Rosa),
Australia complete (Charlton, Ayres, Farrell), Argentina (Quirno).

Held out: "Luis Caputo" - not an official on the verified roster
(Argentina's slots are Genua, Quirno, Lavigne); flagged to preparer
rather than guessed. Li Chenggang's image in this sheet is byte-
identical to the prior event candid, so no replacement was applied.

Remaining placeholders (7): Argentina (Genua, Lavigne), Saudi Arabia
(Al-Qasabi), EU (Virkkunen, Sefcovic), AU (Mataboge, Tatchouop
Belobe). 684 QA checks pass.

Co-Authored-By: Claude Fable 5 <noreply@anthropic.com>
Claude-Session: https://claude.ai/code/session_01D7VNHN8h6qLVjZi6Tzyhub
</commit_message>
<xml_diff>
--- a/output/g20-ministers-trade-list.docx
+++ b/output/g20-ministers-trade-list.docx
@@ -758,7 +758,7 @@
             <w:r>
               <w:drawing>
                 <wp:inline xmlns:a="http://schemas.openxmlformats.org/drawingml/2006/main" xmlns:pic="http://schemas.openxmlformats.org/drawingml/2006/picture">
-                  <wp:extent cx="566928" cy="708660"/>
+                  <wp:extent cx="566928" cy="709551"/>
                   <wp:docPr id="3" name="Picture 3"/>
                   <wp:cNvGraphicFramePr>
                     <a:graphicFrameLocks noChangeAspect="1"/>
@@ -767,7 +767,7 @@
                     <a:graphicData uri="http://schemas.openxmlformats.org/drawingml/2006/picture">
                       <pic:pic>
                         <pic:nvPicPr>
-                          <pic:cNvPr id="0" name="_ph-argentina-quirno.png"/>
+                          <pic:cNvPr id="0" name="argentina-quirno.png"/>
                           <pic:cNvPicPr/>
                         </pic:nvPicPr>
                         <pic:blipFill>
@@ -779,7 +779,7 @@
                         <pic:spPr>
                           <a:xfrm>
                             <a:off x="0" y="0"/>
-                            <a:ext cx="566928" cy="708660"/>
+                            <a:ext cx="566928" cy="709551"/>
                           </a:xfrm>
                           <a:prstGeom prst="rect"/>
                         </pic:spPr>
@@ -1544,7 +1544,7 @@
             <w:r>
               <w:drawing>
                 <wp:inline xmlns:a="http://schemas.openxmlformats.org/drawingml/2006/main" xmlns:pic="http://schemas.openxmlformats.org/drawingml/2006/picture">
-                  <wp:extent cx="566928" cy="708660"/>
+                  <wp:extent cx="566928" cy="706480"/>
                   <wp:docPr id="7" name="Picture 7"/>
                   <wp:cNvGraphicFramePr>
                     <a:graphicFrameLocks noChangeAspect="1"/>
@@ -1553,7 +1553,7 @@
                     <a:graphicData uri="http://schemas.openxmlformats.org/drawingml/2006/picture">
                       <pic:pic>
                         <pic:nvPicPr>
-                          <pic:cNvPr id="0" name="_ph-australia-farrell.png"/>
+                          <pic:cNvPr id="0" name="australia-farrell.png"/>
                           <pic:cNvPicPr/>
                         </pic:nvPicPr>
                         <pic:blipFill>
@@ -1565,7 +1565,7 @@
                         <pic:spPr>
                           <a:xfrm>
                             <a:off x="0" y="0"/>
-                            <a:ext cx="566928" cy="708660"/>
+                            <a:ext cx="566928" cy="706480"/>
                           </a:xfrm>
                           <a:prstGeom prst="rect"/>
                         </pic:spPr>
@@ -1716,7 +1716,7 @@
             <w:r>
               <w:drawing>
                 <wp:inline xmlns:a="http://schemas.openxmlformats.org/drawingml/2006/main" xmlns:pic="http://schemas.openxmlformats.org/drawingml/2006/picture">
-                  <wp:extent cx="566928" cy="708660"/>
+                  <wp:extent cx="566928" cy="707594"/>
                   <wp:docPr id="8" name="Picture 8"/>
                   <wp:cNvGraphicFramePr>
                     <a:graphicFrameLocks noChangeAspect="1"/>
@@ -1725,7 +1725,7 @@
                     <a:graphicData uri="http://schemas.openxmlformats.org/drawingml/2006/picture">
                       <pic:pic>
                         <pic:nvPicPr>
-                          <pic:cNvPr id="0" name="_ph-australia-charlton.png"/>
+                          <pic:cNvPr id="0" name="australia-charlton.png"/>
                           <pic:cNvPicPr/>
                         </pic:nvPicPr>
                         <pic:blipFill>
@@ -1737,7 +1737,7 @@
                         <pic:spPr>
                           <a:xfrm>
                             <a:off x="0" y="0"/>
-                            <a:ext cx="566928" cy="708660"/>
+                            <a:ext cx="566928" cy="707594"/>
                           </a:xfrm>
                           <a:prstGeom prst="rect"/>
                         </pic:spPr>
@@ -1856,7 +1856,7 @@
             <w:r>
               <w:drawing>
                 <wp:inline xmlns:a="http://schemas.openxmlformats.org/drawingml/2006/main" xmlns:pic="http://schemas.openxmlformats.org/drawingml/2006/picture">
-                  <wp:extent cx="566928" cy="708660"/>
+                  <wp:extent cx="566928" cy="709551"/>
                   <wp:docPr id="9" name="Picture 9"/>
                   <wp:cNvGraphicFramePr>
                     <a:graphicFrameLocks noChangeAspect="1"/>
@@ -1865,7 +1865,7 @@
                     <a:graphicData uri="http://schemas.openxmlformats.org/drawingml/2006/picture">
                       <pic:pic>
                         <pic:nvPicPr>
-                          <pic:cNvPr id="0" name="_ph-australia-ayres.png"/>
+                          <pic:cNvPr id="0" name="australia-ayres.png"/>
                           <pic:cNvPicPr/>
                         </pic:nvPicPr>
                         <pic:blipFill>
@@ -1877,7 +1877,7 @@
                         <pic:spPr>
                           <a:xfrm>
                             <a:off x="0" y="0"/>
-                            <a:ext cx="566928" cy="708660"/>
+                            <a:ext cx="566928" cy="709551"/>
                           </a:xfrm>
                           <a:prstGeom prst="rect"/>
                         </pic:spPr>
@@ -2320,7 +2320,7 @@
             <w:r>
               <w:drawing>
                 <wp:inline xmlns:a="http://schemas.openxmlformats.org/drawingml/2006/main" xmlns:pic="http://schemas.openxmlformats.org/drawingml/2006/picture">
-                  <wp:extent cx="566928" cy="708660"/>
+                  <wp:extent cx="566928" cy="709551"/>
                   <wp:docPr id="11" name="Picture 11"/>
                   <wp:cNvGraphicFramePr>
                     <a:graphicFrameLocks noChangeAspect="1"/>
@@ -2329,7 +2329,7 @@
                     <a:graphicData uri="http://schemas.openxmlformats.org/drawingml/2006/picture">
                       <pic:pic>
                         <pic:nvPicPr>
-                          <pic:cNvPr id="0" name="_ph-brazil-rosa.png"/>
+                          <pic:cNvPr id="0" name="brazil-rosa.png"/>
                           <pic:cNvPicPr/>
                         </pic:nvPicPr>
                         <pic:blipFill>
@@ -2341,7 +2341,7 @@
                         <pic:spPr>
                           <a:xfrm>
                             <a:off x="0" y="0"/>
-                            <a:ext cx="566928" cy="708660"/>
+                            <a:ext cx="566928" cy="709551"/>
                           </a:xfrm>
                           <a:prstGeom prst="rect"/>
                         </pic:spPr>
@@ -2477,7 +2477,7 @@
             <w:r>
               <w:drawing>
                 <wp:inline xmlns:a="http://schemas.openxmlformats.org/drawingml/2006/main" xmlns:pic="http://schemas.openxmlformats.org/drawingml/2006/picture">
-                  <wp:extent cx="566928" cy="708660"/>
+                  <wp:extent cx="566928" cy="706819"/>
                   <wp:docPr id="12" name="Picture 12"/>
                   <wp:cNvGraphicFramePr>
                     <a:graphicFrameLocks noChangeAspect="1"/>
@@ -2486,7 +2486,7 @@
                     <a:graphicData uri="http://schemas.openxmlformats.org/drawingml/2006/picture">
                       <pic:pic>
                         <pic:nvPicPr>
-                          <pic:cNvPr id="0" name="_ph-brazil-siqueira.png"/>
+                          <pic:cNvPr id="0" name="brazil-siqueira.png"/>
                           <pic:cNvPicPr/>
                         </pic:nvPicPr>
                         <pic:blipFill>
@@ -2498,7 +2498,7 @@
                         <pic:spPr>
                           <a:xfrm>
                             <a:off x="0" y="0"/>
-                            <a:ext cx="566928" cy="708660"/>
+                            <a:ext cx="566928" cy="706819"/>
                           </a:xfrm>
                           <a:prstGeom prst="rect"/>
                         </pic:spPr>
@@ -2617,7 +2617,7 @@
             <w:r>
               <w:drawing>
                 <wp:inline xmlns:a="http://schemas.openxmlformats.org/drawingml/2006/main" xmlns:pic="http://schemas.openxmlformats.org/drawingml/2006/picture">
-                  <wp:extent cx="566928" cy="708660"/>
+                  <wp:extent cx="566928" cy="711676"/>
                   <wp:docPr id="13" name="Picture 13"/>
                   <wp:cNvGraphicFramePr>
                     <a:graphicFrameLocks noChangeAspect="1"/>
@@ -2626,7 +2626,7 @@
                     <a:graphicData uri="http://schemas.openxmlformats.org/drawingml/2006/picture">
                       <pic:pic>
                         <pic:nvPicPr>
-                          <pic:cNvPr id="0" name="_ph-brazil-santos.png"/>
+                          <pic:cNvPr id="0" name="brazil-santos.png"/>
                           <pic:cNvPicPr/>
                         </pic:nvPicPr>
                         <pic:blipFill>
@@ -2638,7 +2638,7 @@
                         <pic:spPr>
                           <a:xfrm>
                             <a:off x="0" y="0"/>
-                            <a:ext cx="566928" cy="708660"/>
+                            <a:ext cx="566928" cy="711676"/>
                           </a:xfrm>
                           <a:prstGeom prst="rect"/>
                         </pic:spPr>
@@ -3075,7 +3075,7 @@
                     <a:graphicData uri="http://schemas.openxmlformats.org/drawingml/2006/picture">
                       <pic:pic>
                         <pic:nvPicPr>
-                          <pic:cNvPr id="0" name="_ph-canada-sidhu.png"/>
+                          <pic:cNvPr id="0" name="canada-sidhu.png"/>
                           <pic:cNvPicPr/>
                         </pic:nvPicPr>
                         <pic:blipFill>
@@ -3206,7 +3206,7 @@
             <w:r>
               <w:drawing>
                 <wp:inline xmlns:a="http://schemas.openxmlformats.org/drawingml/2006/main" xmlns:pic="http://schemas.openxmlformats.org/drawingml/2006/picture">
-                  <wp:extent cx="566928" cy="708660"/>
+                  <wp:extent cx="566928" cy="707594"/>
                   <wp:docPr id="16" name="Picture 16"/>
                   <wp:cNvGraphicFramePr>
                     <a:graphicFrameLocks noChangeAspect="1"/>
@@ -3215,11 +3215,11 @@
                     <a:graphicData uri="http://schemas.openxmlformats.org/drawingml/2006/picture">
                       <pic:pic>
                         <pic:nvPicPr>
-                          <pic:cNvPr id="0" name="_ph-argentina-genua.png"/>
+                          <pic:cNvPr id="0" name="canada-leblanc.png"/>
                           <pic:cNvPicPr/>
                         </pic:nvPicPr>
                         <pic:blipFill>
-                          <a:blip r:embed="rId13"/>
+                          <a:blip r:embed="rId24"/>
                           <a:stretch>
                             <a:fillRect/>
                           </a:stretch>
@@ -3227,7 +3227,7 @@
                         <pic:spPr>
                           <a:xfrm>
                             <a:off x="0" y="0"/>
-                            <a:ext cx="566928" cy="708660"/>
+                            <a:ext cx="566928" cy="707594"/>
                           </a:xfrm>
                           <a:prstGeom prst="rect"/>
                         </pic:spPr>
@@ -3363,7 +3363,7 @@
             <w:r>
               <w:drawing>
                 <wp:inline xmlns:a="http://schemas.openxmlformats.org/drawingml/2006/main" xmlns:pic="http://schemas.openxmlformats.org/drawingml/2006/picture">
-                  <wp:extent cx="566928" cy="707594"/>
+                  <wp:extent cx="566928" cy="712955"/>
                   <wp:docPr id="17" name="Picture 17"/>
                   <wp:cNvGraphicFramePr>
                     <a:graphicFrameLocks noChangeAspect="1"/>
@@ -3376,7 +3376,7 @@
                           <pic:cNvPicPr/>
                         </pic:nvPicPr>
                         <pic:blipFill>
-                          <a:blip r:embed="rId24"/>
+                          <a:blip r:embed="rId25"/>
                           <a:stretch>
                             <a:fillRect/>
                           </a:stretch>
@@ -3384,7 +3384,7 @@
                         <pic:spPr>
                           <a:xfrm>
                             <a:off x="0" y="0"/>
-                            <a:ext cx="566928" cy="707594"/>
+                            <a:ext cx="566928" cy="712955"/>
                           </a:xfrm>
                           <a:prstGeom prst="rect"/>
                         </pic:spPr>
@@ -3498,7 +3498,7 @@
                     <pic:cNvPicPr/>
                   </pic:nvPicPr>
                   <pic:blipFill>
-                    <a:blip r:embed="rId25"/>
+                    <a:blip r:embed="rId26"/>
                     <a:stretch>
                       <a:fillRect/>
                     </a:stretch>
@@ -3812,7 +3812,7 @@
             <w:r>
               <w:drawing>
                 <wp:inline xmlns:a="http://schemas.openxmlformats.org/drawingml/2006/main" xmlns:pic="http://schemas.openxmlformats.org/drawingml/2006/picture">
-                  <wp:extent cx="566928" cy="705986"/>
+                  <wp:extent cx="566928" cy="710454"/>
                   <wp:docPr id="19" name="Picture 19"/>
                   <wp:cNvGraphicFramePr>
                     <a:graphicFrameLocks noChangeAspect="1"/>
@@ -3825,7 +3825,7 @@
                           <pic:cNvPicPr/>
                         </pic:nvPicPr>
                         <pic:blipFill>
-                          <a:blip r:embed="rId26"/>
+                          <a:blip r:embed="rId27"/>
                           <a:stretch>
                             <a:fillRect/>
                           </a:stretch>
@@ -3833,7 +3833,7 @@
                         <pic:spPr>
                           <a:xfrm>
                             <a:off x="0" y="0"/>
-                            <a:ext cx="566928" cy="705986"/>
+                            <a:ext cx="566928" cy="710454"/>
                           </a:xfrm>
                           <a:prstGeom prst="rect"/>
                         </pic:spPr>
@@ -3952,7 +3952,7 @@
             <w:r>
               <w:drawing>
                 <wp:inline xmlns:a="http://schemas.openxmlformats.org/drawingml/2006/main" xmlns:pic="http://schemas.openxmlformats.org/drawingml/2006/picture">
-                  <wp:extent cx="566928" cy="709551"/>
+                  <wp:extent cx="566928" cy="705986"/>
                   <wp:docPr id="20" name="Picture 20"/>
                   <wp:cNvGraphicFramePr>
                     <a:graphicFrameLocks noChangeAspect="1"/>
@@ -3965,7 +3965,7 @@
                           <pic:cNvPicPr/>
                         </pic:nvPicPr>
                         <pic:blipFill>
-                          <a:blip r:embed="rId27"/>
+                          <a:blip r:embed="rId28"/>
                           <a:stretch>
                             <a:fillRect/>
                           </a:stretch>
@@ -3973,7 +3973,7 @@
                         <pic:spPr>
                           <a:xfrm>
                             <a:off x="0" y="0"/>
-                            <a:ext cx="566928" cy="709551"/>
+                            <a:ext cx="566928" cy="705986"/>
                           </a:xfrm>
                           <a:prstGeom prst="rect"/>
                         </pic:spPr>
@@ -4124,7 +4124,7 @@
             <w:r>
               <w:drawing>
                 <wp:inline xmlns:a="http://schemas.openxmlformats.org/drawingml/2006/main" xmlns:pic="http://schemas.openxmlformats.org/drawingml/2006/picture">
-                  <wp:extent cx="566928" cy="707709"/>
+                  <wp:extent cx="566928" cy="712491"/>
                   <wp:docPr id="21" name="Picture 21"/>
                   <wp:cNvGraphicFramePr>
                     <a:graphicFrameLocks noChangeAspect="1"/>
@@ -4137,7 +4137,7 @@
                           <pic:cNvPicPr/>
                         </pic:nvPicPr>
                         <pic:blipFill>
-                          <a:blip r:embed="rId28"/>
+                          <a:blip r:embed="rId29"/>
                           <a:stretch>
                             <a:fillRect/>
                           </a:stretch>
@@ -4145,7 +4145,7 @@
                         <pic:spPr>
                           <a:xfrm>
                             <a:off x="0" y="0"/>
-                            <a:ext cx="566928" cy="707709"/>
+                            <a:ext cx="566928" cy="712491"/>
                           </a:xfrm>
                           <a:prstGeom prst="rect"/>
                         </pic:spPr>
@@ -4264,7 +4264,7 @@
             <w:r>
               <w:drawing>
                 <wp:inline xmlns:a="http://schemas.openxmlformats.org/drawingml/2006/main" xmlns:pic="http://schemas.openxmlformats.org/drawingml/2006/picture">
-                  <wp:extent cx="566928" cy="705768"/>
+                  <wp:extent cx="566928" cy="710602"/>
                   <wp:docPr id="22" name="Picture 22"/>
                   <wp:cNvGraphicFramePr>
                     <a:graphicFrameLocks noChangeAspect="1"/>
@@ -4277,7 +4277,7 @@
                           <pic:cNvPicPr/>
                         </pic:nvPicPr>
                         <pic:blipFill>
-                          <a:blip r:embed="rId29"/>
+                          <a:blip r:embed="rId30"/>
                           <a:stretch>
                             <a:fillRect/>
                           </a:stretch>
@@ -4285,7 +4285,7 @@
                         <pic:spPr>
                           <a:xfrm>
                             <a:off x="0" y="0"/>
-                            <a:ext cx="566928" cy="705768"/>
+                            <a:ext cx="566928" cy="710602"/>
                           </a:xfrm>
                           <a:prstGeom prst="rect"/>
                         </pic:spPr>
@@ -4414,7 +4414,7 @@
                     <pic:cNvPicPr/>
                   </pic:nvPicPr>
                   <pic:blipFill>
-                    <a:blip r:embed="rId30"/>
+                    <a:blip r:embed="rId31"/>
                     <a:stretch>
                       <a:fillRect/>
                     </a:stretch>
@@ -4728,7 +4728,7 @@
             <w:r>
               <w:drawing>
                 <wp:inline xmlns:a="http://schemas.openxmlformats.org/drawingml/2006/main" xmlns:pic="http://schemas.openxmlformats.org/drawingml/2006/picture">
-                  <wp:extent cx="566928" cy="707709"/>
+                  <wp:extent cx="566928" cy="712491"/>
                   <wp:docPr id="24" name="Picture 24"/>
                   <wp:cNvGraphicFramePr>
                     <a:graphicFrameLocks noChangeAspect="1"/>
@@ -4741,7 +4741,7 @@
                           <pic:cNvPicPr/>
                         </pic:nvPicPr>
                         <pic:blipFill>
-                          <a:blip r:embed="rId31"/>
+                          <a:blip r:embed="rId32"/>
                           <a:stretch>
                             <a:fillRect/>
                           </a:stretch>
@@ -4749,7 +4749,7 @@
                         <pic:spPr>
                           <a:xfrm>
                             <a:off x="0" y="0"/>
-                            <a:ext cx="566928" cy="707709"/>
+                            <a:ext cx="566928" cy="712491"/>
                           </a:xfrm>
                           <a:prstGeom prst="rect"/>
                         </pic:spPr>
@@ -4885,7 +4885,7 @@
             <w:r>
               <w:drawing>
                 <wp:inline xmlns:a="http://schemas.openxmlformats.org/drawingml/2006/main" xmlns:pic="http://schemas.openxmlformats.org/drawingml/2006/picture">
-                  <wp:extent cx="566928" cy="709551"/>
+                  <wp:extent cx="566928" cy="705986"/>
                   <wp:docPr id="25" name="Picture 25"/>
                   <wp:cNvGraphicFramePr>
                     <a:graphicFrameLocks noChangeAspect="1"/>
@@ -4898,7 +4898,7 @@
                           <pic:cNvPicPr/>
                         </pic:nvPicPr>
                         <pic:blipFill>
-                          <a:blip r:embed="rId32"/>
+                          <a:blip r:embed="rId33"/>
                           <a:stretch>
                             <a:fillRect/>
                           </a:stretch>
@@ -4906,7 +4906,7 @@
                         <pic:spPr>
                           <a:xfrm>
                             <a:off x="0" y="0"/>
-                            <a:ext cx="566928" cy="709551"/>
+                            <a:ext cx="566928" cy="705986"/>
                           </a:xfrm>
                           <a:prstGeom prst="rect"/>
                         </pic:spPr>
@@ -5020,7 +5020,7 @@
                     <pic:cNvPicPr/>
                   </pic:nvPicPr>
                   <pic:blipFill>
-                    <a:blip r:embed="rId33"/>
+                    <a:blip r:embed="rId34"/>
                     <a:stretch>
                       <a:fillRect/>
                     </a:stretch>
@@ -5334,7 +5334,7 @@
             <w:r>
               <w:drawing>
                 <wp:inline xmlns:a="http://schemas.openxmlformats.org/drawingml/2006/main" xmlns:pic="http://schemas.openxmlformats.org/drawingml/2006/picture">
-                  <wp:extent cx="566928" cy="709551"/>
+                  <wp:extent cx="566928" cy="705986"/>
                   <wp:docPr id="27" name="Picture 27"/>
                   <wp:cNvGraphicFramePr>
                     <a:graphicFrameLocks noChangeAspect="1"/>
@@ -5347,7 +5347,7 @@
                           <pic:cNvPicPr/>
                         </pic:nvPicPr>
                         <pic:blipFill>
-                          <a:blip r:embed="rId34"/>
+                          <a:blip r:embed="rId35"/>
                           <a:stretch>
                             <a:fillRect/>
                           </a:stretch>
@@ -5355,7 +5355,7 @@
                         <pic:spPr>
                           <a:xfrm>
                             <a:off x="0" y="0"/>
-                            <a:ext cx="566928" cy="709551"/>
+                            <a:ext cx="566928" cy="705986"/>
                           </a:xfrm>
                           <a:prstGeom prst="rect"/>
                         </pic:spPr>
@@ -5506,7 +5506,7 @@
             <w:r>
               <w:drawing>
                 <wp:inline xmlns:a="http://schemas.openxmlformats.org/drawingml/2006/main" xmlns:pic="http://schemas.openxmlformats.org/drawingml/2006/picture">
-                  <wp:extent cx="566928" cy="709551"/>
+                  <wp:extent cx="566928" cy="705986"/>
                   <wp:docPr id="28" name="Picture 28"/>
                   <wp:cNvGraphicFramePr>
                     <a:graphicFrameLocks noChangeAspect="1"/>
@@ -5519,7 +5519,7 @@
                           <pic:cNvPicPr/>
                         </pic:nvPicPr>
                         <pic:blipFill>
-                          <a:blip r:embed="rId35"/>
+                          <a:blip r:embed="rId36"/>
                           <a:stretch>
                             <a:fillRect/>
                           </a:stretch>
@@ -5527,7 +5527,7 @@
                         <pic:spPr>
                           <a:xfrm>
                             <a:off x="0" y="0"/>
-                            <a:ext cx="566928" cy="709551"/>
+                            <a:ext cx="566928" cy="705986"/>
                           </a:xfrm>
                           <a:prstGeom prst="rect"/>
                         </pic:spPr>
@@ -5641,7 +5641,7 @@
                     <pic:cNvPicPr/>
                   </pic:nvPicPr>
                   <pic:blipFill>
-                    <a:blip r:embed="rId36"/>
+                    <a:blip r:embed="rId37"/>
                     <a:stretch>
                       <a:fillRect/>
                     </a:stretch>
@@ -5955,7 +5955,7 @@
             <w:r>
               <w:drawing>
                 <wp:inline xmlns:a="http://schemas.openxmlformats.org/drawingml/2006/main" xmlns:pic="http://schemas.openxmlformats.org/drawingml/2006/picture">
-                  <wp:extent cx="566928" cy="711495"/>
+                  <wp:extent cx="566928" cy="708660"/>
                   <wp:docPr id="30" name="Picture 30"/>
                   <wp:cNvGraphicFramePr>
                     <a:graphicFrameLocks noChangeAspect="1"/>
@@ -5968,7 +5968,7 @@
                           <pic:cNvPicPr/>
                         </pic:nvPicPr>
                         <pic:blipFill>
-                          <a:blip r:embed="rId37"/>
+                          <a:blip r:embed="rId38"/>
                           <a:stretch>
                             <a:fillRect/>
                           </a:stretch>
@@ -5976,7 +5976,7 @@
                         <pic:spPr>
                           <a:xfrm>
                             <a:off x="0" y="0"/>
-                            <a:ext cx="566928" cy="711495"/>
+                            <a:ext cx="566928" cy="708660"/>
                           </a:xfrm>
                           <a:prstGeom prst="rect"/>
                         </pic:spPr>
@@ -6095,7 +6095,7 @@
             <w:r>
               <w:drawing>
                 <wp:inline xmlns:a="http://schemas.openxmlformats.org/drawingml/2006/main" xmlns:pic="http://schemas.openxmlformats.org/drawingml/2006/picture">
-                  <wp:extent cx="566928" cy="709551"/>
+                  <wp:extent cx="566928" cy="705986"/>
                   <wp:docPr id="31" name="Picture 31"/>
                   <wp:cNvGraphicFramePr>
                     <a:graphicFrameLocks noChangeAspect="1"/>
@@ -6108,7 +6108,7 @@
                           <pic:cNvPicPr/>
                         </pic:nvPicPr>
                         <pic:blipFill>
-                          <a:blip r:embed="rId38"/>
+                          <a:blip r:embed="rId39"/>
                           <a:stretch>
                             <a:fillRect/>
                           </a:stretch>
@@ -6116,7 +6116,7 @@
                         <pic:spPr>
                           <a:xfrm>
                             <a:off x="0" y="0"/>
-                            <a:ext cx="566928" cy="709551"/>
+                            <a:ext cx="566928" cy="705986"/>
                           </a:xfrm>
                           <a:prstGeom prst="rect"/>
                         </pic:spPr>
@@ -6280,7 +6280,7 @@
                           <pic:cNvPicPr/>
                         </pic:nvPicPr>
                         <pic:blipFill>
-                          <a:blip r:embed="rId39"/>
+                          <a:blip r:embed="rId40"/>
                           <a:stretch>
                             <a:fillRect/>
                           </a:stretch>
@@ -6417,7 +6417,7 @@
                     <pic:cNvPicPr/>
                   </pic:nvPicPr>
                   <pic:blipFill>
-                    <a:blip r:embed="rId40"/>
+                    <a:blip r:embed="rId41"/>
                     <a:stretch>
                       <a:fillRect/>
                     </a:stretch>
@@ -6731,7 +6731,7 @@
             <w:r>
               <w:drawing>
                 <wp:inline xmlns:a="http://schemas.openxmlformats.org/drawingml/2006/main" xmlns:pic="http://schemas.openxmlformats.org/drawingml/2006/picture">
-                  <wp:extent cx="566928" cy="705986"/>
+                  <wp:extent cx="566928" cy="710454"/>
                   <wp:docPr id="34" name="Picture 34"/>
                   <wp:cNvGraphicFramePr>
                     <a:graphicFrameLocks noChangeAspect="1"/>
@@ -6744,7 +6744,7 @@
                           <pic:cNvPicPr/>
                         </pic:nvPicPr>
                         <pic:blipFill>
-                          <a:blip r:embed="rId41"/>
+                          <a:blip r:embed="rId42"/>
                           <a:stretch>
                             <a:fillRect/>
                           </a:stretch>
@@ -6752,7 +6752,7 @@
                         <pic:spPr>
                           <a:xfrm>
                             <a:off x="0" y="0"/>
-                            <a:ext cx="566928" cy="705986"/>
+                            <a:ext cx="566928" cy="710454"/>
                           </a:xfrm>
                           <a:prstGeom prst="rect"/>
                         </pic:spPr>
@@ -6871,7 +6871,7 @@
             <w:r>
               <w:drawing>
                 <wp:inline xmlns:a="http://schemas.openxmlformats.org/drawingml/2006/main" xmlns:pic="http://schemas.openxmlformats.org/drawingml/2006/picture">
-                  <wp:extent cx="566928" cy="709551"/>
+                  <wp:extent cx="566928" cy="705986"/>
                   <wp:docPr id="35" name="Picture 35"/>
                   <wp:cNvGraphicFramePr>
                     <a:graphicFrameLocks noChangeAspect="1"/>
@@ -6884,7 +6884,7 @@
                           <pic:cNvPicPr/>
                         </pic:nvPicPr>
                         <pic:blipFill>
-                          <a:blip r:embed="rId42"/>
+                          <a:blip r:embed="rId43"/>
                           <a:stretch>
                             <a:fillRect/>
                           </a:stretch>
@@ -6892,7 +6892,7 @@
                         <pic:spPr>
                           <a:xfrm>
                             <a:off x="0" y="0"/>
-                            <a:ext cx="566928" cy="709551"/>
+                            <a:ext cx="566928" cy="705986"/>
                           </a:xfrm>
                           <a:prstGeom prst="rect"/>
                         </pic:spPr>
@@ -7028,7 +7028,7 @@
             <w:r>
               <w:drawing>
                 <wp:inline xmlns:a="http://schemas.openxmlformats.org/drawingml/2006/main" xmlns:pic="http://schemas.openxmlformats.org/drawingml/2006/picture">
-                  <wp:extent cx="566928" cy="709551"/>
+                  <wp:extent cx="566928" cy="705986"/>
                   <wp:docPr id="36" name="Picture 36"/>
                   <wp:cNvGraphicFramePr>
                     <a:graphicFrameLocks noChangeAspect="1"/>
@@ -7041,7 +7041,7 @@
                           <pic:cNvPicPr/>
                         </pic:nvPicPr>
                         <pic:blipFill>
-                          <a:blip r:embed="rId43"/>
+                          <a:blip r:embed="rId44"/>
                           <a:stretch>
                             <a:fillRect/>
                           </a:stretch>
@@ -7049,7 +7049,7 @@
                         <pic:spPr>
                           <a:xfrm>
                             <a:off x="0" y="0"/>
-                            <a:ext cx="566928" cy="709551"/>
+                            <a:ext cx="566928" cy="705986"/>
                           </a:xfrm>
                           <a:prstGeom prst="rect"/>
                         </pic:spPr>
@@ -7163,7 +7163,7 @@
                     <pic:cNvPicPr/>
                   </pic:nvPicPr>
                   <pic:blipFill>
-                    <a:blip r:embed="rId44"/>
+                    <a:blip r:embed="rId45"/>
                     <a:stretch>
                       <a:fillRect/>
                     </a:stretch>
@@ -7477,7 +7477,7 @@
             <w:r>
               <w:drawing>
                 <wp:inline xmlns:a="http://schemas.openxmlformats.org/drawingml/2006/main" xmlns:pic="http://schemas.openxmlformats.org/drawingml/2006/picture">
-                  <wp:extent cx="566928" cy="709551"/>
+                  <wp:extent cx="566928" cy="705986"/>
                   <wp:docPr id="38" name="Picture 38"/>
                   <wp:cNvGraphicFramePr>
                     <a:graphicFrameLocks noChangeAspect="1"/>
@@ -7490,7 +7490,7 @@
                           <pic:cNvPicPr/>
                         </pic:nvPicPr>
                         <pic:blipFill>
-                          <a:blip r:embed="rId45"/>
+                          <a:blip r:embed="rId46"/>
                           <a:stretch>
                             <a:fillRect/>
                           </a:stretch>
@@ -7498,7 +7498,7 @@
                         <pic:spPr>
                           <a:xfrm>
                             <a:off x="0" y="0"/>
-                            <a:ext cx="566928" cy="709551"/>
+                            <a:ext cx="566928" cy="705986"/>
                           </a:xfrm>
                           <a:prstGeom prst="rect"/>
                         </pic:spPr>
@@ -7617,7 +7617,7 @@
             <w:r>
               <w:drawing>
                 <wp:inline xmlns:a="http://schemas.openxmlformats.org/drawingml/2006/main" xmlns:pic="http://schemas.openxmlformats.org/drawingml/2006/picture">
-                  <wp:extent cx="566928" cy="706819"/>
+                  <wp:extent cx="566928" cy="711439"/>
                   <wp:docPr id="39" name="Picture 39"/>
                   <wp:cNvGraphicFramePr>
                     <a:graphicFrameLocks noChangeAspect="1"/>
@@ -7630,7 +7630,7 @@
                           <pic:cNvPicPr/>
                         </pic:nvPicPr>
                         <pic:blipFill>
-                          <a:blip r:embed="rId46"/>
+                          <a:blip r:embed="rId47"/>
                           <a:stretch>
                             <a:fillRect/>
                           </a:stretch>
@@ -7638,7 +7638,7 @@
                         <pic:spPr>
                           <a:xfrm>
                             <a:off x="0" y="0"/>
-                            <a:ext cx="566928" cy="706819"/>
+                            <a:ext cx="566928" cy="711439"/>
                           </a:xfrm>
                           <a:prstGeom prst="rect"/>
                         </pic:spPr>
@@ -7774,7 +7774,7 @@
             <w:r>
               <w:drawing>
                 <wp:inline xmlns:a="http://schemas.openxmlformats.org/drawingml/2006/main" xmlns:pic="http://schemas.openxmlformats.org/drawingml/2006/picture">
-                  <wp:extent cx="566928" cy="709551"/>
+                  <wp:extent cx="566928" cy="705986"/>
                   <wp:docPr id="40" name="Picture 40"/>
                   <wp:cNvGraphicFramePr>
                     <a:graphicFrameLocks noChangeAspect="1"/>
@@ -7787,7 +7787,7 @@
                           <pic:cNvPicPr/>
                         </pic:nvPicPr>
                         <pic:blipFill>
-                          <a:blip r:embed="rId47"/>
+                          <a:blip r:embed="rId48"/>
                           <a:stretch>
                             <a:fillRect/>
                           </a:stretch>
@@ -7795,7 +7795,7 @@
                         <pic:spPr>
                           <a:xfrm>
                             <a:off x="0" y="0"/>
-                            <a:ext cx="566928" cy="709551"/>
+                            <a:ext cx="566928" cy="705986"/>
                           </a:xfrm>
                           <a:prstGeom prst="rect"/>
                         </pic:spPr>
@@ -7909,7 +7909,7 @@
                     <pic:cNvPicPr/>
                   </pic:nvPicPr>
                   <pic:blipFill>
-                    <a:blip r:embed="rId48"/>
+                    <a:blip r:embed="rId49"/>
                     <a:stretch>
                       <a:fillRect/>
                     </a:stretch>
@@ -8223,7 +8223,7 @@
             <w:r>
               <w:drawing>
                 <wp:inline xmlns:a="http://schemas.openxmlformats.org/drawingml/2006/main" xmlns:pic="http://schemas.openxmlformats.org/drawingml/2006/picture">
-                  <wp:extent cx="566928" cy="707709"/>
+                  <wp:extent cx="566928" cy="712491"/>
                   <wp:docPr id="42" name="Picture 42"/>
                   <wp:cNvGraphicFramePr>
                     <a:graphicFrameLocks noChangeAspect="1"/>
@@ -8236,7 +8236,7 @@
                           <pic:cNvPicPr/>
                         </pic:nvPicPr>
                         <pic:blipFill>
-                          <a:blip r:embed="rId49"/>
+                          <a:blip r:embed="rId50"/>
                           <a:stretch>
                             <a:fillRect/>
                           </a:stretch>
@@ -8244,7 +8244,7 @@
                         <pic:spPr>
                           <a:xfrm>
                             <a:off x="0" y="0"/>
-                            <a:ext cx="566928" cy="707709"/>
+                            <a:ext cx="566928" cy="712491"/>
                           </a:xfrm>
                           <a:prstGeom prst="rect"/>
                         </pic:spPr>
@@ -8395,7 +8395,7 @@
             <w:r>
               <w:drawing>
                 <wp:inline xmlns:a="http://schemas.openxmlformats.org/drawingml/2006/main" xmlns:pic="http://schemas.openxmlformats.org/drawingml/2006/picture">
-                  <wp:extent cx="566928" cy="706545"/>
+                  <wp:extent cx="566928" cy="711857"/>
                   <wp:docPr id="43" name="Picture 43"/>
                   <wp:cNvGraphicFramePr>
                     <a:graphicFrameLocks noChangeAspect="1"/>
@@ -8408,7 +8408,7 @@
                           <pic:cNvPicPr/>
                         </pic:nvPicPr>
                         <pic:blipFill>
-                          <a:blip r:embed="rId50"/>
+                          <a:blip r:embed="rId51"/>
                           <a:stretch>
                             <a:fillRect/>
                           </a:stretch>
@@ -8416,7 +8416,7 @@
                         <pic:spPr>
                           <a:xfrm>
                             <a:off x="0" y="0"/>
-                            <a:ext cx="566928" cy="706545"/>
+                            <a:ext cx="566928" cy="711857"/>
                           </a:xfrm>
                           <a:prstGeom prst="rect"/>
                         </pic:spPr>
@@ -8530,7 +8530,7 @@
                     <pic:cNvPicPr/>
                   </pic:nvPicPr>
                   <pic:blipFill>
-                    <a:blip r:embed="rId51"/>
+                    <a:blip r:embed="rId52"/>
                     <a:stretch>
                       <a:fillRect/>
                     </a:stretch>
@@ -8844,7 +8844,7 @@
             <w:r>
               <w:drawing>
                 <wp:inline xmlns:a="http://schemas.openxmlformats.org/drawingml/2006/main" xmlns:pic="http://schemas.openxmlformats.org/drawingml/2006/picture">
-                  <wp:extent cx="566928" cy="705986"/>
+                  <wp:extent cx="566928" cy="710454"/>
                   <wp:docPr id="45" name="Picture 45"/>
                   <wp:cNvGraphicFramePr>
                     <a:graphicFrameLocks noChangeAspect="1"/>
@@ -8857,7 +8857,7 @@
                           <pic:cNvPicPr/>
                         </pic:nvPicPr>
                         <pic:blipFill>
-                          <a:blip r:embed="rId52"/>
+                          <a:blip r:embed="rId53"/>
                           <a:stretch>
                             <a:fillRect/>
                           </a:stretch>
@@ -8865,7 +8865,7 @@
                         <pic:spPr>
                           <a:xfrm>
                             <a:off x="0" y="0"/>
-                            <a:ext cx="566928" cy="705986"/>
+                            <a:ext cx="566928" cy="710454"/>
                           </a:xfrm>
                           <a:prstGeom prst="rect"/>
                         </pic:spPr>
@@ -8984,7 +8984,7 @@
             <w:r>
               <w:drawing>
                 <wp:inline xmlns:a="http://schemas.openxmlformats.org/drawingml/2006/main" xmlns:pic="http://schemas.openxmlformats.org/drawingml/2006/picture">
-                  <wp:extent cx="566928" cy="709551"/>
+                  <wp:extent cx="566928" cy="705986"/>
                   <wp:docPr id="46" name="Picture 46"/>
                   <wp:cNvGraphicFramePr>
                     <a:graphicFrameLocks noChangeAspect="1"/>
@@ -8997,7 +8997,7 @@
                           <pic:cNvPicPr/>
                         </pic:nvPicPr>
                         <pic:blipFill>
-                          <a:blip r:embed="rId53"/>
+                          <a:blip r:embed="rId54"/>
                           <a:stretch>
                             <a:fillRect/>
                           </a:stretch>
@@ -9005,7 +9005,7 @@
                         <pic:spPr>
                           <a:xfrm>
                             <a:off x="0" y="0"/>
-                            <a:ext cx="566928" cy="709551"/>
+                            <a:ext cx="566928" cy="705986"/>
                           </a:xfrm>
                           <a:prstGeom prst="rect"/>
                         </pic:spPr>
@@ -9141,7 +9141,7 @@
             <w:r>
               <w:drawing>
                 <wp:inline xmlns:a="http://schemas.openxmlformats.org/drawingml/2006/main" xmlns:pic="http://schemas.openxmlformats.org/drawingml/2006/picture">
-                  <wp:extent cx="566928" cy="705986"/>
+                  <wp:extent cx="566928" cy="710454"/>
                   <wp:docPr id="47" name="Picture 47"/>
                   <wp:cNvGraphicFramePr>
                     <a:graphicFrameLocks noChangeAspect="1"/>
@@ -9154,7 +9154,7 @@
                           <pic:cNvPicPr/>
                         </pic:nvPicPr>
                         <pic:blipFill>
-                          <a:blip r:embed="rId54"/>
+                          <a:blip r:embed="rId55"/>
                           <a:stretch>
                             <a:fillRect/>
                           </a:stretch>
@@ -9162,7 +9162,7 @@
                         <pic:spPr>
                           <a:xfrm>
                             <a:off x="0" y="0"/>
-                            <a:ext cx="566928" cy="705986"/>
+                            <a:ext cx="566928" cy="710454"/>
                           </a:xfrm>
                           <a:prstGeom prst="rect"/>
                         </pic:spPr>
@@ -9276,7 +9276,7 @@
                     <pic:cNvPicPr/>
                   </pic:nvPicPr>
                   <pic:blipFill>
-                    <a:blip r:embed="rId55"/>
+                    <a:blip r:embed="rId56"/>
                     <a:stretch>
                       <a:fillRect/>
                     </a:stretch>
@@ -9603,7 +9603,7 @@
                           <pic:cNvPicPr/>
                         </pic:nvPicPr>
                         <pic:blipFill>
-                          <a:blip r:embed="rId56"/>
+                          <a:blip r:embed="rId57"/>
                           <a:stretch>
                             <a:fillRect/>
                           </a:stretch>
@@ -9730,7 +9730,7 @@
             <w:r>
               <w:drawing>
                 <wp:inline xmlns:a="http://schemas.openxmlformats.org/drawingml/2006/main" xmlns:pic="http://schemas.openxmlformats.org/drawingml/2006/picture">
-                  <wp:extent cx="566928" cy="705986"/>
+                  <wp:extent cx="566928" cy="710454"/>
                   <wp:docPr id="50" name="Picture 50"/>
                   <wp:cNvGraphicFramePr>
                     <a:graphicFrameLocks noChangeAspect="1"/>
@@ -9743,7 +9743,7 @@
                           <pic:cNvPicPr/>
                         </pic:nvPicPr>
                         <pic:blipFill>
-                          <a:blip r:embed="rId57"/>
+                          <a:blip r:embed="rId58"/>
                           <a:stretch>
                             <a:fillRect/>
                           </a:stretch>
@@ -9751,7 +9751,7 @@
                         <pic:spPr>
                           <a:xfrm>
                             <a:off x="0" y="0"/>
-                            <a:ext cx="566928" cy="705986"/>
+                            <a:ext cx="566928" cy="710454"/>
                           </a:xfrm>
                           <a:prstGeom prst="rect"/>
                         </pic:spPr>
@@ -9902,7 +9902,7 @@
             <w:r>
               <w:drawing>
                 <wp:inline xmlns:a="http://schemas.openxmlformats.org/drawingml/2006/main" xmlns:pic="http://schemas.openxmlformats.org/drawingml/2006/picture">
-                  <wp:extent cx="566928" cy="705986"/>
+                  <wp:extent cx="566928" cy="710454"/>
                   <wp:docPr id="51" name="Picture 51"/>
                   <wp:cNvGraphicFramePr>
                     <a:graphicFrameLocks noChangeAspect="1"/>
@@ -9915,7 +9915,7 @@
                           <pic:cNvPicPr/>
                         </pic:nvPicPr>
                         <pic:blipFill>
-                          <a:blip r:embed="rId58"/>
+                          <a:blip r:embed="rId59"/>
                           <a:stretch>
                             <a:fillRect/>
                           </a:stretch>
@@ -9923,7 +9923,7 @@
                         <pic:spPr>
                           <a:xfrm>
                             <a:off x="0" y="0"/>
-                            <a:ext cx="566928" cy="705986"/>
+                            <a:ext cx="566928" cy="710454"/>
                           </a:xfrm>
                           <a:prstGeom prst="rect"/>
                         </pic:spPr>
@@ -10052,7 +10052,7 @@
                     <pic:cNvPicPr/>
                   </pic:nvPicPr>
                   <pic:blipFill>
-                    <a:blip r:embed="rId59"/>
+                    <a:blip r:embed="rId60"/>
                     <a:stretch>
                       <a:fillRect/>
                     </a:stretch>
@@ -10379,7 +10379,7 @@
                           <pic:cNvPicPr/>
                         </pic:nvPicPr>
                         <pic:blipFill>
-                          <a:blip r:embed="rId60"/>
+                          <a:blip r:embed="rId61"/>
                           <a:stretch>
                             <a:fillRect/>
                           </a:stretch>
@@ -10519,7 +10519,7 @@
                           <pic:cNvPicPr/>
                         </pic:nvPicPr>
                         <pic:blipFill>
-                          <a:blip r:embed="rId61"/>
+                          <a:blip r:embed="rId62"/>
                           <a:stretch>
                             <a:fillRect/>
                           </a:stretch>
@@ -10691,7 +10691,7 @@
                           <pic:cNvPicPr/>
                         </pic:nvPicPr>
                         <pic:blipFill>
-                          <a:blip r:embed="rId62"/>
+                          <a:blip r:embed="rId63"/>
                           <a:stretch>
                             <a:fillRect/>
                           </a:stretch>
@@ -10828,7 +10828,7 @@
                     <pic:cNvPicPr/>
                   </pic:nvPicPr>
                   <pic:blipFill>
-                    <a:blip r:embed="rId63"/>
+                    <a:blip r:embed="rId64"/>
                     <a:stretch>
                       <a:fillRect/>
                     </a:stretch>
@@ -11155,7 +11155,7 @@
                           <pic:cNvPicPr/>
                         </pic:nvPicPr>
                         <pic:blipFill>
-                          <a:blip r:embed="rId64"/>
+                          <a:blip r:embed="rId65"/>
                           <a:stretch>
                             <a:fillRect/>
                           </a:stretch>
@@ -11282,7 +11282,7 @@
             <w:r>
               <w:drawing>
                 <wp:inline xmlns:a="http://schemas.openxmlformats.org/drawingml/2006/main" xmlns:pic="http://schemas.openxmlformats.org/drawingml/2006/picture">
-                  <wp:extent cx="566928" cy="705986"/>
+                  <wp:extent cx="566928" cy="710454"/>
                   <wp:docPr id="58" name="Picture 58"/>
                   <wp:cNvGraphicFramePr>
                     <a:graphicFrameLocks noChangeAspect="1"/>
@@ -11295,7 +11295,7 @@
                           <pic:cNvPicPr/>
                         </pic:nvPicPr>
                         <pic:blipFill>
-                          <a:blip r:embed="rId65"/>
+                          <a:blip r:embed="rId66"/>
                           <a:stretch>
                             <a:fillRect/>
                           </a:stretch>
@@ -11303,7 +11303,7 @@
                         <pic:spPr>
                           <a:xfrm>
                             <a:off x="0" y="0"/>
-                            <a:ext cx="566928" cy="705986"/>
+                            <a:ext cx="566928" cy="710454"/>
                           </a:xfrm>
                           <a:prstGeom prst="rect"/>
                         </pic:spPr>
@@ -11462,7 +11462,7 @@
                           <pic:cNvPicPr/>
                         </pic:nvPicPr>
                         <pic:blipFill>
-                          <a:blip r:embed="rId66"/>
+                          <a:blip r:embed="rId67"/>
                           <a:stretch>
                             <a:fillRect/>
                           </a:stretch>
@@ -11584,7 +11584,7 @@
                     <pic:cNvPicPr/>
                   </pic:nvPicPr>
                   <pic:blipFill>
-                    <a:blip r:embed="rId67"/>
+                    <a:blip r:embed="rId68"/>
                     <a:stretch>
                       <a:fillRect/>
                     </a:stretch>
@@ -11911,7 +11911,7 @@
                           <pic:cNvPicPr/>
                         </pic:nvPicPr>
                         <pic:blipFill>
-                          <a:blip r:embed="rId68"/>
+                          <a:blip r:embed="rId69"/>
                           <a:stretch>
                             <a:fillRect/>
                           </a:stretch>
@@ -12051,7 +12051,7 @@
                           <pic:cNvPicPr/>
                         </pic:nvPicPr>
                         <pic:blipFill>
-                          <a:blip r:embed="rId69"/>
+                          <a:blip r:embed="rId70"/>
                           <a:stretch>
                             <a:fillRect/>
                           </a:stretch>
@@ -12195,7 +12195,7 @@
             <w:r>
               <w:drawing>
                 <wp:inline xmlns:a="http://schemas.openxmlformats.org/drawingml/2006/main" xmlns:pic="http://schemas.openxmlformats.org/drawingml/2006/picture">
-                  <wp:extent cx="566928" cy="714485"/>
+                  <wp:extent cx="566928" cy="706718"/>
                   <wp:docPr id="63" name="Picture 63"/>
                   <wp:cNvGraphicFramePr>
                     <a:graphicFrameLocks noChangeAspect="1"/>
@@ -12208,7 +12208,7 @@
                           <pic:cNvPicPr/>
                         </pic:nvPicPr>
                         <pic:blipFill>
-                          <a:blip r:embed="rId70"/>
+                          <a:blip r:embed="rId71"/>
                           <a:stretch>
                             <a:fillRect/>
                           </a:stretch>
@@ -12216,7 +12216,7 @@
                         <pic:spPr>
                           <a:xfrm>
                             <a:off x="0" y="0"/>
-                            <a:ext cx="566928" cy="714485"/>
+                            <a:ext cx="566928" cy="706718"/>
                           </a:xfrm>
                           <a:prstGeom prst="rect"/>
                         </pic:spPr>
@@ -12330,7 +12330,7 @@
                     <pic:cNvPicPr/>
                   </pic:nvPicPr>
                   <pic:blipFill>
-                    <a:blip r:embed="rId71"/>
+                    <a:blip r:embed="rId72"/>
                     <a:stretch>
                       <a:fillRect/>
                     </a:stretch>
@@ -12657,7 +12657,7 @@
                           <pic:cNvPicPr/>
                         </pic:nvPicPr>
                         <pic:blipFill>
-                          <a:blip r:embed="rId72"/>
+                          <a:blip r:embed="rId73"/>
                           <a:stretch>
                             <a:fillRect/>
                           </a:stretch>
@@ -12814,7 +12814,7 @@
                           <pic:cNvPicPr/>
                         </pic:nvPicPr>
                         <pic:blipFill>
-                          <a:blip r:embed="rId73"/>
+                          <a:blip r:embed="rId74"/>
                           <a:stretch>
                             <a:fillRect/>
                           </a:stretch>
@@ -12951,7 +12951,7 @@
                     <pic:cNvPicPr/>
                   </pic:nvPicPr>
                   <pic:blipFill>
-                    <a:blip r:embed="rId74"/>
+                    <a:blip r:embed="rId75"/>
                     <a:stretch>
                       <a:fillRect/>
                     </a:stretch>
@@ -13278,7 +13278,7 @@
                           <pic:cNvPicPr/>
                         </pic:nvPicPr>
                         <pic:blipFill>
-                          <a:blip r:embed="rId75"/>
+                          <a:blip r:embed="rId76"/>
                           <a:stretch>
                             <a:fillRect/>
                           </a:stretch>
@@ -13418,7 +13418,7 @@
                           <pic:cNvPicPr/>
                         </pic:nvPicPr>
                         <pic:blipFill>
-                          <a:blip r:embed="rId76"/>
+                          <a:blip r:embed="rId77"/>
                           <a:stretch>
                             <a:fillRect/>
                           </a:stretch>
@@ -13575,7 +13575,7 @@
                           <pic:cNvPicPr/>
                         </pic:nvPicPr>
                         <pic:blipFill>
-                          <a:blip r:embed="rId77"/>
+                          <a:blip r:embed="rId78"/>
                           <a:stretch>
                             <a:fillRect/>
                           </a:stretch>
@@ -13712,7 +13712,7 @@
                     <pic:cNvPicPr/>
                   </pic:nvPicPr>
                   <pic:blipFill>
-                    <a:blip r:embed="rId78"/>
+                    <a:blip r:embed="rId79"/>
                     <a:stretch>
                       <a:fillRect/>
                     </a:stretch>
@@ -14001,7 +14001,7 @@
                           <pic:cNvPicPr/>
                         </pic:nvPicPr>
                         <pic:blipFill>
-                          <a:blip r:embed="rId79"/>
+                          <a:blip r:embed="rId80"/>
                           <a:stretch>
                             <a:fillRect/>
                           </a:stretch>
@@ -14141,7 +14141,7 @@
                           <pic:cNvPicPr/>
                         </pic:nvPicPr>
                         <pic:blipFill>
-                          <a:blip r:embed="rId80"/>
+                          <a:blip r:embed="rId81"/>
                           <a:stretch>
                             <a:fillRect/>
                           </a:stretch>
@@ -14300,7 +14300,7 @@
             <w:r>
               <w:drawing>
                 <wp:inline xmlns:a="http://schemas.openxmlformats.org/drawingml/2006/main" xmlns:pic="http://schemas.openxmlformats.org/drawingml/2006/picture">
-                  <wp:extent cx="566928" cy="714485"/>
+                  <wp:extent cx="566928" cy="706718"/>
                   <wp:docPr id="74" name="Picture 74"/>
                   <wp:cNvGraphicFramePr>
                     <a:graphicFrameLocks noChangeAspect="1"/>
@@ -14313,7 +14313,7 @@
                           <pic:cNvPicPr/>
                         </pic:nvPicPr>
                         <pic:blipFill>
-                          <a:blip r:embed="rId81"/>
+                          <a:blip r:embed="rId82"/>
                           <a:stretch>
                             <a:fillRect/>
                           </a:stretch>
@@ -14321,7 +14321,7 @@
                         <pic:spPr>
                           <a:xfrm>
                             <a:off x="0" y="0"/>
-                            <a:ext cx="566928" cy="714485"/>
+                            <a:ext cx="566928" cy="706718"/>
                           </a:xfrm>
                           <a:prstGeom prst="rect"/>
                         </pic:spPr>
@@ -14453,7 +14453,7 @@
                           <pic:cNvPicPr/>
                         </pic:nvPicPr>
                         <pic:blipFill>
-                          <a:blip r:embed="rId82"/>
+                          <a:blip r:embed="rId83"/>
                           <a:stretch>
                             <a:fillRect/>
                           </a:stretch>
@@ -14609,7 +14609,7 @@
                     <pic:cNvPicPr/>
                   </pic:nvPicPr>
                   <pic:blipFill>
-                    <a:blip r:embed="rId83"/>
+                    <a:blip r:embed="rId84"/>
                     <a:stretch>
                       <a:fillRect/>
                     </a:stretch>
@@ -14962,7 +14962,7 @@
                           <pic:cNvPicPr/>
                         </pic:nvPicPr>
                         <pic:blipFill>
-                          <a:blip r:embed="rId84"/>
+                          <a:blip r:embed="rId85"/>
                           <a:stretch>
                             <a:fillRect/>
                           </a:stretch>
@@ -15119,7 +15119,7 @@
                           <pic:cNvPicPr/>
                         </pic:nvPicPr>
                         <pic:blipFill>
-                          <a:blip r:embed="rId85"/>
+                          <a:blip r:embed="rId86"/>
                           <a:stretch>
                             <a:fillRect/>
                           </a:stretch>
@@ -15241,7 +15241,7 @@
                     <pic:cNvPicPr/>
                   </pic:nvPicPr>
                   <pic:blipFill>
-                    <a:blip r:embed="rId86"/>
+                    <a:blip r:embed="rId87"/>
                     <a:stretch>
                       <a:fillRect/>
                     </a:stretch>
@@ -15594,7 +15594,7 @@
                           <pic:cNvPicPr/>
                         </pic:nvPicPr>
                         <pic:blipFill>
-                          <a:blip r:embed="rId87"/>
+                          <a:blip r:embed="rId88"/>
                           <a:stretch>
                             <a:fillRect/>
                           </a:stretch>
@@ -15766,7 +15766,7 @@
                           <pic:cNvPicPr/>
                         </pic:nvPicPr>
                         <pic:blipFill>
-                          <a:blip r:embed="rId88"/>
+                          <a:blip r:embed="rId89"/>
                           <a:stretch>
                             <a:fillRect/>
                           </a:stretch>
@@ -15864,7 +15864,7 @@
       </w:r>
     </w:p>
     <w:sectPr>
-      <w:footerReference w:type="default" r:id="rId89"/>
+      <w:footerReference w:type="default" r:id="rId90"/>
       <w:pgSz w:w="12240" w:h="15840"/>
       <w:pgMar w:top="1008" w:right="1224" w:bottom="1152" w:left="1224" w:header="720" w:footer="720" w:gutter="0"/>
       <w:cols w:space="720"/>

</xml_diff>

<commit_message>
Final 7 portraits (59/59 complete); standardize number formats
Portraits: extracted the final seven from the fourth sheet (docx) -
Genua, Lavigne, Al-Qasabi, Virkkunen, Sefcovic, Mataboge, Tatchouop
Belobe - all high-resolution; caption pairing verified in document
order and visually. Every displayed official in the deck and list now
carries a real portrait (59/59). Luis Caputo's photo remains unused
(not on the verified roster).

Number standardization across deliverables: workbook cells now render
$X,XXX.XB with minus-sign negatives (matching the deck's tables);
the list's Key Figures tables use the same $X,XXX.XB form (prose
sentences keep spelled-out billions). Deck already used this format.

684 QA checks pass.

Co-Authored-By: Claude Fable 5 <noreply@anthropic.com>
Claude-Session: https://claude.ai/code/session_01D7VNHN8h6qLVjZi6Tzyhub
</commit_message>
<xml_diff>
--- a/output/g20-ministers-trade-list.docx
+++ b/output/g20-ministers-trade-list.docx
@@ -560,7 +560,7 @@
                 <w:color w:val="2C2C2C"/>
                 <w:sz w:val="19"/>
               </w:rPr>
-              <w:t>Nominal GDP: $681.5 billion (2025)</w:t>
+              <w:t>Nominal GDP: $681.5B (2025)</w:t>
             </w:r>
           </w:p>
         </w:tc>
@@ -590,7 +590,7 @@
                 <w:color w:val="2C2C2C"/>
                 <w:sz w:val="19"/>
               </w:rPr>
-              <w:t>Overall goods surplus: $11.3 billion (2025)</w:t>
+              <w:t>Overall goods surplus: $11.3B (2025)</w:t>
             </w:r>
           </w:p>
         </w:tc>
@@ -622,7 +622,7 @@
                 <w:color w:val="2C2C2C"/>
                 <w:sz w:val="19"/>
               </w:rPr>
-              <w:t>U.S. goods exports: $9.9 billion (2025)</w:t>
+              <w:t>U.S. goods exports: $9.9B (2025)</w:t>
             </w:r>
           </w:p>
         </w:tc>
@@ -652,7 +652,7 @@
                 <w:color w:val="2C2C2C"/>
                 <w:sz w:val="19"/>
               </w:rPr>
-              <w:t>U.S. goods imports: $8.3 billion (2025)</w:t>
+              <w:t>U.S. goods imports: $8.3B (2025)</w:t>
             </w:r>
           </w:p>
         </w:tc>
@@ -684,7 +684,7 @@
                 <w:color w:val="2C2C2C"/>
                 <w:sz w:val="19"/>
               </w:rPr>
-              <w:t>U.S. bilateral surplus: $1.6 billion (2025)</w:t>
+              <w:t>U.S. bilateral surplus: $1.6B (2025)</w:t>
             </w:r>
           </w:p>
         </w:tc>
@@ -758,7 +758,7 @@
             <w:r>
               <w:drawing>
                 <wp:inline xmlns:a="http://schemas.openxmlformats.org/drawingml/2006/main" xmlns:pic="http://schemas.openxmlformats.org/drawingml/2006/picture">
-                  <wp:extent cx="566928" cy="709551"/>
+                  <wp:extent cx="566928" cy="705986"/>
                   <wp:docPr id="3" name="Picture 3"/>
                   <wp:cNvGraphicFramePr>
                     <a:graphicFrameLocks noChangeAspect="1"/>
@@ -779,7 +779,7 @@
                         <pic:spPr>
                           <a:xfrm>
                             <a:off x="0" y="0"/>
-                            <a:ext cx="566928" cy="709551"/>
+                            <a:ext cx="566928" cy="705986"/>
                           </a:xfrm>
                           <a:prstGeom prst="rect"/>
                         </pic:spPr>
@@ -898,7 +898,7 @@
             <w:r>
               <w:drawing>
                 <wp:inline xmlns:a="http://schemas.openxmlformats.org/drawingml/2006/main" xmlns:pic="http://schemas.openxmlformats.org/drawingml/2006/picture">
-                  <wp:extent cx="566928" cy="708660"/>
+                  <wp:extent cx="566928" cy="710036"/>
                   <wp:docPr id="4" name="Picture 4"/>
                   <wp:cNvGraphicFramePr>
                     <a:graphicFrameLocks noChangeAspect="1"/>
@@ -907,7 +907,7 @@
                     <a:graphicData uri="http://schemas.openxmlformats.org/drawingml/2006/picture">
                       <pic:pic>
                         <pic:nvPicPr>
-                          <pic:cNvPr id="0" name="_ph-argentina-lavigne.png"/>
+                          <pic:cNvPr id="0" name="argentina-lavigne.png"/>
                           <pic:cNvPicPr/>
                         </pic:nvPicPr>
                         <pic:blipFill>
@@ -919,7 +919,7 @@
                         <pic:spPr>
                           <a:xfrm>
                             <a:off x="0" y="0"/>
-                            <a:ext cx="566928" cy="708660"/>
+                            <a:ext cx="566928" cy="710036"/>
                           </a:xfrm>
                           <a:prstGeom prst="rect"/>
                         </pic:spPr>
@@ -1080,7 +1080,7 @@
             <w:r>
               <w:drawing>
                 <wp:inline xmlns:a="http://schemas.openxmlformats.org/drawingml/2006/main" xmlns:pic="http://schemas.openxmlformats.org/drawingml/2006/picture">
-                  <wp:extent cx="566928" cy="708660"/>
+                  <wp:extent cx="566928" cy="709812"/>
                   <wp:docPr id="5" name="Picture 5"/>
                   <wp:cNvGraphicFramePr>
                     <a:graphicFrameLocks noChangeAspect="1"/>
@@ -1089,7 +1089,7 @@
                     <a:graphicData uri="http://schemas.openxmlformats.org/drawingml/2006/picture">
                       <pic:pic>
                         <pic:nvPicPr>
-                          <pic:cNvPr id="0" name="_ph-argentina-genua.png"/>
+                          <pic:cNvPr id="0" name="argentina-genua.png"/>
                           <pic:cNvPicPr/>
                         </pic:nvPicPr>
                         <pic:blipFill>
@@ -1101,7 +1101,7 @@
                         <pic:spPr>
                           <a:xfrm>
                             <a:off x="0" y="0"/>
-                            <a:ext cx="566928" cy="708660"/>
+                            <a:ext cx="566928" cy="709812"/>
                           </a:xfrm>
                           <a:prstGeom prst="rect"/>
                         </pic:spPr>
@@ -1346,7 +1346,7 @@
                 <w:color w:val="2C2C2C"/>
                 <w:sz w:val="19"/>
               </w:rPr>
-              <w:t>Nominal GDP: $1,840.0 billion (2025)</w:t>
+              <w:t>Nominal GDP: $1,840.0B (2025)</w:t>
             </w:r>
           </w:p>
         </w:tc>
@@ -1376,7 +1376,7 @@
                 <w:color w:val="2C2C2C"/>
                 <w:sz w:val="19"/>
               </w:rPr>
-              <w:t>Overall goods-and-services surplus: $4.5 billion (2025)</w:t>
+              <w:t>Overall goods-and-services surplus: $4.5B (2025)</w:t>
             </w:r>
           </w:p>
         </w:tc>
@@ -1408,7 +1408,7 @@
                 <w:color w:val="2C2C2C"/>
                 <w:sz w:val="19"/>
               </w:rPr>
-              <w:t>U.S. goods exports: $33.7 billion (2025)</w:t>
+              <w:t>U.S. goods exports: $33.7B (2025)</w:t>
             </w:r>
           </w:p>
         </w:tc>
@@ -1438,7 +1438,7 @@
                 <w:color w:val="2C2C2C"/>
                 <w:sz w:val="19"/>
               </w:rPr>
-              <w:t>U.S. goods imports: $29.1 billion (2025)</w:t>
+              <w:t>U.S. goods imports: $29.1B (2025)</w:t>
             </w:r>
           </w:p>
         </w:tc>
@@ -1470,7 +1470,7 @@
                 <w:color w:val="2C2C2C"/>
                 <w:sz w:val="19"/>
               </w:rPr>
-              <w:t>U.S. bilateral surplus: $4.6 billion (2025)</w:t>
+              <w:t>U.S. bilateral surplus: $4.6B (2025)</w:t>
             </w:r>
           </w:p>
         </w:tc>
@@ -1544,7 +1544,7 @@
             <w:r>
               <w:drawing>
                 <wp:inline xmlns:a="http://schemas.openxmlformats.org/drawingml/2006/main" xmlns:pic="http://schemas.openxmlformats.org/drawingml/2006/picture">
-                  <wp:extent cx="566928" cy="706480"/>
+                  <wp:extent cx="566928" cy="710121"/>
                   <wp:docPr id="7" name="Picture 7"/>
                   <wp:cNvGraphicFramePr>
                     <a:graphicFrameLocks noChangeAspect="1"/>
@@ -1565,7 +1565,7 @@
                         <pic:spPr>
                           <a:xfrm>
                             <a:off x="0" y="0"/>
-                            <a:ext cx="566928" cy="706480"/>
+                            <a:ext cx="566928" cy="710121"/>
                           </a:xfrm>
                           <a:prstGeom prst="rect"/>
                         </pic:spPr>
@@ -1716,7 +1716,7 @@
             <w:r>
               <w:drawing>
                 <wp:inline xmlns:a="http://schemas.openxmlformats.org/drawingml/2006/main" xmlns:pic="http://schemas.openxmlformats.org/drawingml/2006/picture">
-                  <wp:extent cx="566928" cy="707594"/>
+                  <wp:extent cx="566928" cy="712955"/>
                   <wp:docPr id="8" name="Picture 8"/>
                   <wp:cNvGraphicFramePr>
                     <a:graphicFrameLocks noChangeAspect="1"/>
@@ -1737,7 +1737,7 @@
                         <pic:spPr>
                           <a:xfrm>
                             <a:off x="0" y="0"/>
-                            <a:ext cx="566928" cy="707594"/>
+                            <a:ext cx="566928" cy="712955"/>
                           </a:xfrm>
                           <a:prstGeom prst="rect"/>
                         </pic:spPr>
@@ -1856,7 +1856,7 @@
             <w:r>
               <w:drawing>
                 <wp:inline xmlns:a="http://schemas.openxmlformats.org/drawingml/2006/main" xmlns:pic="http://schemas.openxmlformats.org/drawingml/2006/picture">
-                  <wp:extent cx="566928" cy="709551"/>
+                  <wp:extent cx="566928" cy="705986"/>
                   <wp:docPr id="9" name="Picture 9"/>
                   <wp:cNvGraphicFramePr>
                     <a:graphicFrameLocks noChangeAspect="1"/>
@@ -1877,7 +1877,7 @@
                         <pic:spPr>
                           <a:xfrm>
                             <a:off x="0" y="0"/>
-                            <a:ext cx="566928" cy="709551"/>
+                            <a:ext cx="566928" cy="705986"/>
                           </a:xfrm>
                           <a:prstGeom prst="rect"/>
                         </pic:spPr>
@@ -2122,7 +2122,7 @@
                 <w:color w:val="2C2C2C"/>
                 <w:sz w:val="19"/>
               </w:rPr>
-              <w:t>Nominal GDP: $2,280.0 billion (2025)</w:t>
+              <w:t>Nominal GDP: $2,280.0B (2025)</w:t>
             </w:r>
           </w:p>
         </w:tc>
@@ -2152,7 +2152,7 @@
                 <w:color w:val="2C2C2C"/>
                 <w:sz w:val="19"/>
               </w:rPr>
-              <w:t>Overall goods surplus: $68.3 billion (2025)</w:t>
+              <w:t>Overall goods surplus: $68.3B (2025)</w:t>
             </w:r>
           </w:p>
         </w:tc>
@@ -2184,7 +2184,7 @@
                 <w:color w:val="2C2C2C"/>
                 <w:sz w:val="19"/>
               </w:rPr>
-              <w:t>U.S. goods exports: $54.4 billion (2025)</w:t>
+              <w:t>U.S. goods exports: $54.4B (2025)</w:t>
             </w:r>
           </w:p>
         </w:tc>
@@ -2214,7 +2214,7 @@
                 <w:color w:val="2C2C2C"/>
                 <w:sz w:val="19"/>
               </w:rPr>
-              <w:t>U.S. goods imports: $39.9 billion (2025)</w:t>
+              <w:t>U.S. goods imports: $39.9B (2025)</w:t>
             </w:r>
           </w:p>
         </w:tc>
@@ -2246,7 +2246,7 @@
                 <w:color w:val="2C2C2C"/>
                 <w:sz w:val="19"/>
               </w:rPr>
-              <w:t>U.S. bilateral surplus: $14.5 billion (2025)</w:t>
+              <w:t>U.S. bilateral surplus: $14.5B (2025)</w:t>
             </w:r>
           </w:p>
         </w:tc>
@@ -2320,7 +2320,7 @@
             <w:r>
               <w:drawing>
                 <wp:inline xmlns:a="http://schemas.openxmlformats.org/drawingml/2006/main" xmlns:pic="http://schemas.openxmlformats.org/drawingml/2006/picture">
-                  <wp:extent cx="566928" cy="709551"/>
+                  <wp:extent cx="566928" cy="705986"/>
                   <wp:docPr id="11" name="Picture 11"/>
                   <wp:cNvGraphicFramePr>
                     <a:graphicFrameLocks noChangeAspect="1"/>
@@ -2341,7 +2341,7 @@
                         <pic:spPr>
                           <a:xfrm>
                             <a:off x="0" y="0"/>
-                            <a:ext cx="566928" cy="709551"/>
+                            <a:ext cx="566928" cy="705986"/>
                           </a:xfrm>
                           <a:prstGeom prst="rect"/>
                         </pic:spPr>
@@ -2477,7 +2477,7 @@
             <w:r>
               <w:drawing>
                 <wp:inline xmlns:a="http://schemas.openxmlformats.org/drawingml/2006/main" xmlns:pic="http://schemas.openxmlformats.org/drawingml/2006/picture">
-                  <wp:extent cx="566928" cy="706819"/>
+                  <wp:extent cx="566928" cy="711439"/>
                   <wp:docPr id="12" name="Picture 12"/>
                   <wp:cNvGraphicFramePr>
                     <a:graphicFrameLocks noChangeAspect="1"/>
@@ -2498,7 +2498,7 @@
                         <pic:spPr>
                           <a:xfrm>
                             <a:off x="0" y="0"/>
-                            <a:ext cx="566928" cy="706819"/>
+                            <a:ext cx="566928" cy="711439"/>
                           </a:xfrm>
                           <a:prstGeom prst="rect"/>
                         </pic:spPr>
@@ -2617,7 +2617,7 @@
             <w:r>
               <w:drawing>
                 <wp:inline xmlns:a="http://schemas.openxmlformats.org/drawingml/2006/main" xmlns:pic="http://schemas.openxmlformats.org/drawingml/2006/picture">
-                  <wp:extent cx="566928" cy="711676"/>
+                  <wp:extent cx="566928" cy="708660"/>
                   <wp:docPr id="13" name="Picture 13"/>
                   <wp:cNvGraphicFramePr>
                     <a:graphicFrameLocks noChangeAspect="1"/>
@@ -2638,7 +2638,7 @@
                         <pic:spPr>
                           <a:xfrm>
                             <a:off x="0" y="0"/>
-                            <a:ext cx="566928" cy="711676"/>
+                            <a:ext cx="566928" cy="708660"/>
                           </a:xfrm>
                           <a:prstGeom prst="rect"/>
                         </pic:spPr>
@@ -2868,7 +2868,7 @@
                 <w:color w:val="2C2C2C"/>
                 <w:sz w:val="19"/>
               </w:rPr>
-              <w:t>Nominal GDP: $2,284.0 billion (2025)</w:t>
+              <w:t>Nominal GDP: $2,284.0B (2025)</w:t>
             </w:r>
           </w:p>
         </w:tc>
@@ -2898,7 +2898,7 @@
                 <w:color w:val="2C2C2C"/>
                 <w:sz w:val="19"/>
               </w:rPr>
-              <w:t>Overall goods deficit: $22.4 billion (2025)</w:t>
+              <w:t>Overall goods deficit: $22.4B (2025)</w:t>
             </w:r>
           </w:p>
         </w:tc>
@@ -2930,7 +2930,7 @@
                 <w:color w:val="2C2C2C"/>
                 <w:sz w:val="19"/>
               </w:rPr>
-              <w:t>U.S. goods exports: $336.5 billion (2025)</w:t>
+              <w:t>U.S. goods exports: $336.5B (2025)</w:t>
             </w:r>
           </w:p>
         </w:tc>
@@ -2960,7 +2960,7 @@
                 <w:color w:val="2C2C2C"/>
                 <w:sz w:val="19"/>
               </w:rPr>
-              <w:t>U.S. goods imports: $383.0 billion (2025)</w:t>
+              <w:t>U.S. goods imports: $383.0B (2025)</w:t>
             </w:r>
           </w:p>
         </w:tc>
@@ -2992,7 +2992,7 @@
                 <w:color w:val="2C2C2C"/>
                 <w:sz w:val="19"/>
               </w:rPr>
-              <w:t>U.S. bilateral deficit: $46.5 billion (2025)</w:t>
+              <w:t>U.S. bilateral deficit: $46.5B (2025)</w:t>
             </w:r>
           </w:p>
         </w:tc>
@@ -3206,7 +3206,7 @@
             <w:r>
               <w:drawing>
                 <wp:inline xmlns:a="http://schemas.openxmlformats.org/drawingml/2006/main" xmlns:pic="http://schemas.openxmlformats.org/drawingml/2006/picture">
-                  <wp:extent cx="566928" cy="707594"/>
+                  <wp:extent cx="566928" cy="712955"/>
                   <wp:docPr id="16" name="Picture 16"/>
                   <wp:cNvGraphicFramePr>
                     <a:graphicFrameLocks noChangeAspect="1"/>
@@ -3227,7 +3227,7 @@
                         <pic:spPr>
                           <a:xfrm>
                             <a:off x="0" y="0"/>
-                            <a:ext cx="566928" cy="707594"/>
+                            <a:ext cx="566928" cy="712955"/>
                           </a:xfrm>
                           <a:prstGeom prst="rect"/>
                         </pic:spPr>
@@ -3363,7 +3363,7 @@
             <w:r>
               <w:drawing>
                 <wp:inline xmlns:a="http://schemas.openxmlformats.org/drawingml/2006/main" xmlns:pic="http://schemas.openxmlformats.org/drawingml/2006/picture">
-                  <wp:extent cx="566928" cy="712955"/>
+                  <wp:extent cx="566928" cy="708660"/>
                   <wp:docPr id="17" name="Picture 17"/>
                   <wp:cNvGraphicFramePr>
                     <a:graphicFrameLocks noChangeAspect="1"/>
@@ -3384,7 +3384,7 @@
                         <pic:spPr>
                           <a:xfrm>
                             <a:off x="0" y="0"/>
-                            <a:ext cx="566928" cy="712955"/>
+                            <a:ext cx="566928" cy="708660"/>
                           </a:xfrm>
                           <a:prstGeom prst="rect"/>
                         </pic:spPr>
@@ -3614,7 +3614,7 @@
                 <w:color w:val="2C2C2C"/>
                 <w:sz w:val="19"/>
               </w:rPr>
-              <w:t>Nominal GDP: $19,399.0 billion (2025)</w:t>
+              <w:t>Nominal GDP: $19,399.0B (2025)</w:t>
             </w:r>
           </w:p>
         </w:tc>
@@ -3644,7 +3644,7 @@
                 <w:color w:val="2C2C2C"/>
                 <w:sz w:val="19"/>
               </w:rPr>
-              <w:t>Overall goods surplus: $1,190.0 billion (2025)</w:t>
+              <w:t>Overall goods surplus: $1,190.0B (2025)</w:t>
             </w:r>
           </w:p>
         </w:tc>
@@ -3676,7 +3676,7 @@
                 <w:color w:val="2C2C2C"/>
                 <w:sz w:val="19"/>
               </w:rPr>
-              <w:t>U.S. goods exports: $106.3 billion (2025)</w:t>
+              <w:t>U.S. goods exports: $106.3B (2025)</w:t>
             </w:r>
           </w:p>
         </w:tc>
@@ -3706,7 +3706,7 @@
                 <w:color w:val="2C2C2C"/>
                 <w:sz w:val="19"/>
               </w:rPr>
-              <w:t>U.S. goods imports: $308.4 billion (2025)</w:t>
+              <w:t>U.S. goods imports: $308.4B (2025)</w:t>
             </w:r>
           </w:p>
         </w:tc>
@@ -3738,7 +3738,7 @@
                 <w:color w:val="2C2C2C"/>
                 <w:sz w:val="19"/>
               </w:rPr>
-              <w:t>U.S. bilateral deficit: $202.1 billion (2025)</w:t>
+              <w:t>U.S. bilateral deficit: $202.1B (2025)</w:t>
             </w:r>
           </w:p>
         </w:tc>
@@ -3812,7 +3812,7 @@
             <w:r>
               <w:drawing>
                 <wp:inline xmlns:a="http://schemas.openxmlformats.org/drawingml/2006/main" xmlns:pic="http://schemas.openxmlformats.org/drawingml/2006/picture">
-                  <wp:extent cx="566928" cy="710454"/>
+                  <wp:extent cx="566928" cy="706866"/>
                   <wp:docPr id="19" name="Picture 19"/>
                   <wp:cNvGraphicFramePr>
                     <a:graphicFrameLocks noChangeAspect="1"/>
@@ -3833,7 +3833,7 @@
                         <pic:spPr>
                           <a:xfrm>
                             <a:off x="0" y="0"/>
-                            <a:ext cx="566928" cy="710454"/>
+                            <a:ext cx="566928" cy="706866"/>
                           </a:xfrm>
                           <a:prstGeom prst="rect"/>
                         </pic:spPr>
@@ -3952,7 +3952,7 @@
             <w:r>
               <w:drawing>
                 <wp:inline xmlns:a="http://schemas.openxmlformats.org/drawingml/2006/main" xmlns:pic="http://schemas.openxmlformats.org/drawingml/2006/picture">
-                  <wp:extent cx="566928" cy="705986"/>
+                  <wp:extent cx="566928" cy="710454"/>
                   <wp:docPr id="20" name="Picture 20"/>
                   <wp:cNvGraphicFramePr>
                     <a:graphicFrameLocks noChangeAspect="1"/>
@@ -3973,7 +3973,7 @@
                         <pic:spPr>
                           <a:xfrm>
                             <a:off x="0" y="0"/>
-                            <a:ext cx="566928" cy="705986"/>
+                            <a:ext cx="566928" cy="710454"/>
                           </a:xfrm>
                           <a:prstGeom prst="rect"/>
                         </pic:spPr>
@@ -4124,7 +4124,7 @@
             <w:r>
               <w:drawing>
                 <wp:inline xmlns:a="http://schemas.openxmlformats.org/drawingml/2006/main" xmlns:pic="http://schemas.openxmlformats.org/drawingml/2006/picture">
-                  <wp:extent cx="566928" cy="712491"/>
+                  <wp:extent cx="566928" cy="708660"/>
                   <wp:docPr id="21" name="Picture 21"/>
                   <wp:cNvGraphicFramePr>
                     <a:graphicFrameLocks noChangeAspect="1"/>
@@ -4145,7 +4145,7 @@
                         <pic:spPr>
                           <a:xfrm>
                             <a:off x="0" y="0"/>
-                            <a:ext cx="566928" cy="712491"/>
+                            <a:ext cx="566928" cy="708660"/>
                           </a:xfrm>
                           <a:prstGeom prst="rect"/>
                         </pic:spPr>
@@ -4264,7 +4264,7 @@
             <w:r>
               <w:drawing>
                 <wp:inline xmlns:a="http://schemas.openxmlformats.org/drawingml/2006/main" xmlns:pic="http://schemas.openxmlformats.org/drawingml/2006/picture">
-                  <wp:extent cx="566928" cy="710602"/>
+                  <wp:extent cx="566928" cy="706718"/>
                   <wp:docPr id="22" name="Picture 22"/>
                   <wp:cNvGraphicFramePr>
                     <a:graphicFrameLocks noChangeAspect="1"/>
@@ -4285,7 +4285,7 @@
                         <pic:spPr>
                           <a:xfrm>
                             <a:off x="0" y="0"/>
-                            <a:ext cx="566928" cy="710602"/>
+                            <a:ext cx="566928" cy="706718"/>
                           </a:xfrm>
                           <a:prstGeom prst="rect"/>
                         </pic:spPr>
@@ -4530,7 +4530,7 @@
                 <w:color w:val="2C2C2C"/>
                 <w:sz w:val="19"/>
               </w:rPr>
-              <w:t>Nominal GDP: $3,362.0 billion (2025)</w:t>
+              <w:t>Nominal GDP: $3,362.0B (2025)</w:t>
             </w:r>
           </w:p>
         </w:tc>
@@ -4560,7 +4560,7 @@
                 <w:color w:val="2C2C2C"/>
                 <w:sz w:val="19"/>
               </w:rPr>
-              <w:t>Overall goods deficit: $76.1 billion (2025)</w:t>
+              <w:t>Overall goods deficit: $76.1B (2025)</w:t>
             </w:r>
           </w:p>
         </w:tc>
@@ -4592,7 +4592,7 @@
                 <w:color w:val="2C2C2C"/>
                 <w:sz w:val="19"/>
               </w:rPr>
-              <w:t>U.S. goods exports: $44.4 billion (2024)</w:t>
+              <w:t>U.S. goods exports: $44.4B (2024)</w:t>
             </w:r>
           </w:p>
         </w:tc>
@@ -4622,7 +4622,7 @@
                 <w:color w:val="2C2C2C"/>
                 <w:sz w:val="19"/>
               </w:rPr>
-              <w:t>U.S. goods imports: $61.1 billion (2024)</w:t>
+              <w:t>U.S. goods imports: $61.1B (2024)</w:t>
             </w:r>
           </w:p>
         </w:tc>
@@ -4654,7 +4654,7 @@
                 <w:color w:val="2C2C2C"/>
                 <w:sz w:val="19"/>
               </w:rPr>
-              <w:t>U.S. bilateral deficit: $16.7 billion (2024)</w:t>
+              <w:t>U.S. bilateral deficit: $16.7B (2024)</w:t>
             </w:r>
           </w:p>
         </w:tc>
@@ -4728,7 +4728,7 @@
             <w:r>
               <w:drawing>
                 <wp:inline xmlns:a="http://schemas.openxmlformats.org/drawingml/2006/main" xmlns:pic="http://schemas.openxmlformats.org/drawingml/2006/picture">
-                  <wp:extent cx="566928" cy="712491"/>
+                  <wp:extent cx="566928" cy="708660"/>
                   <wp:docPr id="24" name="Picture 24"/>
                   <wp:cNvGraphicFramePr>
                     <a:graphicFrameLocks noChangeAspect="1"/>
@@ -4749,7 +4749,7 @@
                         <pic:spPr>
                           <a:xfrm>
                             <a:off x="0" y="0"/>
-                            <a:ext cx="566928" cy="712491"/>
+                            <a:ext cx="566928" cy="708660"/>
                           </a:xfrm>
                           <a:prstGeom prst="rect"/>
                         </pic:spPr>
@@ -4885,7 +4885,7 @@
             <w:r>
               <w:drawing>
                 <wp:inline xmlns:a="http://schemas.openxmlformats.org/drawingml/2006/main" xmlns:pic="http://schemas.openxmlformats.org/drawingml/2006/picture">
-                  <wp:extent cx="566928" cy="705986"/>
+                  <wp:extent cx="566928" cy="710454"/>
                   <wp:docPr id="25" name="Picture 25"/>
                   <wp:cNvGraphicFramePr>
                     <a:graphicFrameLocks noChangeAspect="1"/>
@@ -4906,7 +4906,7 @@
                         <pic:spPr>
                           <a:xfrm>
                             <a:off x="0" y="0"/>
-                            <a:ext cx="566928" cy="705986"/>
+                            <a:ext cx="566928" cy="710454"/>
                           </a:xfrm>
                           <a:prstGeom prst="rect"/>
                         </pic:spPr>
@@ -5136,7 +5136,7 @@
                 <w:color w:val="2C2C2C"/>
                 <w:sz w:val="19"/>
               </w:rPr>
-              <w:t>Nominal GDP: $5,014.0 billion (2025)</w:t>
+              <w:t>Nominal GDP: $5,014.0B (2025)</w:t>
             </w:r>
           </w:p>
         </w:tc>
@@ -5166,7 +5166,7 @@
                 <w:color w:val="2C2C2C"/>
                 <w:sz w:val="19"/>
               </w:rPr>
-              <w:t>Overall goods surplus: $226.0 billion (2025)</w:t>
+              <w:t>Overall goods surplus: $226.0B (2025)</w:t>
             </w:r>
           </w:p>
         </w:tc>
@@ -5198,7 +5198,7 @@
                 <w:color w:val="2C2C2C"/>
                 <w:sz w:val="19"/>
               </w:rPr>
-              <w:t>U.S. goods exports: $82.7 billion (2025)</w:t>
+              <w:t>U.S. goods exports: $82.7B (2025)</w:t>
             </w:r>
           </w:p>
         </w:tc>
@@ -5228,7 +5228,7 @@
                 <w:color w:val="2C2C2C"/>
                 <w:sz w:val="19"/>
               </w:rPr>
-              <w:t>U.S. goods imports: $159.0 billion (2025)</w:t>
+              <w:t>U.S. goods imports: $159.0B (2025)</w:t>
             </w:r>
           </w:p>
         </w:tc>
@@ -5260,7 +5260,7 @@
                 <w:color w:val="2C2C2C"/>
                 <w:sz w:val="19"/>
               </w:rPr>
-              <w:t>U.S. bilateral deficit: $76.3 billion (2025)</w:t>
+              <w:t>U.S. bilateral deficit: $76.3B (2025)</w:t>
             </w:r>
           </w:p>
         </w:tc>
@@ -5334,7 +5334,7 @@
             <w:r>
               <w:drawing>
                 <wp:inline xmlns:a="http://schemas.openxmlformats.org/drawingml/2006/main" xmlns:pic="http://schemas.openxmlformats.org/drawingml/2006/picture">
-                  <wp:extent cx="566928" cy="705986"/>
+                  <wp:extent cx="566928" cy="710454"/>
                   <wp:docPr id="27" name="Picture 27"/>
                   <wp:cNvGraphicFramePr>
                     <a:graphicFrameLocks noChangeAspect="1"/>
@@ -5355,7 +5355,7 @@
                         <pic:spPr>
                           <a:xfrm>
                             <a:off x="0" y="0"/>
-                            <a:ext cx="566928" cy="705986"/>
+                            <a:ext cx="566928" cy="710454"/>
                           </a:xfrm>
                           <a:prstGeom prst="rect"/>
                         </pic:spPr>
@@ -5506,7 +5506,7 @@
             <w:r>
               <w:drawing>
                 <wp:inline xmlns:a="http://schemas.openxmlformats.org/drawingml/2006/main" xmlns:pic="http://schemas.openxmlformats.org/drawingml/2006/picture">
-                  <wp:extent cx="566928" cy="705986"/>
+                  <wp:extent cx="566928" cy="710454"/>
                   <wp:docPr id="28" name="Picture 28"/>
                   <wp:cNvGraphicFramePr>
                     <a:graphicFrameLocks noChangeAspect="1"/>
@@ -5527,7 +5527,7 @@
                         <pic:spPr>
                           <a:xfrm>
                             <a:off x="0" y="0"/>
-                            <a:ext cx="566928" cy="705986"/>
+                            <a:ext cx="566928" cy="710454"/>
                           </a:xfrm>
                           <a:prstGeom prst="rect"/>
                         </pic:spPr>
@@ -5757,7 +5757,7 @@
                 <w:color w:val="2C2C2C"/>
                 <w:sz w:val="19"/>
               </w:rPr>
-              <w:t>Nominal GDP: $4,125.0 billion (2025)</w:t>
+              <w:t>Nominal GDP: $4,125.0B (2025)</w:t>
             </w:r>
           </w:p>
         </w:tc>
@@ -5787,7 +5787,7 @@
                 <w:color w:val="2C2C2C"/>
                 <w:sz w:val="19"/>
               </w:rPr>
-              <w:t>Overall goods deficit: $333.2 billion (FY 2025-26)</w:t>
+              <w:t>Overall goods deficit: $333.2B (FY 2025-26)</w:t>
             </w:r>
           </w:p>
         </w:tc>
@@ -5819,7 +5819,7 @@
                 <w:color w:val="2C2C2C"/>
                 <w:sz w:val="19"/>
               </w:rPr>
-              <w:t>U.S. goods exports: $45.6 billion (2025)</w:t>
+              <w:t>U.S. goods exports: $45.6B (2025)</w:t>
             </w:r>
           </w:p>
         </w:tc>
@@ -5849,7 +5849,7 @@
                 <w:color w:val="2C2C2C"/>
                 <w:sz w:val="19"/>
               </w:rPr>
-              <w:t>U.S. goods imports: $103.8 billion (2025)</w:t>
+              <w:t>U.S. goods imports: $103.8B (2025)</w:t>
             </w:r>
           </w:p>
         </w:tc>
@@ -5881,7 +5881,7 @@
                 <w:color w:val="2C2C2C"/>
                 <w:sz w:val="19"/>
               </w:rPr>
-              <w:t>U.S. bilateral deficit: $58.2 billion (2025)</w:t>
+              <w:t>U.S. bilateral deficit: $58.2B (2025)</w:t>
             </w:r>
           </w:p>
         </w:tc>
@@ -6095,7 +6095,7 @@
             <w:r>
               <w:drawing>
                 <wp:inline xmlns:a="http://schemas.openxmlformats.org/drawingml/2006/main" xmlns:pic="http://schemas.openxmlformats.org/drawingml/2006/picture">
-                  <wp:extent cx="566928" cy="705986"/>
+                  <wp:extent cx="566928" cy="710454"/>
                   <wp:docPr id="31" name="Picture 31"/>
                   <wp:cNvGraphicFramePr>
                     <a:graphicFrameLocks noChangeAspect="1"/>
@@ -6116,7 +6116,7 @@
                         <pic:spPr>
                           <a:xfrm>
                             <a:off x="0" y="0"/>
-                            <a:ext cx="566928" cy="705986"/>
+                            <a:ext cx="566928" cy="710454"/>
                           </a:xfrm>
                           <a:prstGeom prst="rect"/>
                         </pic:spPr>
@@ -6533,7 +6533,7 @@
                 <w:color w:val="2C2C2C"/>
                 <w:sz w:val="19"/>
               </w:rPr>
-              <w:t>Nominal GDP: $1,443.0 billion (2025)</w:t>
+              <w:t>Nominal GDP: $1,443.0B (2025)</w:t>
             </w:r>
           </w:p>
         </w:tc>
@@ -6563,7 +6563,7 @@
                 <w:color w:val="2C2C2C"/>
                 <w:sz w:val="19"/>
               </w:rPr>
-              <w:t>Overall goods surplus: $41.0 billion (2025)</w:t>
+              <w:t>Overall goods surplus: $41.0B (2025)</w:t>
             </w:r>
           </w:p>
         </w:tc>
@@ -6595,7 +6595,7 @@
                 <w:color w:val="2C2C2C"/>
                 <w:sz w:val="19"/>
               </w:rPr>
-              <w:t>U.S. goods exports: $11.0 billion (2025)</w:t>
+              <w:t>U.S. goods exports: $11.0B (2025)</w:t>
             </w:r>
           </w:p>
         </w:tc>
@@ -6625,7 +6625,7 @@
                 <w:color w:val="2C2C2C"/>
                 <w:sz w:val="19"/>
               </w:rPr>
-              <w:t>U.S. goods imports: $34.7 billion (2025)</w:t>
+              <w:t>U.S. goods imports: $34.7B (2025)</w:t>
             </w:r>
           </w:p>
         </w:tc>
@@ -6657,7 +6657,7 @@
                 <w:color w:val="2C2C2C"/>
                 <w:sz w:val="19"/>
               </w:rPr>
-              <w:t>U.S. bilateral deficit: $23.7 billion (2025)</w:t>
+              <w:t>U.S. bilateral deficit: $23.7B (2025)</w:t>
             </w:r>
           </w:p>
         </w:tc>
@@ -6731,7 +6731,7 @@
             <w:r>
               <w:drawing>
                 <wp:inline xmlns:a="http://schemas.openxmlformats.org/drawingml/2006/main" xmlns:pic="http://schemas.openxmlformats.org/drawingml/2006/picture">
-                  <wp:extent cx="566928" cy="710454"/>
+                  <wp:extent cx="566928" cy="706866"/>
                   <wp:docPr id="34" name="Picture 34"/>
                   <wp:cNvGraphicFramePr>
                     <a:graphicFrameLocks noChangeAspect="1"/>
@@ -6752,7 +6752,7 @@
                         <pic:spPr>
                           <a:xfrm>
                             <a:off x="0" y="0"/>
-                            <a:ext cx="566928" cy="710454"/>
+                            <a:ext cx="566928" cy="706866"/>
                           </a:xfrm>
                           <a:prstGeom prst="rect"/>
                         </pic:spPr>
@@ -6871,7 +6871,7 @@
             <w:r>
               <w:drawing>
                 <wp:inline xmlns:a="http://schemas.openxmlformats.org/drawingml/2006/main" xmlns:pic="http://schemas.openxmlformats.org/drawingml/2006/picture">
-                  <wp:extent cx="566928" cy="705986"/>
+                  <wp:extent cx="566928" cy="710454"/>
                   <wp:docPr id="35" name="Picture 35"/>
                   <wp:cNvGraphicFramePr>
                     <a:graphicFrameLocks noChangeAspect="1"/>
@@ -6892,7 +6892,7 @@
                         <pic:spPr>
                           <a:xfrm>
                             <a:off x="0" y="0"/>
-                            <a:ext cx="566928" cy="705986"/>
+                            <a:ext cx="566928" cy="710454"/>
                           </a:xfrm>
                           <a:prstGeom prst="rect"/>
                         </pic:spPr>
@@ -7028,7 +7028,7 @@
             <w:r>
               <w:drawing>
                 <wp:inline xmlns:a="http://schemas.openxmlformats.org/drawingml/2006/main" xmlns:pic="http://schemas.openxmlformats.org/drawingml/2006/picture">
-                  <wp:extent cx="566928" cy="705986"/>
+                  <wp:extent cx="566928" cy="710454"/>
                   <wp:docPr id="36" name="Picture 36"/>
                   <wp:cNvGraphicFramePr>
                     <a:graphicFrameLocks noChangeAspect="1"/>
@@ -7049,7 +7049,7 @@
                         <pic:spPr>
                           <a:xfrm>
                             <a:off x="0" y="0"/>
-                            <a:ext cx="566928" cy="705986"/>
+                            <a:ext cx="566928" cy="710454"/>
                           </a:xfrm>
                           <a:prstGeom prst="rect"/>
                         </pic:spPr>
@@ -7279,7 +7279,7 @@
                 <w:color w:val="2C2C2C"/>
                 <w:sz w:val="19"/>
               </w:rPr>
-              <w:t>Nominal GDP: $2,544.0 billion (2025)</w:t>
+              <w:t>Nominal GDP: $2,544.0B (2025)</w:t>
             </w:r>
           </w:p>
         </w:tc>
@@ -7309,7 +7309,7 @@
                 <w:color w:val="2C2C2C"/>
                 <w:sz w:val="19"/>
               </w:rPr>
-              <w:t>Overall goods surplus: $56.8 billion (2025)</w:t>
+              <w:t>Overall goods surplus: $56.8B (2025)</w:t>
             </w:r>
           </w:p>
         </w:tc>
@@ -7341,7 +7341,7 @@
                 <w:color w:val="2C2C2C"/>
                 <w:sz w:val="19"/>
               </w:rPr>
-              <w:t>U.S. goods exports: $43.7 billion (2025)</w:t>
+              <w:t>U.S. goods exports: $43.7B (2025)</w:t>
             </w:r>
           </w:p>
         </w:tc>
@@ -7371,7 +7371,7 @@
                 <w:color w:val="2C2C2C"/>
                 <w:sz w:val="19"/>
               </w:rPr>
-              <w:t>U.S. goods imports: $78.7 billion (2025)</w:t>
+              <w:t>U.S. goods imports: $78.7B (2025)</w:t>
             </w:r>
           </w:p>
         </w:tc>
@@ -7403,7 +7403,7 @@
                 <w:color w:val="2C2C2C"/>
                 <w:sz w:val="19"/>
               </w:rPr>
-              <w:t>U.S. bilateral deficit: $35.0 billion (2025)</w:t>
+              <w:t>U.S. bilateral deficit: $35.0B (2025)</w:t>
             </w:r>
           </w:p>
         </w:tc>
@@ -7477,7 +7477,7 @@
             <w:r>
               <w:drawing>
                 <wp:inline xmlns:a="http://schemas.openxmlformats.org/drawingml/2006/main" xmlns:pic="http://schemas.openxmlformats.org/drawingml/2006/picture">
-                  <wp:extent cx="566928" cy="705986"/>
+                  <wp:extent cx="566928" cy="710454"/>
                   <wp:docPr id="38" name="Picture 38"/>
                   <wp:cNvGraphicFramePr>
                     <a:graphicFrameLocks noChangeAspect="1"/>
@@ -7498,7 +7498,7 @@
                         <pic:spPr>
                           <a:xfrm>
                             <a:off x="0" y="0"/>
-                            <a:ext cx="566928" cy="705986"/>
+                            <a:ext cx="566928" cy="710454"/>
                           </a:xfrm>
                           <a:prstGeom prst="rect"/>
                         </pic:spPr>
@@ -7617,7 +7617,7 @@
             <w:r>
               <w:drawing>
                 <wp:inline xmlns:a="http://schemas.openxmlformats.org/drawingml/2006/main" xmlns:pic="http://schemas.openxmlformats.org/drawingml/2006/picture">
-                  <wp:extent cx="566928" cy="711439"/>
+                  <wp:extent cx="566928" cy="707734"/>
                   <wp:docPr id="39" name="Picture 39"/>
                   <wp:cNvGraphicFramePr>
                     <a:graphicFrameLocks noChangeAspect="1"/>
@@ -7638,7 +7638,7 @@
                         <pic:spPr>
                           <a:xfrm>
                             <a:off x="0" y="0"/>
-                            <a:ext cx="566928" cy="711439"/>
+                            <a:ext cx="566928" cy="707734"/>
                           </a:xfrm>
                           <a:prstGeom prst="rect"/>
                         </pic:spPr>
@@ -7774,7 +7774,7 @@
             <w:r>
               <w:drawing>
                 <wp:inline xmlns:a="http://schemas.openxmlformats.org/drawingml/2006/main" xmlns:pic="http://schemas.openxmlformats.org/drawingml/2006/picture">
-                  <wp:extent cx="566928" cy="705986"/>
+                  <wp:extent cx="566928" cy="710454"/>
                   <wp:docPr id="40" name="Picture 40"/>
                   <wp:cNvGraphicFramePr>
                     <a:graphicFrameLocks noChangeAspect="1"/>
@@ -7795,7 +7795,7 @@
                         <pic:spPr>
                           <a:xfrm>
                             <a:off x="0" y="0"/>
-                            <a:ext cx="566928" cy="705986"/>
+                            <a:ext cx="566928" cy="710454"/>
                           </a:xfrm>
                           <a:prstGeom prst="rect"/>
                         </pic:spPr>
@@ -8025,7 +8025,7 @@
                 <w:color w:val="2C2C2C"/>
                 <w:sz w:val="19"/>
               </w:rPr>
-              <w:t>Nominal GDP: $4,280.0 billion (2025)</w:t>
+              <w:t>Nominal GDP: $4,280.0B (2025)</w:t>
             </w:r>
           </w:p>
         </w:tc>
@@ -8055,7 +8055,7 @@
                 <w:color w:val="2C2C2C"/>
                 <w:sz w:val="19"/>
               </w:rPr>
-              <w:t>Overall goods deficit: $17.0 billion (2025)</w:t>
+              <w:t>Overall goods deficit: $17.0B (2025)</w:t>
             </w:r>
           </w:p>
         </w:tc>
@@ -8087,7 +8087,7 @@
                 <w:color w:val="2C2C2C"/>
                 <w:sz w:val="19"/>
               </w:rPr>
-              <w:t>U.S. goods exports: $82.1 billion (2025)</w:t>
+              <w:t>U.S. goods exports: $82.1B (2025)</w:t>
             </w:r>
           </w:p>
         </w:tc>
@@ -8117,7 +8117,7 @@
                 <w:color w:val="2C2C2C"/>
                 <w:sz w:val="19"/>
               </w:rPr>
-              <w:t>U.S. goods imports: $146.0 billion (2025)</w:t>
+              <w:t>U.S. goods imports: $146.0B (2025)</w:t>
             </w:r>
           </w:p>
         </w:tc>
@@ -8149,7 +8149,7 @@
                 <w:color w:val="2C2C2C"/>
                 <w:sz w:val="19"/>
               </w:rPr>
-              <w:t>U.S. bilateral deficit: $63.9 billion (2025)</w:t>
+              <w:t>U.S. bilateral deficit: $63.9B (2025)</w:t>
             </w:r>
           </w:p>
         </w:tc>
@@ -8223,7 +8223,7 @@
             <w:r>
               <w:drawing>
                 <wp:inline xmlns:a="http://schemas.openxmlformats.org/drawingml/2006/main" xmlns:pic="http://schemas.openxmlformats.org/drawingml/2006/picture">
-                  <wp:extent cx="566928" cy="712491"/>
+                  <wp:extent cx="566928" cy="708660"/>
                   <wp:docPr id="42" name="Picture 42"/>
                   <wp:cNvGraphicFramePr>
                     <a:graphicFrameLocks noChangeAspect="1"/>
@@ -8244,7 +8244,7 @@
                         <pic:spPr>
                           <a:xfrm>
                             <a:off x="0" y="0"/>
-                            <a:ext cx="566928" cy="712491"/>
+                            <a:ext cx="566928" cy="708660"/>
                           </a:xfrm>
                           <a:prstGeom prst="rect"/>
                         </pic:spPr>
@@ -8395,7 +8395,7 @@
             <w:r>
               <w:drawing>
                 <wp:inline xmlns:a="http://schemas.openxmlformats.org/drawingml/2006/main" xmlns:pic="http://schemas.openxmlformats.org/drawingml/2006/picture">
-                  <wp:extent cx="566928" cy="711857"/>
+                  <wp:extent cx="566928" cy="707594"/>
                   <wp:docPr id="43" name="Picture 43"/>
                   <wp:cNvGraphicFramePr>
                     <a:graphicFrameLocks noChangeAspect="1"/>
@@ -8416,7 +8416,7 @@
                         <pic:spPr>
                           <a:xfrm>
                             <a:off x="0" y="0"/>
-                            <a:ext cx="566928" cy="711857"/>
+                            <a:ext cx="566928" cy="707594"/>
                           </a:xfrm>
                           <a:prstGeom prst="rect"/>
                         </pic:spPr>
@@ -8646,7 +8646,7 @@
                 <w:color w:val="2C2C2C"/>
                 <w:sz w:val="19"/>
               </w:rPr>
-              <w:t>Nominal GDP: $1,830.0 billion (2025)</w:t>
+              <w:t>Nominal GDP: $1,830.0B (2025)</w:t>
             </w:r>
           </w:p>
         </w:tc>
@@ -8676,7 +8676,7 @@
                 <w:color w:val="2C2C2C"/>
                 <w:sz w:val="19"/>
               </w:rPr>
-              <w:t>Overall goods surplus: $0.8 billion (2025)</w:t>
+              <w:t>Overall goods surplus: $0.8B (2025)</w:t>
             </w:r>
           </w:p>
         </w:tc>
@@ -8708,7 +8708,7 @@
                 <w:color w:val="2C2C2C"/>
                 <w:sz w:val="19"/>
               </w:rPr>
-              <w:t>U.S. goods exports: $338.0 billion (2025)</w:t>
+              <w:t>U.S. goods exports: $338.0B (2025)</w:t>
             </w:r>
           </w:p>
         </w:tc>
@@ -8738,7 +8738,7 @@
                 <w:color w:val="2C2C2C"/>
                 <w:sz w:val="19"/>
               </w:rPr>
-              <w:t>U.S. goods imports: $534.9 billion (2025)</w:t>
+              <w:t>U.S. goods imports: $534.9B (2025)</w:t>
             </w:r>
           </w:p>
         </w:tc>
@@ -8770,7 +8770,7 @@
                 <w:color w:val="2C2C2C"/>
                 <w:sz w:val="19"/>
               </w:rPr>
-              <w:t>U.S. bilateral deficit: $196.9 billion (2025)</w:t>
+              <w:t>U.S. bilateral deficit: $196.9B (2025)</w:t>
             </w:r>
           </w:p>
         </w:tc>
@@ -8844,7 +8844,7 @@
             <w:r>
               <w:drawing>
                 <wp:inline xmlns:a="http://schemas.openxmlformats.org/drawingml/2006/main" xmlns:pic="http://schemas.openxmlformats.org/drawingml/2006/picture">
-                  <wp:extent cx="566928" cy="710454"/>
+                  <wp:extent cx="566928" cy="706866"/>
                   <wp:docPr id="45" name="Picture 45"/>
                   <wp:cNvGraphicFramePr>
                     <a:graphicFrameLocks noChangeAspect="1"/>
@@ -8865,7 +8865,7 @@
                         <pic:spPr>
                           <a:xfrm>
                             <a:off x="0" y="0"/>
-                            <a:ext cx="566928" cy="710454"/>
+                            <a:ext cx="566928" cy="706866"/>
                           </a:xfrm>
                           <a:prstGeom prst="rect"/>
                         </pic:spPr>
@@ -8984,7 +8984,7 @@
             <w:r>
               <w:drawing>
                 <wp:inline xmlns:a="http://schemas.openxmlformats.org/drawingml/2006/main" xmlns:pic="http://schemas.openxmlformats.org/drawingml/2006/picture">
-                  <wp:extent cx="566928" cy="705986"/>
+                  <wp:extent cx="566928" cy="710454"/>
                   <wp:docPr id="46" name="Picture 46"/>
                   <wp:cNvGraphicFramePr>
                     <a:graphicFrameLocks noChangeAspect="1"/>
@@ -9005,7 +9005,7 @@
                         <pic:spPr>
                           <a:xfrm>
                             <a:off x="0" y="0"/>
-                            <a:ext cx="566928" cy="705986"/>
+                            <a:ext cx="566928" cy="710454"/>
                           </a:xfrm>
                           <a:prstGeom prst="rect"/>
                         </pic:spPr>
@@ -9141,7 +9141,7 @@
             <w:r>
               <w:drawing>
                 <wp:inline xmlns:a="http://schemas.openxmlformats.org/drawingml/2006/main" xmlns:pic="http://schemas.openxmlformats.org/drawingml/2006/picture">
-                  <wp:extent cx="566928" cy="710454"/>
+                  <wp:extent cx="566928" cy="706866"/>
                   <wp:docPr id="47" name="Picture 47"/>
                   <wp:cNvGraphicFramePr>
                     <a:graphicFrameLocks noChangeAspect="1"/>
@@ -9162,7 +9162,7 @@
                         <pic:spPr>
                           <a:xfrm>
                             <a:off x="0" y="0"/>
-                            <a:ext cx="566928" cy="710454"/>
+                            <a:ext cx="566928" cy="706866"/>
                           </a:xfrm>
                           <a:prstGeom prst="rect"/>
                         </pic:spPr>
@@ -9392,7 +9392,7 @@
                 <w:color w:val="2C2C2C"/>
                 <w:sz w:val="19"/>
               </w:rPr>
-              <w:t>Nominal GDP: $1,040.0 billion (2025)</w:t>
+              <w:t>Nominal GDP: $1,040.0B (2025)</w:t>
             </w:r>
           </w:p>
         </w:tc>
@@ -9422,7 +9422,7 @@
                 <w:color w:val="2C2C2C"/>
                 <w:sz w:val="19"/>
               </w:rPr>
-              <w:t>Overall goods deficit: $8.7 billion (2025)</w:t>
+              <w:t>Overall goods deficit: $8.7B (2025)</w:t>
             </w:r>
           </w:p>
         </w:tc>
@@ -9454,7 +9454,7 @@
                 <w:color w:val="2C2C2C"/>
                 <w:sz w:val="19"/>
               </w:rPr>
-              <w:t>U.S. goods exports: $14.1 billion (2025)</w:t>
+              <w:t>U.S. goods exports: $14.1B (2025)</w:t>
             </w:r>
           </w:p>
         </w:tc>
@@ -9484,7 +9484,7 @@
                 <w:color w:val="2C2C2C"/>
                 <w:sz w:val="19"/>
               </w:rPr>
-              <w:t>U.S. goods imports: $14.5 billion (2025)</w:t>
+              <w:t>U.S. goods imports: $14.5B (2025)</w:t>
             </w:r>
           </w:p>
         </w:tc>
@@ -9516,7 +9516,7 @@
                 <w:color w:val="2C2C2C"/>
                 <w:sz w:val="19"/>
               </w:rPr>
-              <w:t>U.S. bilateral deficit: $0.4 billion (2025)</w:t>
+              <w:t>U.S. bilateral deficit: $0.4B (2025)</w:t>
             </w:r>
           </w:p>
         </w:tc>
@@ -9730,7 +9730,7 @@
             <w:r>
               <w:drawing>
                 <wp:inline xmlns:a="http://schemas.openxmlformats.org/drawingml/2006/main" xmlns:pic="http://schemas.openxmlformats.org/drawingml/2006/picture">
-                  <wp:extent cx="566928" cy="710454"/>
+                  <wp:extent cx="566928" cy="706866"/>
                   <wp:docPr id="50" name="Picture 50"/>
                   <wp:cNvGraphicFramePr>
                     <a:graphicFrameLocks noChangeAspect="1"/>
@@ -9751,7 +9751,7 @@
                         <pic:spPr>
                           <a:xfrm>
                             <a:off x="0" y="0"/>
-                            <a:ext cx="566928" cy="710454"/>
+                            <a:ext cx="566928" cy="706866"/>
                           </a:xfrm>
                           <a:prstGeom prst="rect"/>
                         </pic:spPr>
@@ -9902,7 +9902,7 @@
             <w:r>
               <w:drawing>
                 <wp:inline xmlns:a="http://schemas.openxmlformats.org/drawingml/2006/main" xmlns:pic="http://schemas.openxmlformats.org/drawingml/2006/picture">
-                  <wp:extent cx="566928" cy="710454"/>
+                  <wp:extent cx="566928" cy="706866"/>
                   <wp:docPr id="51" name="Picture 51"/>
                   <wp:cNvGraphicFramePr>
                     <a:graphicFrameLocks noChangeAspect="1"/>
@@ -9923,7 +9923,7 @@
                         <pic:spPr>
                           <a:xfrm>
                             <a:off x="0" y="0"/>
-                            <a:ext cx="566928" cy="710454"/>
+                            <a:ext cx="566928" cy="706866"/>
                           </a:xfrm>
                           <a:prstGeom prst="rect"/>
                         </pic:spPr>
@@ -10168,7 +10168,7 @@
                 <w:color w:val="2C2C2C"/>
                 <w:sz w:val="19"/>
               </w:rPr>
-              <w:t>Nominal GDP: $2,541.0 billion (2025)</w:t>
+              <w:t>Nominal GDP: $2,541.0B (2025)</w:t>
             </w:r>
           </w:p>
         </w:tc>
@@ -10198,7 +10198,7 @@
                 <w:color w:val="2C2C2C"/>
                 <w:sz w:val="19"/>
               </w:rPr>
-              <w:t>Overall goods surplus: $139.3 billion (2025)</w:t>
+              <w:t>Overall goods surplus: $139.3B (2025)</w:t>
             </w:r>
           </w:p>
         </w:tc>
@@ -10230,7 +10230,7 @@
                 <w:color w:val="2C2C2C"/>
                 <w:sz w:val="19"/>
               </w:rPr>
-              <w:t>U.S. goods exports: $0.6 billion (2025)</w:t>
+              <w:t>U.S. goods exports: $0.6B (2025)</w:t>
             </w:r>
           </w:p>
         </w:tc>
@@ -10260,7 +10260,7 @@
                 <w:color w:val="2C2C2C"/>
                 <w:sz w:val="19"/>
               </w:rPr>
-              <w:t>U.S. goods imports: $3.8 billion (2025)</w:t>
+              <w:t>U.S. goods imports: $3.8B (2025)</w:t>
             </w:r>
           </w:p>
         </w:tc>
@@ -10292,7 +10292,7 @@
                 <w:color w:val="2C2C2C"/>
                 <w:sz w:val="19"/>
               </w:rPr>
-              <w:t>U.S. bilateral deficit: $3.2 billion (2025)</w:t>
+              <w:t>U.S. bilateral deficit: $3.2B (2025)</w:t>
             </w:r>
           </w:p>
         </w:tc>
@@ -10944,7 +10944,7 @@
                 <w:color w:val="2C2C2C"/>
                 <w:sz w:val="19"/>
               </w:rPr>
-              <w:t>Nominal GDP: $1,277.0 billion (2025)</w:t>
+              <w:t>Nominal GDP: $1,277.0B (2025)</w:t>
             </w:r>
           </w:p>
         </w:tc>
@@ -10974,7 +10974,7 @@
                 <w:color w:val="2C2C2C"/>
                 <w:sz w:val="19"/>
               </w:rPr>
-              <w:t>Overall goods surplus: $59.9 billion (2025)</w:t>
+              <w:t>Overall goods surplus: $59.9B (2025)</w:t>
             </w:r>
           </w:p>
         </w:tc>
@@ -11006,7 +11006,7 @@
                 <w:color w:val="2C2C2C"/>
                 <w:sz w:val="19"/>
               </w:rPr>
-              <w:t>U.S. goods exports: $14.1 billion (2025)</w:t>
+              <w:t>U.S. goods exports: $14.1B (2025)</w:t>
             </w:r>
           </w:p>
         </w:tc>
@@ -11036,7 +11036,7 @@
                 <w:color w:val="2C2C2C"/>
                 <w:sz w:val="19"/>
               </w:rPr>
-              <w:t>U.S. goods imports: $10.5 billion (2025)</w:t>
+              <w:t>U.S. goods imports: $10.5B (2025)</w:t>
             </w:r>
           </w:p>
         </w:tc>
@@ -11068,7 +11068,7 @@
                 <w:color w:val="2C2C2C"/>
                 <w:sz w:val="19"/>
               </w:rPr>
-              <w:t>U.S. bilateral surplus: $3.6 billion (2025)</w:t>
+              <w:t>U.S. bilateral surplus: $3.6B (2025)</w:t>
             </w:r>
           </w:p>
         </w:tc>
@@ -11151,7 +11151,7 @@
                     <a:graphicData uri="http://schemas.openxmlformats.org/drawingml/2006/picture">
                       <pic:pic>
                         <pic:nvPicPr>
-                          <pic:cNvPr id="0" name="_ph-saudi-alqasabi.png"/>
+                          <pic:cNvPr id="0" name="saudi-alqasabi.png"/>
                           <pic:cNvPicPr/>
                         </pic:nvPicPr>
                         <pic:blipFill>
@@ -11282,7 +11282,7 @@
             <w:r>
               <w:drawing>
                 <wp:inline xmlns:a="http://schemas.openxmlformats.org/drawingml/2006/main" xmlns:pic="http://schemas.openxmlformats.org/drawingml/2006/picture">
-                  <wp:extent cx="566928" cy="710454"/>
+                  <wp:extent cx="566928" cy="706866"/>
                   <wp:docPr id="58" name="Picture 58"/>
                   <wp:cNvGraphicFramePr>
                     <a:graphicFrameLocks noChangeAspect="1"/>
@@ -11303,7 +11303,7 @@
                         <pic:spPr>
                           <a:xfrm>
                             <a:off x="0" y="0"/>
-                            <a:ext cx="566928" cy="710454"/>
+                            <a:ext cx="566928" cy="706866"/>
                           </a:xfrm>
                           <a:prstGeom prst="rect"/>
                         </pic:spPr>
@@ -11700,7 +11700,7 @@
                 <w:color w:val="2C2C2C"/>
                 <w:sz w:val="19"/>
               </w:rPr>
-              <w:t>Nominal GDP: $1,859.0 billion (2025)</w:t>
+              <w:t>Nominal GDP: $1,859.0B (2025)</w:t>
             </w:r>
           </w:p>
         </w:tc>
@@ -11730,7 +11730,7 @@
                 <w:color w:val="2C2C2C"/>
                 <w:sz w:val="19"/>
               </w:rPr>
-              <w:t>Overall goods surplus: $78.0 billion (2025)</w:t>
+              <w:t>Overall goods surplus: $78.0B (2025)</w:t>
             </w:r>
           </w:p>
         </w:tc>
@@ -11762,7 +11762,7 @@
                 <w:color w:val="2C2C2C"/>
                 <w:sz w:val="19"/>
               </w:rPr>
-              <w:t>U.S. goods exports: $68.8 billion (2025)</w:t>
+              <w:t>U.S. goods exports: $68.8B (2025)</w:t>
             </w:r>
           </w:p>
         </w:tc>
@@ -11792,7 +11792,7 @@
                 <w:color w:val="2C2C2C"/>
                 <w:sz w:val="19"/>
               </w:rPr>
-              <w:t>U.S. goods imports: $125.2 billion (2025)</w:t>
+              <w:t>U.S. goods imports: $125.2B (2025)</w:t>
             </w:r>
           </w:p>
         </w:tc>
@@ -11824,7 +11824,7 @@
                 <w:color w:val="2C2C2C"/>
                 <w:sz w:val="19"/>
               </w:rPr>
-              <w:t>U.S. bilateral deficit: $56.4 billion (2025)</w:t>
+              <w:t>U.S. bilateral deficit: $56.4B (2025)</w:t>
             </w:r>
           </w:p>
         </w:tc>
@@ -12195,7 +12195,7 @@
             <w:r>
               <w:drawing>
                 <wp:inline xmlns:a="http://schemas.openxmlformats.org/drawingml/2006/main" xmlns:pic="http://schemas.openxmlformats.org/drawingml/2006/picture">
-                  <wp:extent cx="566928" cy="706718"/>
+                  <wp:extent cx="566928" cy="716534"/>
                   <wp:docPr id="63" name="Picture 63"/>
                   <wp:cNvGraphicFramePr>
                     <a:graphicFrameLocks noChangeAspect="1"/>
@@ -12216,7 +12216,7 @@
                         <pic:spPr>
                           <a:xfrm>
                             <a:off x="0" y="0"/>
-                            <a:ext cx="566928" cy="706718"/>
+                            <a:ext cx="566928" cy="716534"/>
                           </a:xfrm>
                           <a:prstGeom prst="rect"/>
                         </pic:spPr>
@@ -12446,7 +12446,7 @@
                 <w:color w:val="2C2C2C"/>
                 <w:sz w:val="19"/>
               </w:rPr>
-              <w:t>Nominal GDP: $1,565.0 billion (2025)</w:t>
+              <w:t>Nominal GDP: $1,565.0B (2025)</w:t>
             </w:r>
           </w:p>
         </w:tc>
@@ -12476,7 +12476,7 @@
                 <w:color w:val="2C2C2C"/>
                 <w:sz w:val="19"/>
               </w:rPr>
-              <w:t>Overall goods deficit: $92.0 billion (2025)</w:t>
+              <w:t>Overall goods deficit: $92.0B (2025)</w:t>
             </w:r>
           </w:p>
         </w:tc>
@@ -12508,7 +12508,7 @@
                 <w:color w:val="2C2C2C"/>
                 <w:sz w:val="19"/>
               </w:rPr>
-              <w:t>U.S. goods exports: $20.4 billion (2025)</w:t>
+              <w:t>U.S. goods exports: $20.4B (2025)</w:t>
             </w:r>
           </w:p>
         </w:tc>
@@ -12538,7 +12538,7 @@
                 <w:color w:val="2C2C2C"/>
                 <w:sz w:val="19"/>
               </w:rPr>
-              <w:t>U.S. goods imports: $16.4 billion (2025)</w:t>
+              <w:t>U.S. goods imports: $16.4B (2025)</w:t>
             </w:r>
           </w:p>
         </w:tc>
@@ -12570,7 +12570,7 @@
                 <w:color w:val="2C2C2C"/>
                 <w:sz w:val="19"/>
               </w:rPr>
-              <w:t>U.S. bilateral surplus: $4.0 billion (2025)</w:t>
+              <w:t>U.S. bilateral surplus: $4.0B (2025)</w:t>
             </w:r>
           </w:p>
         </w:tc>
@@ -13067,7 +13067,7 @@
                 <w:color w:val="2C2C2C"/>
                 <w:sz w:val="19"/>
               </w:rPr>
-              <w:t>Nominal GDP: $3,959.0 billion (2025)</w:t>
+              <w:t>Nominal GDP: $3,959.0B (2025)</w:t>
             </w:r>
           </w:p>
         </w:tc>
@@ -13097,7 +13097,7 @@
                 <w:color w:val="2C2C2C"/>
                 <w:sz w:val="19"/>
               </w:rPr>
-              <w:t>Overall goods deficit: $319.2 billion (2025)</w:t>
+              <w:t>Overall goods deficit: $319.2B (2025)</w:t>
             </w:r>
           </w:p>
         </w:tc>
@@ -13129,7 +13129,7 @@
                 <w:color w:val="2C2C2C"/>
                 <w:sz w:val="19"/>
               </w:rPr>
-              <w:t>U.S. goods exports: $97.0 billion (2025)</w:t>
+              <w:t>U.S. goods exports: $97.0B (2025)</w:t>
             </w:r>
           </w:p>
         </w:tc>
@@ -13159,7 +13159,7 @@
                 <w:color w:val="2C2C2C"/>
                 <w:sz w:val="19"/>
               </w:rPr>
-              <w:t>U.S. goods imports: $64.8 billion (2025)</w:t>
+              <w:t>U.S. goods imports: $64.8B (2025)</w:t>
             </w:r>
           </w:p>
         </w:tc>
@@ -13191,7 +13191,7 @@
                 <w:color w:val="2C2C2C"/>
                 <w:sz w:val="19"/>
               </w:rPr>
-              <w:t>U.S. bilateral surplus: $32.2 billion (2025)</w:t>
+              <w:t>U.S. bilateral surplus: $32.2B (2025)</w:t>
             </w:r>
           </w:p>
         </w:tc>
@@ -13828,7 +13828,7 @@
                 <w:color w:val="2C2C2C"/>
                 <w:sz w:val="19"/>
               </w:rPr>
-              <w:t>Nominal GDP: $30,620.0 billion (2025)</w:t>
+              <w:t>Nominal GDP: $30,620.0B (2025)</w:t>
             </w:r>
           </w:p>
         </w:tc>
@@ -13858,7 +13858,7 @@
                 <w:color w:val="2C2C2C"/>
                 <w:sz w:val="19"/>
               </w:rPr>
-              <w:t>Goods balance — world: $1,240.9 billion (2025) (deficit)</w:t>
+              <w:t>Goods balance — world: $1,240.9B (2025) (deficit)</w:t>
             </w:r>
           </w:p>
         </w:tc>
@@ -13890,7 +13890,7 @@
                 <w:color w:val="2C2C2C"/>
                 <w:sz w:val="19"/>
               </w:rPr>
-              <w:t>Goods exports — world: $2,197.5 billion (2025)</w:t>
+              <w:t>Goods exports — world: $2,197.5B (2025)</w:t>
             </w:r>
           </w:p>
         </w:tc>
@@ -13920,7 +13920,7 @@
                 <w:color w:val="2C2C2C"/>
                 <w:sz w:val="19"/>
               </w:rPr>
-              <w:t>Goods imports — world: $3,438.4 billion (2025)</w:t>
+              <w:t>Goods imports — world: $3,438.4B (2025)</w:t>
             </w:r>
           </w:p>
         </w:tc>
@@ -14300,7 +14300,7 @@
             <w:r>
               <w:drawing>
                 <wp:inline xmlns:a="http://schemas.openxmlformats.org/drawingml/2006/main" xmlns:pic="http://schemas.openxmlformats.org/drawingml/2006/picture">
-                  <wp:extent cx="566928" cy="706718"/>
+                  <wp:extent cx="566928" cy="716534"/>
                   <wp:docPr id="74" name="Picture 74"/>
                   <wp:cNvGraphicFramePr>
                     <a:graphicFrameLocks noChangeAspect="1"/>
@@ -14321,7 +14321,7 @@
                         <pic:spPr>
                           <a:xfrm>
                             <a:off x="0" y="0"/>
-                            <a:ext cx="566928" cy="706718"/>
+                            <a:ext cx="566928" cy="716534"/>
                           </a:xfrm>
                           <a:prstGeom prst="rect"/>
                         </pic:spPr>
@@ -14751,7 +14751,7 @@
                 <w:color w:val="2C2C2C"/>
                 <w:sz w:val="19"/>
               </w:rPr>
-              <w:t>Nominal GDP: $21,230.0 billion (2025)</w:t>
+              <w:t>Nominal GDP: $21,230.0B (2025)</w:t>
             </w:r>
           </w:p>
         </w:tc>
@@ -14781,7 +14781,7 @@
                 <w:color w:val="2C2C2C"/>
                 <w:sz w:val="19"/>
               </w:rPr>
-              <w:t>Overall goods surplus: $144.7 billion (2025)</w:t>
+              <w:t>Overall goods surplus: $144.7B (2025)</w:t>
             </w:r>
           </w:p>
         </w:tc>
@@ -14813,7 +14813,7 @@
                 <w:color w:val="2C2C2C"/>
                 <w:sz w:val="19"/>
               </w:rPr>
-              <w:t>U.S. goods exports: $414.4 billion (2025)</w:t>
+              <w:t>U.S. goods exports: $414.4B (2025)</w:t>
             </w:r>
           </w:p>
         </w:tc>
@@ -14843,7 +14843,7 @@
                 <w:color w:val="2C2C2C"/>
                 <w:sz w:val="19"/>
               </w:rPr>
-              <w:t>U.S. goods imports: $633.2 billion (2025)</w:t>
+              <w:t>U.S. goods imports: $633.2B (2025)</w:t>
             </w:r>
           </w:p>
         </w:tc>
@@ -14875,7 +14875,7 @@
                 <w:color w:val="2C2C2C"/>
                 <w:sz w:val="19"/>
               </w:rPr>
-              <w:t>U.S. bilateral deficit: $218.8 billion (2025)</w:t>
+              <w:t>U.S. bilateral deficit: $218.8B (2025)</w:t>
             </w:r>
           </w:p>
         </w:tc>
@@ -14958,7 +14958,7 @@
                     <a:graphicData uri="http://schemas.openxmlformats.org/drawingml/2006/picture">
                       <pic:pic>
                         <pic:nvPicPr>
-                          <pic:cNvPr id="0" name="_ph-bloc-sefcovic.png"/>
+                          <pic:cNvPr id="0" name="bloc-sefcovic.png"/>
                           <pic:cNvPicPr/>
                         </pic:nvPicPr>
                         <pic:blipFill>
@@ -15115,7 +15115,7 @@
                     <a:graphicData uri="http://schemas.openxmlformats.org/drawingml/2006/picture">
                       <pic:pic>
                         <pic:nvPicPr>
-                          <pic:cNvPr id="0" name="_ph-bloc-virkkunen.png"/>
+                          <pic:cNvPr id="0" name="bloc-virkkunen.png"/>
                           <pic:cNvPicPr/>
                         </pic:nvPicPr>
                         <pic:blipFill>
@@ -15383,7 +15383,7 @@
                 <w:color w:val="2C2C2C"/>
                 <w:sz w:val="19"/>
               </w:rPr>
-              <w:t>Aggregate nominal GDP: $2,810.0 billion (2025 (IMF projection))</w:t>
+              <w:t>Aggregate nominal GDP: $2,810.0B (2025 (IMF projection))</w:t>
             </w:r>
           </w:p>
         </w:tc>
@@ -15445,7 +15445,7 @@
                 <w:color w:val="2C2C2C"/>
                 <w:sz w:val="19"/>
               </w:rPr>
-              <w:t>U.S.–Africa goods exports: $40.4 billion (2025)</w:t>
+              <w:t>U.S.–Africa goods exports: $40.4B (2025)</w:t>
             </w:r>
           </w:p>
         </w:tc>
@@ -15475,7 +15475,7 @@
                 <w:color w:val="2C2C2C"/>
                 <w:sz w:val="19"/>
               </w:rPr>
-              <w:t>U.S.–Africa goods imports: $43.0 billion (2025)</w:t>
+              <w:t>U.S.–Africa goods imports: $43.0B (2025)</w:t>
             </w:r>
           </w:p>
         </w:tc>
@@ -15507,7 +15507,7 @@
                 <w:color w:val="2C2C2C"/>
                 <w:sz w:val="19"/>
               </w:rPr>
-              <w:t>U.S.–Africa goods deficit: $2.6 billion (2025)</w:t>
+              <w:t>U.S.–Africa goods deficit: $2.6B (2025)</w:t>
             </w:r>
           </w:p>
         </w:tc>
@@ -15590,7 +15590,7 @@
                     <a:graphicData uri="http://schemas.openxmlformats.org/drawingml/2006/picture">
                       <pic:pic>
                         <pic:nvPicPr>
-                          <pic:cNvPr id="0" name="_ph-bloc-belobe.png"/>
+                          <pic:cNvPr id="0" name="bloc-belobe.png"/>
                           <pic:cNvPicPr/>
                         </pic:nvPicPr>
                         <pic:blipFill>
@@ -15762,7 +15762,7 @@
                     <a:graphicData uri="http://schemas.openxmlformats.org/drawingml/2006/picture">
                       <pic:pic>
                         <pic:nvPicPr>
-                          <pic:cNvPr id="0" name="_ph-bloc-mataboge.png"/>
+                          <pic:cNvPr id="0" name="bloc-mataboge.png"/>
                           <pic:cNvPicPr/>
                         </pic:nvPicPr>
                         <pic:blipFill>

</xml_diff>